<commit_message>
docs(paper): add AI-use acknowledgment; rename main.* to noesis_paper.*
- Acknowledgments section (Pages, LaTeX, Word) disclosing ZCode (Z.ai, GLM
  models) for experiment scripts/reports and Claude (Anthropic) for
  manuscript revision, figures, the verification script, and the October
  2026 re-runs; the author takes responsibility for the content.
- Rename paper/main.tex -> paper/noesis_paper.tex (and the built PDF) so
  the LaTeX version matches the Pages/Word file name.

Co-Authored-By: Claude Opus 5.5 <noreply@anthropic.com>
</commit_message>
<xml_diff>
--- a/paper/noesis_paper.docx
+++ b/paper/noesis_paper.docx
@@ -12491,6 +12491,60 @@
           <w:lang w:val="en-US"/>
         </w:rPr>
         <w:t>s own vault.</w:t>
+      </w:r>
+    </w:p>
+    <w:p>
+      <w:pPr>
+        <w:pStyle w:val="Body Text"/>
+        <w:rPr>
+          <w:rFonts w:ascii="Times New Roman" w:cs="Times New Roman" w:hAnsi="Times New Roman" w:eastAsia="Times New Roman"/>
+          <w:sz w:val="40"/>
+          <w:szCs w:val="40"/>
+        </w:rPr>
+      </w:pPr>
+      <w:r>
+        <w:rPr>
+          <w:rFonts w:ascii="Times New Roman" w:hAnsi="Times New Roman"/>
+          <w:sz w:val="40"/>
+          <w:szCs w:val="40"/>
+          <w:rtl w:val="0"/>
+          <w:lang w:val="en-US"/>
+        </w:rPr>
+        <w:t>Acknowledgments</w:t>
+      </w:r>
+    </w:p>
+    <w:p>
+      <w:pPr>
+        <w:pStyle w:val="Body Text"/>
+        <w:rPr>
+          <w:rFonts w:ascii="Times New Roman" w:cs="Times New Roman" w:hAnsi="Times New Roman" w:eastAsia="Times New Roman"/>
+          <w:sz w:val="40"/>
+          <w:szCs w:val="40"/>
+        </w:rPr>
+      </w:pPr>
+      <w:r>
+        <w:rPr>
+          <w:rFonts w:ascii="Times New Roman" w:hAnsi="Times New Roman"/>
+          <w:rtl w:val="0"/>
+          <w:lang w:val="en-US"/>
+        </w:rPr>
+        <w:t>AI coding assistants were used in this work. ZCode (Z.ai, GLM models) assisted with implementing the experiment scripts and drafting the original experiment reports. Claude (Anthropic) was used to review the manuscript, revise its text, redesign the figures, write the verification script (experiments/verify_paper.py), and re-run the retrieval-layer experiments in October 2026. All reported numbers are checked against the raw results by that script, and the author takes full responsibility for the paper</w:t>
+      </w:r>
+      <w:r>
+        <w:rPr>
+          <w:rFonts w:ascii="Times New Roman" w:hAnsi="Times New Roman" w:hint="default"/>
+          <w:rtl w:val="0"/>
+          <w:lang w:val="en-US"/>
+        </w:rPr>
+        <w:t>’</w:t>
+      </w:r>
+      <w:r>
+        <w:rPr>
+          <w:rFonts w:ascii="Times New Roman" w:hAnsi="Times New Roman"/>
+          <w:rtl w:val="0"/>
+          <w:lang w:val="en-US"/>
+        </w:rPr>
+        <w:t>s content.</w:t>
       </w:r>
     </w:p>
     <w:p>

</xml_diff>

<commit_message>
docs(paper): add affiliation, contact email and keywords to the first page
Co-Authored-By: Claude Opus 5.5 <noreply@anthropic.com>
</commit_message>
<xml_diff>
--- a/paper/noesis_paper.docx
+++ b/paper/noesis_paper.docx
@@ -46,6 +46,38 @@
           <w:lang w:val="en-US"/>
         </w:rPr>
         <w:t>Peizheng Du</w:t>
+      </w:r>
+    </w:p>
+    <w:p>
+      <w:pPr>
+        <w:pStyle w:val="Date"/>
+        <w:rPr>
+          <w:rFonts w:ascii="Times New Roman" w:cs="Times New Roman" w:hAnsi="Times New Roman" w:eastAsia="Times New Roman"/>
+        </w:rPr>
+      </w:pPr>
+      <w:r>
+        <w:rPr>
+          <w:rFonts w:ascii="Times New Roman" w:hAnsi="Times New Roman"/>
+          <w:rtl w:val="0"/>
+          <w:lang w:val="en-US"/>
+        </w:rPr>
+        <w:t>Independent Researcher</w:t>
+      </w:r>
+    </w:p>
+    <w:p>
+      <w:pPr>
+        <w:pStyle w:val="Date"/>
+        <w:rPr>
+          <w:rFonts w:ascii="Times New Roman" w:cs="Times New Roman" w:hAnsi="Times New Roman" w:eastAsia="Times New Roman"/>
+        </w:rPr>
+      </w:pPr>
+      <w:r>
+        <w:rPr>
+          <w:rFonts w:ascii="Times New Roman" w:hAnsi="Times New Roman"/>
+          <w:rtl w:val="0"/>
+          <w:lang w:val="en-US"/>
+        </w:rPr>
+        <w:t>peterdu0628@gmail.com</w:t>
       </w:r>
     </w:p>
     <w:p>
@@ -234,6 +266,33 @@
           <w:lang w:val="en-US"/>
         </w:rPr>
         <w:t>s distinct gain is filtering: where ungated retrieval surfaced unverified or planted statements 19 and 13 times in two tests, Noesis surfaced none. On strictly cross-tool queries, Noesis retrieves 37% where per-tool isolation is structurally bound to 0%. I release the system, experiment harness, and all raw results.</w:t>
+      </w:r>
+    </w:p>
+    <w:p>
+      <w:pPr>
+        <w:pStyle w:val="Body Text"/>
+      </w:pPr>
+      <w:r>
+        <w:rPr>
+          <w:rFonts w:ascii="Times New Roman" w:hAnsi="Times New Roman"/>
+          <w:b w:val="1"/>
+          <w:bCs w:val="1"/>
+          <w:sz w:val="20"/>
+          <w:szCs w:val="20"/>
+          <w:rtl w:val="0"/>
+          <w:lang w:val="en-US"/>
+        </w:rPr>
+        <w:t>Keywords:</w:t>
+      </w:r>
+      <w:r>
+        <w:rPr>
+          <w:rFonts w:ascii="Times New Roman" w:hAnsi="Times New Roman"/>
+          <w:sz w:val="20"/>
+          <w:szCs w:val="20"/>
+          <w:rtl w:val="0"/>
+          <w:lang w:val="en-US"/>
+        </w:rPr>
+        <w:t xml:space="preserve"> large language models; LLM memory; retrieval-augmented generation; personalization; cross-tool memory; confidence gating; local-first software</w:t>
       </w:r>
     </w:p>
     <w:p>

</xml_diff>

<commit_message>
docs(paper): name the measured outcome, narrow the gate claims, disclose missing raw records
Responds to items 1-3 of an external review.

- report A/B results as keyword-hit rates in percentage points, define a hit,
  and note in Limitations what keyword matching misses (polarity, wording,
  other languages); no equivalence claim for gemma3:4b vs. Gemini
- describe the gate as filtering tentative and hedged statements in
  constructed tests, not verifying facts or stopping deliberate poisoning;
  drop the conclusion's "earns injection rights through repetition" claim
- state that verify_paper.py is an arithmetic audit and that the saved
  records are incomplete: local answers truncated to 150 characters,
  end-to-end to 100, no Gemini answer text, no prompts or injected contexts
- graphical abstract tiles updated to match

Co-Authored-By: Claude Opus 5.5 <noreply@anthropic.com>
</commit_message>
<xml_diff>
--- a/paper/noesis_paper.docx
+++ b/paper/noesis_paper.docx
@@ -119,7 +119,7 @@
           <w:rFonts w:ascii="Times New Roman" w:cs="Times New Roman" w:hAnsi="Times New Roman" w:eastAsia="Times New Roman"/>
           <w:outline w:val="0"/>
           <w:color w:val="000000"/>
-          <w:sz w:val="19"/>
+          <w:sz w:val="20"/>
           <w:u w:color="000000"/>
           <w14:textFill>
             <w14:solidFill>
@@ -168,7 +168,7 @@
           <w:rtl w:val="0"/>
           <w:lang w:val="en-US"/>
         </w:rPr>
-        <w:t xml:space="preserve"> from conversations across tools into a shared per-user store, (2) gates injection behind a confidence lifecycle in which thoughts mature from tentative to settled based on repetition, assertion strength, cross-tool corroboration, and contradiction signals, and (3) caps injected context with a token budget. Across three models (Gemini Flash-Lite, gemma3:4b, qwen2.5:3b) on 110 paired questions each, memory injection raises answer accuracy from 41.8% to 85.5%, 34.5% to 82.7%, and 37.3% to 62.7% respectively (all </w:t>
+        <w:t xml:space="preserve"> from conversations across tools into a shared per-user store, (2) gates injection behind a confidence lifecycle in which thoughts mature from tentative to settled based on repetition, assertion strength, cross-tool corroboration, and contradiction signals, and (3) caps injected context with a token budget. Across three models (Gemini Flash-Lite, gemma3:4b, qwen2.5:3b) on 110 paired questions each, memory injection raises the keyword-hit rate on synthetic personal questions from 41.8% to 85.5%, 34.5% to 82.7%, and 37.3% to 62.7% respectively (+43.6, +48.2, and +25.5 percentage points; all </w:t>
       </w:r>
       <m:oMath>
         <m:r>
@@ -176,8 +176,8 @@
             <w:rFonts w:ascii="Cambria Math" w:hAnsi="Cambria Math"/>
             <w:i/>
             <w:color w:val="000000"/>
-            <w:sz w:val="23"/>
-            <w:szCs w:val="23"/>
+            <w:sz w:val="20"/>
+            <w:szCs w:val="20"/>
           </w:rPr>
           <m:t>p</m:t>
         </m:r>
@@ -186,8 +186,8 @@
             <w:rFonts w:ascii="Cambria Math" w:hAnsi="Cambria Math"/>
             <w:i/>
             <w:color w:val="000000"/>
-            <w:sz w:val="23"/>
-            <w:szCs w:val="23"/>
+            <w:sz w:val="20"/>
+            <w:szCs w:val="20"/>
           </w:rPr>
           <m:t>&lt;</m:t>
         </m:r>
@@ -196,8 +196,8 @@
             <w:rFonts w:ascii="Cambria Math" w:hAnsi="Cambria Math"/>
             <w:i/>
             <w:color w:val="000000"/>
-            <w:sz w:val="23"/>
-            <w:szCs w:val="23"/>
+            <w:sz w:val="20"/>
+            <w:szCs w:val="20"/>
           </w:rPr>
           <m:t>0.001</m:t>
         </m:r>
@@ -256,7 +256,7 @@
           <w:rtl w:val="0"/>
           <w:lang w:val="en-US"/>
         </w:rPr>
-        <w:t>s distinct gain is filtering: where ungated retrieval surfaced unverified or planted statements 19 and 13 times in two tests, Noesis surfaced none. On strictly cross-tool queries, Noesis retrieves 37% where per-tool isolation is structurally bound to 0%. I release the system, experiment harness, and all raw results.</w:t>
+        <w:t>s distinct gain is filtering: where ungated retrieval surfaced tentative or hedged statements 19 and 13 times in two constructed tests, Noesis surfaced none; the gate filters by how firmly something was said, not by whether it is true. On strictly cross-tool queries, Noesis retrieves 37% where per-tool isolation is structurally bound to 0%. I release the system, experiment harness, and all raw results.</w:t>
       </w:r>
     </w:p>
     <w:p>
@@ -926,7 +926,7 @@
       <w:r>
         <w:rPr>
           <w:rStyle w:val="无"/>
-          <w:rFonts w:ascii="Aptos" w:cs="Aptos" w:hAnsi="Aptos" w:eastAsia="Aptos" w:hint="default"/>
+          <w:rFonts w:ascii="Times New Roman" w:hAnsi="Times New Roman" w:hint="default"/>
           <w:rtl w:val="0"/>
           <w:lang w:val="en-US"/>
         </w:rPr>
@@ -939,7 +939,7 @@
           <w:rtl w:val="0"/>
           <w:lang w:val="en-US"/>
         </w:rPr>
-        <w:t>s gate is what keeps unverified and planted statements out (0 vs. 19 and 0 vs. 13).</w:t>
+        <w:t>s gate is what keeps tentative and hedged statements out (0 vs. 19 and 0 vs. 13 in constructed tests); it does not verify facts or stop deliberate poisoning.</w:t>
       </w:r>
     </w:p>
     <w:p>
@@ -1202,7 +1202,7 @@
           <w:rtl w:val="0"/>
           <w:lang w:val="en-US"/>
         </w:rPr>
-        <w:t xml:space="preserve"> question sets, memory injection significantly improves answer accuracy for a cloud model (Gemini Flash-Lite, </w:t>
+        <w:t xml:space="preserve"> question sets, memory injection significantly raises the keyword-hit rate for a cloud model (Gemini Flash-Lite, </w:t>
       </w:r>
       <m:oMath>
         <m:r>
@@ -6060,7 +6060,7 @@
           <w:rtl w:val="0"/>
           <w:lang w:val="en-US"/>
         </w:rPr>
-        <w:t xml:space="preserve">: Does memory injection improve answer accuracy? (A/B, end-to-end, </w:t>
+        <w:t xml:space="preserve">: Does memory injection raise the keyword-hit rate on personal questions? (A/B, end-to-end, </w:t>
       </w:r>
       <w:r>
         <w:rPr>
@@ -6795,7 +6795,7 @@
           <w:rtl w:val="0"/>
           <w:lang w:val="en-US"/>
         </w:rPr>
-        <w:t xml:space="preserve"> questions (22 profiles). Scoring is objective keyword-hit; paired outcomes are tested with McNemar</w:t>
+        <w:t xml:space="preserve"> questions (22 profiles). An answer counts as a hit if it contains the expected keyword, and I report the keyword-hit rate; paired outcomes are tested with McNemar</w:t>
       </w:r>
       <w:r>
         <w:rPr>
@@ -6976,7 +6976,25 @@
           <w:rtl w:val="0"/>
           <w:lang w:val="en-US"/>
         </w:rPr>
-        <w:t>9).</w:t>
+        <w:t>9). verify_paper.py is an arithmetic audit: it checks that each reported number follows from the saved per-question records, not that each answer was scored correctly. Those records are incomplete. The local-model A/B runs kept the first 150 characters of each answer and the end-to-end run the first 100, although hits were scored on the full answer; the Gemini A/B run kept no answer text, because its records were recovered from the run</w:t>
+      </w:r>
+      <w:r>
+        <w:rPr>
+          <w:rStyle w:val="无"/>
+          <w:rFonts w:ascii="Times New Roman" w:hAnsi="Times New Roman" w:hint="default"/>
+          <w:rtl w:val="0"/>
+          <w:lang w:val="en-US"/>
+        </w:rPr>
+        <w:t>’</w:t>
+      </w:r>
+      <w:r>
+        <w:rPr>
+          <w:rStyle w:val="无"/>
+          <w:rFonts w:ascii="Times New Roman" w:hAnsi="Times New Roman"/>
+          <w:rtl w:val="0"/>
+          <w:lang w:val="en-US"/>
+        </w:rPr>
+        <w:t>s console log, which printed only hit marks; and no run kept the full prompt or the injected context. The released files therefore support checking the arithmetic, not re-scoring the answers.</w:t>
       </w:r>
       <w:bookmarkEnd w:id="19"/>
     </w:p>
@@ -7048,7 +7066,7 @@
             </w14:solidFill>
           </w14:textFill>
         </w:rPr>
-        <w:t>5.1 RQ1: Memory injection improves accuracy across model tiers</w:t>
+        <w:t>5.1 RQ1: Memory injection raises the keyword-hit rate across model tiers</w:t>
       </w:r>
       <w:bookmarkEnd w:id="21"/>
     </w:p>
@@ -7088,7 +7106,7 @@
           <w:rtl w:val="0"/>
           <w:lang w:val="en-US"/>
         </w:rPr>
-        <w:t xml:space="preserve"> A/B results on identical </w:t>
+        <w:t xml:space="preserve"> A/B keyword-hit rates on identical </w:t>
       </w:r>
       <m:oMath>
         <m:r>
@@ -8284,7 +8302,7 @@
           <w:rtl w:val="0"/>
           <w:lang w:val="en-US"/>
         </w:rPr>
-        <w:t xml:space="preserve"> A/B accuracy across models (</w:t>
+        <w:t xml:space="preserve"> A/B keyword-hit rate across models (</w:t>
       </w:r>
       <m:oMath>
         <m:r>
@@ -8613,7 +8631,7 @@
           <w:rtl w:val="0"/>
           <w:lang w:val="en-US"/>
         </w:rPr>
-        <w:t>Accuracy alone does not separate retrieval strategies at this scale. In a separate end-to-end run on 50 questions (10 profiles, Gemini Flash-Lite), Noesis, injecting every stored memory, and injecting the five most recent memories scored 41, 40, and 41 of 50, against 22 of 50 with no memory. With only 3</w:t>
+        <w:t>The hit rate alone does not separate retrieval strategies at this scale. In a separate end-to-end run on 50 questions (10 profiles, Gemini Flash-Lite), Noesis, injecting every stored memory, and injecting the five most recent memories scored 41, 40, and 41 of 50, against 22 of 50 with no memory. With only 3</w:t>
       </w:r>
       <w:r>
         <w:rPr>
@@ -8702,7 +8720,7 @@
             </w14:solidFill>
           </w14:textFill>
         </w:rPr>
-        <w:t>5.2 RQ2: Semantic retrieval drives recall; gating keeps unverified thoughts out</w:t>
+        <w:t>5.2 RQ2: Semantic retrieval drives recall; gating keeps tentative thoughts out</w:t>
       </w:r>
       <w:bookmarkEnd w:id="24"/>
     </w:p>
@@ -12724,7 +12742,7 @@
           <w:rtl w:val="0"/>
           <w:lang w:val="en-US"/>
         </w:rPr>
-        <w:t>unverified</w:t>
+        <w:t>tentative</w:t>
       </w:r>
       <w:r>
         <w:rPr>
@@ -12751,7 +12769,25 @@
           <w:rtl w:val="0"/>
           <w:lang w:val="en-US"/>
         </w:rPr>
-        <w:t>5.3), but injects a tentative thought in 19 of its 250 slots. A separate poisoning test gives the same picture: with 5 settled facts and 8 hedged statements that contradict them, ungated top-5 retrieval returned a hedged statement in 13 of 25 slots across 5 queries, and Noesis in none. Removing the core-fact or recency signal changes nothing measurable: each adds about one memory per query (10.9 vs. 9.7 items) without changing recall. The builder adds these signals after the eight semantic results, so they never reach the first five slots; whether they help on queries the semantic channel misses needs a dedicated query set.</w:t>
+        <w:t>5.3), but injects a tentative thought in 19 of its 250 slots. A separate poisoning test gives the same picture: with 5 settled facts and 8 hedged statements that contradict them, ungated top-5 retrieval returned a hedged statement in 13 of 25 slots across 5 queries, and Noesis in none. Both tests use hedged statements; a firmly stated false one would pass the gate (</w:t>
+      </w:r>
+      <w:r>
+        <w:rPr>
+          <w:rStyle w:val="无"/>
+          <w:rFonts w:ascii="Times New Roman" w:hAnsi="Times New Roman" w:hint="default"/>
+          <w:rtl w:val="0"/>
+          <w:lang w:val="en-US"/>
+        </w:rPr>
+        <w:t>§</w:t>
+      </w:r>
+      <w:r>
+        <w:rPr>
+          <w:rStyle w:val="无"/>
+          <w:rFonts w:ascii="Times New Roman" w:hAnsi="Times New Roman"/>
+          <w:rtl w:val="0"/>
+          <w:lang w:val="en-US"/>
+        </w:rPr>
+        <w:t>9). Removing the core-fact or recency signal changes nothing measurable: each adds about one memory per query (10.9 vs. 9.7 items) without changing recall. The builder adds these signals after the eight semantic results, so they never reach the first five slots; whether they help on queries the semantic channel misses needs a dedicated query set.</w:t>
       </w:r>
     </w:p>
     <w:p>
@@ -14671,7 +14707,79 @@
           <w:rtl w:val="0"/>
           <w:lang w:val="en-US"/>
         </w:rPr>
-        <w:t xml:space="preserve">Scoring is keyword-hit, which is objective but coarse; semantic correctness may differ in both directions. Personas are synthetic; build/test alignment may overstate real-world gains, and real conversations are noisier. The cloud A/B uses one provider (Gemini Flash-Lite) and </w:t>
+        <w:t xml:space="preserve">Scoring is keyword-hit, which is objective but coarse: it checks whether an answer contains the expected keyword, not whether the answer is right. </w:t>
+      </w:r>
+      <w:r>
+        <w:rPr>
+          <w:rStyle w:val="无"/>
+          <w:rFonts w:ascii="Times New Roman" w:hAnsi="Times New Roman" w:hint="default"/>
+          <w:rtl w:val="0"/>
+          <w:lang w:val="en-US"/>
+        </w:rPr>
+        <w:t>“</w:t>
+      </w:r>
+      <w:r>
+        <w:rPr>
+          <w:rStyle w:val="无"/>
+          <w:rFonts w:ascii="Times New Roman" w:hAnsi="Times New Roman"/>
+          <w:rtl w:val="0"/>
+          <w:lang w:val="en-US"/>
+        </w:rPr>
+        <w:t>You do not prefer Python</w:t>
+      </w:r>
+      <w:r>
+        <w:rPr>
+          <w:rStyle w:val="无"/>
+          <w:rFonts w:ascii="Times New Roman" w:hAnsi="Times New Roman" w:hint="default"/>
+          <w:rtl w:val="0"/>
+          <w:lang w:val="en-US"/>
+        </w:rPr>
+        <w:t xml:space="preserve">” </w:t>
+      </w:r>
+      <w:r>
+        <w:rPr>
+          <w:rStyle w:val="无"/>
+          <w:rFonts w:ascii="Times New Roman" w:hAnsi="Times New Roman"/>
+          <w:rtl w:val="0"/>
+          <w:lang w:val="en-US"/>
+        </w:rPr>
+        <w:t xml:space="preserve">contains the same keyword as </w:t>
+      </w:r>
+      <w:r>
+        <w:rPr>
+          <w:rStyle w:val="无"/>
+          <w:rFonts w:ascii="Times New Roman" w:hAnsi="Times New Roman" w:hint="default"/>
+          <w:rtl w:val="0"/>
+          <w:lang w:val="en-US"/>
+        </w:rPr>
+        <w:t>“</w:t>
+      </w:r>
+      <w:r>
+        <w:rPr>
+          <w:rStyle w:val="无"/>
+          <w:rFonts w:ascii="Times New Roman" w:hAnsi="Times New Roman"/>
+          <w:rtl w:val="0"/>
+          <w:lang w:val="en-US"/>
+        </w:rPr>
+        <w:t>you prefer Python</w:t>
+      </w:r>
+      <w:r>
+        <w:rPr>
+          <w:rStyle w:val="无"/>
+          <w:rFonts w:ascii="Times New Roman" w:hAnsi="Times New Roman" w:hint="default"/>
+          <w:rtl w:val="0"/>
+          <w:lang w:val="en-US"/>
+        </w:rPr>
+        <w:t>”</w:t>
+      </w:r>
+      <w:r>
+        <w:rPr>
+          <w:rStyle w:val="无"/>
+          <w:rFonts w:ascii="Times New Roman" w:hAnsi="Times New Roman"/>
+          <w:rtl w:val="0"/>
+          <w:lang w:val="en-US"/>
+        </w:rPr>
+        <w:t xml:space="preserve">, and a correct answer worded differently or given in another language counts as a miss. Personas are synthetic; build/test alignment may overstate real-world gains, and real conversations are noisier. The cloud A/B uses one provider (Gemini Flash-Lite) and </w:t>
       </w:r>
       <m:oMath>
         <m:r>
@@ -15063,7 +15171,7 @@
           <w:rtl w:val="0"/>
           <w:lang w:val="en-US"/>
         </w:rPr>
-        <w:t xml:space="preserve"> it injects. A confidence lifecycle earns injection rights through repetition and consistency, and its gate keeps unverified and planted statements out of the prompt where plain retrieval lets them in; retrieval keeps cost flat as memory grows (35 times cheaper than injecting everything at </w:t>
+        <w:t xml:space="preserve"> it injects. A confidence lifecycle decides which thoughts may be injected: in constructed tests its gate kept tentative and hedged statements out of the prompt where plain retrieval let them in, though it judges how firmly something was said, not whether it is true, and is no defense against deliberate poisoning. Retrieval keeps cost flat as memory grows (35 times cheaper than injecting everything at </w:t>
       </w:r>
       <m:oMath>
         <m:r>
@@ -15104,7 +15212,7 @@
           <w:rtl w:val="0"/>
           <w:lang w:val="en-US"/>
         </w:rPr>
-        <w:t>, though a standard top-5 RAG is cheaper still); and a shared per-user store makes cross-tool consistency possible where per-tool architectures are structurally bound to fail. The result is a local-first layer that makes a 4B local model answer personal questions about as accurately as a small cloud model (82.7% vs. 85.5% for Gemini Flash-Lite; no significant difference on this set)</w:t>
+        <w:t>, though a standard top-5 RAG is cheaper still); and a shared per-user store makes cross-tool consistency possible where per-tool architectures are structurally bound to fail. The result is a local-first layer that lets a 4B local model reach nearly the keyword-hit rate of a small cloud model (82.7% vs. 85.5% for Gemini Flash-Lite; the gap is not significant on this set, though that does not show the two are equivalent)</w:t>
       </w:r>
       <w:r>
         <w:rPr>

</xml_diff>

<commit_message>
docs(paper): tighten the prose by about 16% without dropping any section or result
Body text goes from 5,645 to 4,727 words; every section heading, table,
figure, number, and response to the external review is kept.

- shorter abstract, introduction, related work, setup, results text,
  star-map description, discussion, limitations, and conclusion
- Future Work's harness-evaluation and claim-graph paragraphs folded into
  "Stronger evaluation" and "Structured injection"
- figure and table captions trimmed; table generator caption kept in sync
- verify_paper.py: 81/81 pass (no reported number changed)

Co-Authored-By: Claude Opus 5.5 <noreply@anthropic.com>
</commit_message>
<xml_diff>
--- a/paper/noesis_paper.docx
+++ b/paper/noesis_paper.docx
@@ -134,7 +134,7 @@
           <w:rtl w:val="0"/>
           <w:lang w:val="en-US"/>
         </w:rPr>
-        <w:t>Users converse with multiple AI assistants daily, yet each tool</w:t>
+        <w:t>Users converse with several AI assistants, yet each tool</w:t>
       </w:r>
       <w:r>
         <w:rPr>
@@ -150,7 +150,7 @@
           <w:rtl w:val="0"/>
           <w:lang w:val="en-US"/>
         </w:rPr>
-        <w:t xml:space="preserve">s memory is isolated: a stance expressed in one tool is unknown to the others, and each conversation starts from scratch. Shared and evolving memory layers already exist; this paper studies a narrower design choice: an explicit admission rule that decides whether a captured statement is firm enough to enter the prompt at all. I present Noesis, a local-first memory layer that (1) extracts typed </w:t>
+        <w:t xml:space="preserve">s memory is isolated. Shared and evolving memory layers already exist; this paper studies a narrower design choice: an explicit rule that decides whether a captured statement is firm enough to enter the prompt. Noesis is a local-first memory layer that extracts typed </w:t>
       </w:r>
       <w:r>
         <w:rPr>
@@ -168,7 +168,25 @@
           <w:rtl w:val="0"/>
           <w:lang w:val="en-US"/>
         </w:rPr>
-        <w:t xml:space="preserve"> from conversations across tools into a shared per-user store, (2) gates injection behind a confidence lifecycle in which thoughts mature from tentative to settled based on repetition, assertion strength, cross-tool corroboration, and contradiction signals, and (3) caps injected context with a token budget. Across three models (Gemini Flash-Lite, gemma3:4b, qwen2.5:3b) on 110 paired questions each, memory injection raises the keyword-hit rate on synthetic personal questions from 41.8% to 85.5%, 34.5% to 82.7%, and 37.3% to 62.7% respectively (+43.6, +48.2, and +25.5 percentage points; all </w:t>
+        <w:t xml:space="preserve"> from conversations across tools into a shared per-user store, injects a thought only after a confidence lifecycle (repetition, assertion strength, cross-tool corroboration, no contradiction) promotes it from </w:t>
+      </w:r>
+      <w:r>
+        <w:rPr>
+          <w:rFonts w:ascii="Times New Roman" w:hAnsi="Times New Roman"/>
+          <w:i w:val="1"/>
+          <w:iCs w:val="1"/>
+          <w:rtl w:val="0"/>
+          <w:lang w:val="en-US"/>
+        </w:rPr>
+        <w:t>tentative</w:t>
+      </w:r>
+      <w:r>
+        <w:rPr>
+          <w:rFonts w:ascii="Times New Roman" w:hAnsi="Times New Roman"/>
+          <w:rtl w:val="0"/>
+          <w:lang w:val="en-US"/>
+        </w:rPr>
+        <w:t xml:space="preserve">, and caps injected context with a token budget. On 110 paired synthetic personal questions, memory injection raises the keyword-hit rate of Gemini Flash-Lite, gemma3:4b, and qwen2.5:3b by 43.6, 48.2, and 25.5 percentage points (all </w:t>
       </w:r>
       <m:oMath>
         <m:r>
@@ -224,7 +242,7 @@
           <w:rtl w:val="0"/>
           <w:lang w:val="en-US"/>
         </w:rPr>
-        <w:t>s test). At 500 stored memories, Noesis keeps 9 of 10 targets at rank 1 with about 207 injected tokens, 35 times fewer than injecting every memory (MRR 0.90 vs.</w:t>
+        <w:t>s test). At 500 stored memories Noesis injects about 207 tokens, 35 times fewer than injecting everything, with 9 of 10 targets at rank 1; a standard top-5 RAG ranks as well with fewer tokens, so Noesis</w:t>
       </w:r>
       <w:r>
         <w:rPr>
@@ -232,22 +250,6 @@
           <w:rtl w:val="0"/>
           <w:lang w:val="en-US"/>
         </w:rPr>
-        <w:t> </w:t>
-      </w:r>
-      <w:r>
-        <w:rPr>
-          <w:rFonts w:ascii="Times New Roman" w:hAnsi="Times New Roman"/>
-          <w:rtl w:val="0"/>
-          <w:lang w:val="en-US"/>
-        </w:rPr>
-        <w:t>0.002); a standard top-5 RAG ranks as well with fewer tokens, so Noesis</w:t>
-      </w:r>
-      <w:r>
-        <w:rPr>
-          <w:rFonts w:ascii="Times New Roman" w:hAnsi="Times New Roman" w:hint="default"/>
-          <w:rtl w:val="0"/>
-          <w:lang w:val="en-US"/>
-        </w:rPr>
         <w:t>’</w:t>
       </w:r>
       <w:r>
@@ -256,7 +258,7 @@
           <w:rtl w:val="0"/>
           <w:lang w:val="en-US"/>
         </w:rPr>
-        <w:t>s distinct gain is filtering: where ungated retrieval surfaced tentative or hedged statements 19 and 13 times in two constructed tests, Noesis surfaced none; the gate filters by how firmly something was said, not by whether it is true. On strictly cross-tool queries, Noesis retrieves 37% where per-tool isolation is structurally bound to 0%. I release the system, the experiment harness, and the saved raw results.</w:t>
+        <w:t>s distinct gain is filtering: ungated retrieval surfaced tentative or hedged statements 19 and 13 times in two constructed tests, Noesis none, though its gate judges how firmly something was said, not whether it is true. On strictly cross-tool queries Noesis retrieves 37% of targets, where per-tool isolation is bound to 0%. Code, harness, and raw results are released.</w:t>
       </w:r>
     </w:p>
     <w:p>
@@ -332,7 +334,7 @@
           <w:rtl w:val="0"/>
           <w:lang w:val="en-US"/>
         </w:rPr>
-        <w:t>Heavy users of AI assistants switch between ChatGPT, Claude, Gemini, and local models throughout the day. Each tool maintains its own isolated memory: a database preference carefully explained to Claude must be re-explained to GPT; a design decision reached with Gemini is invisible to Claude. The reasoning a user performs across tools, such as their positions, preferences, and open questions, evaporates at every tool boundary.</w:t>
+        <w:t>Heavy users of AI assistants switch between ChatGPT, Claude, Gemini, and local models, and each tool keeps its own memory: a preference explained to Claude must be re-explained to GPT, and the positions and open questions a user works out in one tool are lost at every tool boundary.</w:t>
       </w:r>
     </w:p>
     <w:p>
@@ -385,7 +387,7 @@
           <w:rtl w:val="0"/>
           <w:lang w:val="en-US"/>
         </w:rPr>
-        <w:t>(Chhikara et al. 2025) extract and consolidate facts from conversations; OpenMemory MCP</w:t>
+        <w:t>(Chhikara et al. 2025) extract and consolidate facts; OpenMemory MCP</w:t>
       </w:r>
       <w:r>
         <w:rPr>
@@ -399,7 +401,7 @@
           <w:rtl w:val="0"/>
           <w:lang w:val="en-US"/>
         </w:rPr>
-        <w:t>(Mem0 2025) shares one local store across MCP clients; and Zep</w:t>
+        <w:t>(Mem0 2025) shares one local store across MCP clients; Zep</w:t>
       </w:r>
       <w:r>
         <w:rPr>
@@ -471,7 +473,7 @@
           <w:rtl w:val="0"/>
           <w:lang w:val="en-US"/>
         </w:rPr>
-        <w:t xml:space="preserve">(Lewis et al. 2020) retrieves relevant context for each query, but naive variants inject everything retrieved; as personal memory grows into the hundreds of items, injected context grows linearly, burying the relevant signal and inflating cost (I measure 7,192 tokens at </w:t>
+        <w:t xml:space="preserve">(Lewis et al. 2020) retrieves context per query, but naive variants inject everything retrieved, so cost grows with memory size and the relevant signal is buried (I measure 7,192 tokens at </w:t>
       </w:r>
       <m:oMath>
         <m:r>
@@ -703,7 +705,7 @@
           <w:rtl w:val="0"/>
           <w:lang w:val="en-US"/>
         </w:rPr>
-        <w:t>). Thoughts are typed (identity, preference, position, question, synthesis, event, contradiction) and mature tentative</w:t>
+        <w:t>). Thoughts of seven types mature tentative</w:t>
       </w:r>
       <m:oMath>
         <m:r>
@@ -745,7 +747,7 @@
           <w:rtl w:val="0"/>
           <w:lang w:val="en-US"/>
         </w:rPr>
-        <w:t>settled via a four-signal scorer, with type-specific time decay and cluster-aware supersession that reduced stale-stance leakage from 93% to 7% (</w:t>
+        <w:t>settled via a four-signal scorer, with type-specific decay and supersession that cut stale-stance leakage from 93% to 7% (</w:t>
       </w:r>
       <w:r>
         <w:rPr>
@@ -966,7 +968,7 @@
           <w:rtl w:val="0"/>
           <w:lang w:val="en-US"/>
         </w:rPr>
-        <w:t>207 tokens (35 times fewer than injecting everything) while holding MRR at 0.90; a standard top-5 RAG matches that ranking at lower cost, and Noesis</w:t>
+        <w:t>207 tokens (35 times fewer than injecting everything) at MRR 0.90; top-5 RAG matches that ranking more cheaply, but only Noesis</w:t>
       </w:r>
       <w:r>
         <w:rPr>
@@ -984,7 +986,7 @@
           <w:rtl w:val="0"/>
           <w:lang w:val="en-US"/>
         </w:rPr>
-        <w:t>s gate is what keeps tentative and hedged statements out (0 vs. 19 and 0 vs. 13 in constructed tests).</w:t>
+        <w:t>s gate keeps tentative and hedged statements out (0 vs. 19 and 0 vs. 13 in constructed tests).</w:t>
       </w:r>
     </w:p>
     <w:p>
@@ -1075,45 +1077,7 @@
           <w:rtl w:val="0"/>
           <w:lang w:val="en-US"/>
         </w:rPr>
-        <w:t xml:space="preserve">). With a shared per-user store, Noesis retrieves 37% of strictly cross-tool queries versus </w:t>
-      </w:r>
-      <w:r>
-        <w:rPr>
-          <w:rStyle w:val="无"/>
-          <w:rFonts w:ascii="Times New Roman" w:hAnsi="Times New Roman"/>
-          <w:b w:val="1"/>
-          <w:bCs w:val="1"/>
-          <w:rtl w:val="0"/>
-          <w:lang w:val="en-US"/>
-        </w:rPr>
-        <w:t>0%</w:t>
-      </w:r>
-      <w:r>
-        <w:rPr>
-          <w:rStyle w:val="无"/>
-          <w:rFonts w:ascii="Times New Roman" w:hAnsi="Times New Roman"/>
-          <w:rtl w:val="0"/>
-          <w:lang w:val="en-US"/>
-        </w:rPr>
-        <w:t xml:space="preserve"> for per-tool isolation (50% vs. 7.5% over all 40 scenarios)</w:t>
-      </w:r>
-      <w:r>
-        <w:rPr>
-          <w:rStyle w:val="无"/>
-          <w:rFonts w:ascii="Times New Roman" w:hAnsi="Times New Roman" w:hint="default"/>
-          <w:rtl w:val="0"/>
-          <w:lang w:val="en-US"/>
-        </w:rPr>
-        <w:t>—</w:t>
-      </w:r>
-      <w:r>
-        <w:rPr>
-          <w:rStyle w:val="无"/>
-          <w:rFonts w:ascii="Times New Roman" w:hAnsi="Times New Roman"/>
-          <w:rtl w:val="0"/>
-          <w:lang w:val="en-US"/>
-        </w:rPr>
-        <w:t>a gap that is architecturally impossible for isolated systems to close.</w:t>
+        <w:t>). A shared per-user store retrieves 37% of strictly cross-tool targets, where per-tool isolation scores 0% by construction (50% vs. 7.5% over all 40 scenarios).</w:t>
       </w:r>
     </w:p>
     <w:p>
@@ -1399,7 +1363,7 @@
           <w:rtl w:val="0"/>
           <w:lang w:val="en-US"/>
         </w:rPr>
-        <w:t>The system is local-first: embeddings and retrieval run on-device (sqlite-vec + all-MiniLM-L6-v2), and conversation text leaves the machine only for optional LLM-based extraction or when the proxy forwards a request, with its injected memories, to a cloud model. All code, the experiment harness, the saved raw results, and a verification script that recomputes every reported number from raw JSON are released.</w:t>
+        <w:t>The system is local-first: embeddings and retrieval run on-device (sqlite-vec + all-MiniLM-L6-v2), and conversation text leaves the machine only for optional cloud extraction or when the proxy forwards a request, with its injected memories, to a cloud model. Code, experiment harness, saved raw results, and a script that recomputes every reported number are released.</w:t>
       </w:r>
       <w:r>
         <w:rPr>
@@ -1495,25 +1459,7 @@
           <w:rtl w:val="0"/>
           <w:lang w:val="en-US"/>
         </w:rPr>
-        <w:t xml:space="preserve"> Noesis system architecture. Tools connect through an MCP server, an OpenAI-compatible proxy, or a WebSocket; Phase 1 stores the utterance synchronously (median 21</w:t>
-      </w:r>
-      <w:r>
-        <w:rPr>
-          <w:rStyle w:val="无"/>
-          <w:rFonts w:ascii="Times New Roman" w:hAnsi="Times New Roman" w:hint="default"/>
-          <w:rtl w:val="0"/>
-          <w:lang w:val="en-US"/>
-        </w:rPr>
-        <w:t> </w:t>
-      </w:r>
-      <w:r>
-        <w:rPr>
-          <w:rStyle w:val="无"/>
-          <w:rFonts w:ascii="Times New Roman" w:hAnsi="Times New Roman"/>
-          <w:rtl w:val="0"/>
-          <w:lang w:val="en-US"/>
-        </w:rPr>
-        <w:t>ms) and Phase 2 asynchronously extracts, scores, and links the thought. Hot store (sqlite-vec) serves retrieval; cold store (Obsidian vault) keeps memory human-readable and editable.</w:t>
+        <w:t xml:space="preserve"> Noesis architecture. Tools connect through an MCP server, an OpenAI-compatible proxy, or a WebSocket; Phase 1 stores each utterance at once and Phase 2 extracts, scores, and links it in the background. A hot store (sqlite-vec) serves retrieval and a cold store (Obsidian vault) keeps memory editable.</w:t>
       </w:r>
       <w:bookmarkEnd w:id="1"/>
     </w:p>
@@ -1647,7 +1593,7 @@
           <w:rtl w:val="0"/>
           <w:lang w:val="en-US"/>
         </w:rPr>
-        <w:t>(Packer et al. 2023) treats the LLM as an operating system paging memory between contexts; Letta extends this with archival storage. Mem0</w:t>
+        <w:t>(Packer et al. 2023) pages memory between context tiers, and Letta adds archival storage. Mem0</w:t>
       </w:r>
       <w:r>
         <w:rPr>
@@ -1663,7 +1609,7 @@
           <w:rtl w:val="0"/>
           <w:lang w:val="en-US"/>
         </w:rPr>
-        <w:t>(Chhikara et al. 2025) extracts and consolidates facts with an LLM pipeline, reporting gains over full-history baselines, and has a graph-based variant; A-MEM</w:t>
+        <w:t>(Chhikara et al. 2025) extracts and consolidates facts with an LLM pipeline and has a graph-based variant; A-MEM</w:t>
       </w:r>
       <w:r>
         <w:rPr>
@@ -1679,7 +1625,7 @@
           <w:rtl w:val="0"/>
           <w:lang w:val="en-US"/>
         </w:rPr>
-        <w:t>(Xu et al. 2025) links memories into an evolving Zettelkasten-style network, and Zep</w:t>
+        <w:t>(Xu et al. 2025) links memories into an evolving note network; Zep</w:t>
       </w:r>
       <w:r>
         <w:rPr>
@@ -1695,7 +1641,7 @@
           <w:rtl w:val="0"/>
           <w:lang w:val="en-US"/>
         </w:rPr>
-        <w:t>(Rasmussen et al. 2025) stores them in a temporal knowledge graph. Zep invalidates contradicted facts with an LLM, more generally than Noesis</w:t>
+        <w:t>(Rasmussen et al. 2025) stores them in a temporal knowledge graph and invalidates contradicted facts with an LLM, more generally than Noesis</w:t>
       </w:r>
       <w:r>
         <w:rPr>
@@ -1759,7 +1705,7 @@
           <w:rtl w:val="0"/>
           <w:lang w:val="en-US"/>
         </w:rPr>
-        <w:t>(Zhong et al. 2024) lets them fade along an Ebbinghaus forgetting curve, the closest precedents for Noesis</w:t>
+        <w:t>(Zhong et al. 2024) lets them fade along a forgetting curve, the closest precedents for Noesis</w:t>
       </w:r>
       <w:r>
         <w:rPr>
@@ -1791,23 +1737,7 @@
           <w:rtl w:val="0"/>
           <w:lang w:val="en-US"/>
         </w:rPr>
-        <w:t>(Mem0 2025) already shares one local store across MCP clients such as Cursor and Claude Desktop. Noesis differs in (a) an explicit admission rule, under which items below provisional status are never injected and which the OpenMemory announcement does not describe, and (b) its entry points beyond MCP: an OpenAI-compatible proxy and a browser extension make clients outside MCP first-class participants. Against this background, Noesis</w:t>
-      </w:r>
-      <w:r>
-        <w:rPr>
-          <w:rStyle w:val="无"/>
-          <w:rtl w:val="0"/>
-          <w:lang w:val="en-US"/>
-        </w:rPr>
-        <w:t>’</w:t>
-      </w:r>
-      <w:r>
-        <w:rPr>
-          <w:rStyle w:val="无"/>
-          <w:rtl w:val="0"/>
-          <w:lang w:val="en-US"/>
-        </w:rPr>
-        <w:t>s candidate contribution is narrow: the admission policy, not memory beyond a context window in general. Benchmarks such as LoCoMo</w:t>
+        <w:t>(Mem0 2025) already shares one local store across MCP clients. Noesis differs in (a) an explicit admission rule, under which nothing below provisional is injected and which the OpenMemory announcement does not describe, and (b) entry points beyond MCP (an OpenAI-compatible proxy and a browser extension). Its candidate contribution is therefore the admission policy, not memory beyond a context window in general. Benchmarks such as LoCoMo</w:t>
       </w:r>
       <w:r>
         <w:rPr>
@@ -1823,7 +1753,7 @@
           <w:rtl w:val="0"/>
           <w:lang w:val="en-US"/>
         </w:rPr>
-        <w:t>(Maharana et al. 2024) and LongMemEval</w:t>
+        <w:t>(Maharana et al. 2024), LongMemEval</w:t>
       </w:r>
       <w:r>
         <w:rPr>
@@ -1839,7 +1769,7 @@
           <w:rtl w:val="0"/>
           <w:lang w:val="en-US"/>
         </w:rPr>
-        <w:t>(Wu et al. 2025) offer standard long-term-memory evaluations that this paper does not yet use; LongMemEval-V2</w:t>
+        <w:t>(Wu et al. 2025), and LongMemEval-V2</w:t>
       </w:r>
       <w:r>
         <w:rPr>
@@ -1855,7 +1785,7 @@
           <w:rtl w:val="0"/>
           <w:lang w:val="en-US"/>
         </w:rPr>
-        <w:t>(Wu et al. 2026) (in progress) adds workflow memory.</w:t>
+        <w:t>(Wu et al. 2026) (in progress; it adds workflow memory) are not yet used here.</w:t>
       </w:r>
     </w:p>
     <w:p>
@@ -1907,7 +1837,23 @@
           <w:rtl w:val="0"/>
           <w:lang w:val="en-US"/>
         </w:rPr>
-        <w:t xml:space="preserve">(Latimer et al. 2026), the closest system, separates world facts, the </w:t>
+        <w:t>(Latimer et al. 2026), the closest system, separates world facts, the agent</w:t>
+      </w:r>
+      <w:r>
+        <w:rPr>
+          <w:rStyle w:val="无"/>
+          <w:rtl w:val="0"/>
+          <w:lang w:val="en-US"/>
+        </w:rPr>
+        <w:t>’</w:t>
+      </w:r>
+      <w:r>
+        <w:rPr>
+          <w:rStyle w:val="无"/>
+          <w:rtl w:val="0"/>
+          <w:lang w:val="en-US"/>
+        </w:rPr>
+        <w:t xml:space="preserve">s experiences, opinions, and entity observations, recalls through four channels under a token budget, and gives each opinion an evolving confidence, so none of these is a Noesis contribution. Its confidence belongs to opinions the </w:t>
       </w:r>
       <w:r>
         <w:rPr>
@@ -1925,31 +1871,7 @@
           <w:rtl w:val="0"/>
           <w:lang w:val="en-US"/>
         </w:rPr>
-        <w:t>’</w:t>
-      </w:r>
-      <w:r>
-        <w:rPr>
-          <w:rStyle w:val="无"/>
-          <w:rtl w:val="0"/>
-          <w:lang w:val="en-US"/>
-        </w:rPr>
-        <w:t>s experiences, opinions, and entity observations, recalls through four channels under a token budget, and gives each opinion an evolving confidence, so typed memory, budgeted hybrid retrieval, and evolving confidence are not Noesis contributions. The differences are narrower: Hindsight</w:t>
-      </w:r>
-      <w:r>
-        <w:rPr>
-          <w:rStyle w:val="无"/>
-          <w:rtl w:val="0"/>
-          <w:lang w:val="en-US"/>
-        </w:rPr>
-        <w:t>’</w:t>
-      </w:r>
-      <w:r>
-        <w:rPr>
-          <w:rStyle w:val="无"/>
-          <w:rtl w:val="0"/>
-          <w:lang w:val="en-US"/>
-        </w:rPr>
-        <w:t xml:space="preserve">s confidence belongs to opinions the agent forms and, in the version I examined, does not gate recall, whereas Noesis gates the </w:t>
+        <w:t xml:space="preserve"> forms and, in the version I examined, does not gate recall, whereas Noesis gates the </w:t>
       </w:r>
       <w:r>
         <w:rPr>
@@ -1987,7 +1909,7 @@
           <w:rtl w:val="0"/>
           <w:lang w:val="en-US"/>
         </w:rPr>
-        <w:t xml:space="preserve"> own statements; Noesis runs on SQLite with a CPU embedding model and pools several AI tools into one store. I have not compared the two empirically.</w:t>
+        <w:t xml:space="preserve"> own statements, runs on SQLite with a CPU embedding model, and pools several AI tools into one store. I have not compared the two empirically.</w:t>
       </w:r>
     </w:p>
     <w:p>
@@ -2039,7 +1961,7 @@
           <w:rtl w:val="0"/>
           <w:lang w:val="en-US"/>
         </w:rPr>
-        <w:t>(Hu et al. 2025), and graph memory by extraction, storage, retrieval, and evolution</w:t>
+        <w:t>(Hu et al. 2025) and graph memory by extraction, storage, retrieval, and evolution</w:t>
       </w:r>
       <w:r>
         <w:rPr>
@@ -2071,7 +1993,7 @@
           <w:rtl w:val="0"/>
           <w:lang w:val="en-US"/>
         </w:rPr>
-        <w:t>(Edge et al. 2024) summarizes entity communities for global questions over a corpus, a different task from tracking one user</w:t>
+        <w:t>(Edge et al. 2024) summarizes entity communities over a corpus, a different task from tracking one user</w:t>
       </w:r>
       <w:r>
         <w:rPr>
@@ -2103,7 +2025,7 @@
           <w:rtl w:val="0"/>
           <w:lang w:val="en-US"/>
         </w:rPr>
-        <w:t>(Yu et al. 2026) learns when to store, retrieve, update, summarize, or discard; and MRAgent</w:t>
+        <w:t>(Yu et al. 2026) learns when to store, retrieve, update, summarize, or discard; MRAgent</w:t>
       </w:r>
       <w:r>
         <w:rPr>
@@ -2119,7 +2041,7 @@
           <w:rtl w:val="0"/>
           <w:lang w:val="en-US"/>
         </w:rPr>
-        <w:t xml:space="preserve">(Ji et al. 2026) explores an associative memory graph guided by reasoning. Noesis instead uses fixed rules; its intended advantages (transparency, low overhead, portability) are unmeasured here apart from the latencies in </w:t>
+        <w:t xml:space="preserve">(Ji et al. 2026) explores an associative memory graph guided by reasoning. Noesis uses fixed rules instead; its intended advantages (transparency, low overhead, portability) are not measured here beyond the latencies in </w:t>
       </w:r>
       <w:r>
         <w:rPr>
@@ -2135,7 +2057,7 @@
           <w:rtl w:val="0"/>
           <w:lang w:val="en-US"/>
         </w:rPr>
-        <w:t>3.1, and task performance is not compared.</w:t>
+        <w:t>3.1.</w:t>
       </w:r>
     </w:p>
     <w:p>
@@ -2203,7 +2125,7 @@
           <w:rtl w:val="0"/>
           <w:lang w:val="en-US"/>
         </w:rPr>
-        <w:t>(Lin et al. 2026) argues that memory security spans writing, storage, retrieval, execution, sharing, and forgetting, and cannot be added at retrieval time alone. Noesis</w:t>
+        <w:t>(Lin et al. 2026) argues that memory security spans writing, storage, retrieval, execution, sharing, and forgetting and cannot be added at retrieval alone. Noesis</w:t>
       </w:r>
       <w:r>
         <w:rPr>
@@ -2235,7 +2157,7 @@
           <w:rtl w:val="0"/>
           <w:lang w:val="en-US"/>
         </w:rPr>
-        <w:t>9), and a shared store carries a record written in one tool into the others.</w:t>
+        <w:t>9), and a shared store spreads it to every tool.</w:t>
       </w:r>
       <w:bookmarkEnd w:id="3"/>
     </w:p>
@@ -2303,7 +2225,7 @@
           <w:rtl w:val="0"/>
           <w:lang w:val="en-US"/>
         </w:rPr>
-        <w:t>(Lewis et al. 2020) and successors retrieve per-query context. Self-RAG</w:t>
+        <w:t>(Lewis et al. 2020) and successors such as Self-RAG</w:t>
       </w:r>
       <w:r>
         <w:rPr>
@@ -2335,7 +2257,7 @@
           <w:rtl w:val="0"/>
           <w:lang w:val="en-US"/>
         </w:rPr>
-        <w:t>(Jiang et al. 2023) improve retrieval quality or adaptivity, but address corpus QA, not a user</w:t>
+        <w:t>(Jiang et al. 2023) improve per-query retrieval for corpus QA, not a user</w:t>
       </w:r>
       <w:r>
         <w:rPr>
@@ -2351,7 +2273,7 @@
           <w:rtl w:val="0"/>
           <w:lang w:val="en-US"/>
         </w:rPr>
-        <w:t>s evolving personal memory. My scale experiment (</w:t>
+        <w:t xml:space="preserve">s evolving personal memory. Noesis pairs hybrid retrieval with a hard token budget and a confidence gate; </w:t>
       </w:r>
       <w:r>
         <w:rPr>
@@ -2367,7 +2289,7 @@
           <w:rtl w:val="0"/>
           <w:lang w:val="en-US"/>
         </w:rPr>
-        <w:t>5.3) shows why naive inject-everything retrieval fails for personal memory: cost grows linearly and ranking collapses. Noesis pairs hybrid retrieval (BM25 + vector + RRF, with time-decay weighting) with a hard token budget and a confidence gate.</w:t>
+        <w:t>5.3 shows why injecting everything fails for personal memory.</w:t>
       </w:r>
       <w:bookmarkEnd w:id="4"/>
     </w:p>
@@ -2435,23 +2357,23 @@
           <w:rtl w:val="0"/>
           <w:lang w:val="en-US"/>
         </w:rPr>
-        <w:t>(Yang et al. 2023) and related work personalize outputs from user interaction history, typically for recommendation-style tasks. Chat-tool vendor memory features (e.g., ChatGPT memory) are per-product and closed. Noesis</w:t>
-      </w:r>
-      <w:r>
-        <w:rPr>
-          <w:rStyle w:val="无"/>
-          <w:rtl w:val="0"/>
-          <w:lang w:val="en-US"/>
-        </w:rPr>
-        <w:t>’</w:t>
-      </w:r>
-      <w:r>
-        <w:rPr>
-          <w:rStyle w:val="无"/>
-          <w:rtl w:val="0"/>
-          <w:lang w:val="en-US"/>
-        </w:rPr>
-        <w:t>s cross-tool experiment (</w:t>
+        <w:t>(Yang et al. 2023) and related work personalize outputs from interaction history, mostly for recommendation; chat vendors</w:t>
+      </w:r>
+      <w:r>
+        <w:rPr>
+          <w:rStyle w:val="无"/>
+          <w:rtl w:val="0"/>
+          <w:lang w:val="en-US"/>
+        </w:rPr>
+        <w:t xml:space="preserve">’ </w:t>
+      </w:r>
+      <w:r>
+        <w:rPr>
+          <w:rStyle w:val="无"/>
+          <w:rtl w:val="0"/>
+          <w:lang w:val="en-US"/>
+        </w:rPr>
+        <w:t>memory features (e.g., ChatGPT memory) are per-product and closed. Noesis scopes memory to the user rather than the tool (</w:t>
       </w:r>
       <w:r>
         <w:rPr>
@@ -2467,7 +2389,7 @@
           <w:rtl w:val="0"/>
           <w:lang w:val="en-US"/>
         </w:rPr>
-        <w:t>5.4) demonstrates a structural advantage of user-scoped rather than tool-scoped memory.</w:t>
+        <w:t>5.4).</w:t>
       </w:r>
     </w:p>
     <w:p>
@@ -2535,7 +2457,7 @@
           <w:rtl w:val="0"/>
           <w:lang w:val="en-US"/>
         </w:rPr>
-        <w:t>(McInnes et al. 2018) project high-dimensional embeddings for inspection; force-directed layouts</w:t>
+        <w:t>(McInnes et al. 2018) project embeddings for inspection, and force-directed layouts</w:t>
       </w:r>
       <w:r>
         <w:rPr>
@@ -2551,7 +2473,7 @@
           <w:rtl w:val="0"/>
           <w:lang w:val="en-US"/>
         </w:rPr>
-        <w:t>(Fruchterman and Reingold 1991) model attraction/repulsion in 2D. My star map (</w:t>
+        <w:t>(Fruchterman and Reingold 1991) model attraction and repulsion; the star map (</w:t>
       </w:r>
       <w:r>
         <w:rPr>
@@ -2567,7 +2489,7 @@
           <w:rtl w:val="0"/>
           <w:lang w:val="en-US"/>
         </w:rPr>
-        <w:t>6) extends force-directed layout to 3D and adds weak axis springs, so semantic clusters still form freely while time reads left to right and confidence bottom to top.</w:t>
+        <w:t>6) adds weak time and confidence springs to a 3D force-directed layout.</w:t>
       </w:r>
       <w:bookmarkEnd w:id="5"/>
     </w:p>
@@ -2930,36 +2852,95 @@
           <w:rtl w:val="0"/>
           <w:lang w:val="en-US"/>
         </w:rPr>
-        <w:t>tentative (median 21</w:t>
+        <w:t>tentative</w:t>
+      </w:r>
+      <w:r>
+        <w:rPr>
+          <w:rStyle w:val="无"/>
+          <w:rFonts w:ascii="Times New Roman" w:hAnsi="Times New Roman"/>
+          <w:rtl w:val="0"/>
+          <w:lang w:val="en-US"/>
+        </w:rPr>
+        <w:t xml:space="preserve"> (median 21</w:t>
       </w:r>
       <w:r>
         <w:rPr>
           <w:rStyle w:val="无"/>
           <w:rFonts w:ascii="Times New Roman" w:hAnsi="Times New Roman" w:hint="default"/>
+          <w:rtl w:val="0"/>
+          <w:lang w:val="en-US"/>
+        </w:rPr>
+        <w:t> </w:t>
+      </w:r>
+      <w:r>
+        <w:rPr>
+          <w:rStyle w:val="无"/>
+          <w:rFonts w:ascii="Times New Roman" w:hAnsi="Times New Roman"/>
+          <w:rtl w:val="0"/>
+          <w:lang w:val="en-US"/>
+        </w:rPr>
+        <w:t>ms, p99 684</w:t>
+      </w:r>
+      <w:r>
+        <w:rPr>
+          <w:rStyle w:val="无"/>
+          <w:rFonts w:ascii="Times New Roman" w:hAnsi="Times New Roman" w:hint="default"/>
+          <w:rtl w:val="0"/>
+          <w:lang w:val="en-US"/>
+        </w:rPr>
+        <w:t> </w:t>
+      </w:r>
+      <w:r>
+        <w:rPr>
+          <w:rStyle w:val="无"/>
+          <w:rFonts w:ascii="Times New Roman" w:hAnsi="Times New Roman"/>
+          <w:rtl w:val="0"/>
+          <w:lang w:val="en-US"/>
+        </w:rPr>
+        <w:t xml:space="preserve">ms over 100 adds on an x86-64 Mac). </w:t>
+      </w:r>
+      <w:r>
+        <w:rPr>
+          <w:rStyle w:val="无"/>
+          <w:rFonts w:ascii="Times New Roman" w:hAnsi="Times New Roman"/>
           <w:i w:val="1"/>
           <w:iCs w:val="1"/>
           <w:rtl w:val="0"/>
           <w:lang w:val="en-US"/>
         </w:rPr>
+        <w:t>Phase 2</w:t>
+      </w:r>
+      <w:r>
+        <w:rPr>
+          <w:rStyle w:val="无"/>
+          <w:rFonts w:ascii="Times New Roman" w:hAnsi="Times New Roman"/>
+          <w:rtl w:val="0"/>
+          <w:lang w:val="en-US"/>
+        </w:rPr>
+        <w:t xml:space="preserve"> runs in the background: an extractor (a small cloud LLM, or a deterministic fallback) classifies the thought, a confidence scorer updates its status, a supersession check retires contradicted predecessors, and the cold store (Markdown in an Obsidian vault) is updated for people to read and edit. Building the injected context adds a median of 21</w:t>
+      </w:r>
+      <w:r>
+        <w:rPr>
+          <w:rStyle w:val="无"/>
+          <w:rFonts w:ascii="Times New Roman" w:hAnsi="Times New Roman" w:hint="default"/>
+          <w:rtl w:val="0"/>
+          <w:lang w:val="en-US"/>
+        </w:rPr>
         <w:t> </w:t>
       </w:r>
       <w:r>
         <w:rPr>
           <w:rStyle w:val="无"/>
           <w:rFonts w:ascii="Times New Roman" w:hAnsi="Times New Roman"/>
-          <w:i w:val="1"/>
-          <w:iCs w:val="1"/>
-          <w:rtl w:val="0"/>
-          <w:lang w:val="en-US"/>
-        </w:rPr>
-        <w:t>ms, p99 684</w:t>
+          <w:rtl w:val="0"/>
+          <w:lang w:val="en-US"/>
+        </w:rPr>
+        <w:t>ms (p99 55</w:t>
       </w:r>
       <w:r>
         <w:rPr>
           <w:rStyle w:val="无"/>
           <w:rFonts w:ascii="Times New Roman" w:hAnsi="Times New Roman" w:hint="default"/>
-          <w:i w:val="1"/>
-          <w:iCs w:val="1"/>
           <w:rtl w:val="0"/>
           <w:lang w:val="en-US"/>
         </w:rPr>
@@ -2969,77 +2950,10 @@
         <w:rPr>
           <w:rStyle w:val="无"/>
           <w:rFonts w:ascii="Times New Roman" w:hAnsi="Times New Roman"/>
-          <w:i w:val="1"/>
-          <w:iCs w:val="1"/>
-          <w:rtl w:val="0"/>
-          <w:lang w:val="en-US"/>
-        </w:rPr>
-        <w:t>ms over 100 adds on an x86-64 Mac)</w:t>
-      </w:r>
-      <w:r>
-        <w:rPr>
-          <w:rStyle w:val="无"/>
-          <w:rFonts w:ascii="Times New Roman" w:hAnsi="Times New Roman"/>
-          <w:rtl w:val="0"/>
-          <w:lang w:val="en-US"/>
-        </w:rPr>
-        <w:t>. Phase 2 runs in the background, so the conversation never waits for it; building the injected context adds a median of 21</w:t>
-      </w:r>
-      <w:r>
-        <w:rPr>
-          <w:rStyle w:val="无"/>
-          <w:rFonts w:ascii="Times New Roman" w:hAnsi="Times New Roman" w:hint="default"/>
-          <w:rtl w:val="0"/>
-          <w:lang w:val="en-US"/>
-        </w:rPr>
-        <w:t> </w:t>
-      </w:r>
-      <w:r>
-        <w:rPr>
-          <w:rStyle w:val="无"/>
-          <w:rFonts w:ascii="Times New Roman" w:hAnsi="Times New Roman"/>
-          <w:rtl w:val="0"/>
-          <w:lang w:val="en-US"/>
-        </w:rPr>
-        <w:t>ms (p99 55</w:t>
-      </w:r>
-      <w:r>
-        <w:rPr>
-          <w:rStyle w:val="无"/>
-          <w:rFonts w:ascii="Times New Roman" w:hAnsi="Times New Roman" w:hint="default"/>
-          <w:rtl w:val="0"/>
-          <w:lang w:val="en-US"/>
-        </w:rPr>
-        <w:t> </w:t>
-      </w:r>
-      <w:r>
-        <w:rPr>
-          <w:rStyle w:val="无"/>
-          <w:rFonts w:ascii="Times New Roman" w:hAnsi="Times New Roman"/>
-          <w:rtl w:val="0"/>
-          <w:lang w:val="en-US"/>
-        </w:rPr>
-        <w:t xml:space="preserve">ms) per request. In </w:t>
-      </w:r>
-      <w:r>
-        <w:rPr>
-          <w:rStyle w:val="无"/>
-          <w:rFonts w:ascii="Times New Roman" w:hAnsi="Times New Roman"/>
-          <w:i w:val="1"/>
-          <w:iCs w:val="1"/>
-          <w:rtl w:val="0"/>
-          <w:lang w:val="en-US"/>
-        </w:rPr>
-        <w:t>Phase 2</w:t>
-      </w:r>
-      <w:r>
-        <w:rPr>
-          <w:rStyle w:val="无"/>
-          <w:rFonts w:ascii="Times New Roman" w:hAnsi="Times New Roman"/>
-          <w:rtl w:val="0"/>
-          <w:lang w:val="en-US"/>
-        </w:rPr>
-        <w:t>, an extractor (a small cloud LLM, or a deterministic fallback) classifies the thought; a confidence scorer updates its status; a supersession check retires contradicted predecessors; the cold store (Markdown + YAML frontmatter in an Obsidian vault) is updated for human readability and editability.</w:t>
+          <w:rtl w:val="0"/>
+          <w:lang w:val="en-US"/>
+        </w:rPr>
+        <w:t>ms) per request.</w:t>
       </w:r>
       <w:bookmarkEnd w:id="7"/>
     </w:p>
@@ -5256,7 +5170,97 @@
           <w:rtl w:val="0"/>
           <w:lang w:val="en-US"/>
         </w:rPr>
-        <w:t xml:space="preserve">), the old stance should retire. Embedding similarity is the wrong signal here: contradictory stances mention different entities and therefore have </w:t>
+        <w:t>), the old stance should retire, but embedding similarity is the wrong signal: contradictory stances mention different entities. Noesis requires jointly (1) a replacement verb (</w:t>
+      </w:r>
+      <w:r>
+        <w:rPr>
+          <w:rStyle w:val="无"/>
+          <w:rFonts w:ascii="Times New Roman" w:hAnsi="Times New Roman" w:hint="default"/>
+          <w:rtl w:val="0"/>
+          <w:lang w:val="en-US"/>
+        </w:rPr>
+        <w:t>“</w:t>
+      </w:r>
+      <w:r>
+        <w:rPr>
+          <w:rStyle w:val="无"/>
+          <w:rFonts w:ascii="Times New Roman" w:hAnsi="Times New Roman"/>
+          <w:rtl w:val="0"/>
+          <w:lang w:val="en-US"/>
+        </w:rPr>
+        <w:t>switched to</w:t>
+      </w:r>
+      <w:r>
+        <w:rPr>
+          <w:rStyle w:val="无"/>
+          <w:rFonts w:ascii="Times New Roman" w:hAnsi="Times New Roman" w:hint="default"/>
+          <w:rtl w:val="0"/>
+          <w:lang w:val="en-US"/>
+        </w:rPr>
+        <w:t>”</w:t>
+      </w:r>
+      <w:r>
+        <w:rPr>
+          <w:rStyle w:val="无"/>
+          <w:rFonts w:ascii="Times New Roman" w:hAnsi="Times New Roman"/>
+          <w:rtl w:val="0"/>
+          <w:lang w:val="en-US"/>
+        </w:rPr>
+        <w:t xml:space="preserve">, </w:t>
+      </w:r>
+      <w:r>
+        <w:rPr>
+          <w:rStyle w:val="无"/>
+          <w:rFonts w:ascii="Times New Roman" w:hAnsi="Times New Roman" w:hint="default"/>
+          <w:rtl w:val="0"/>
+          <w:lang w:val="en-US"/>
+        </w:rPr>
+        <w:t>“</w:t>
+      </w:r>
+      <w:r>
+        <w:rPr>
+          <w:rStyle w:val="无"/>
+          <w:rFonts w:ascii="Times New Roman" w:hAnsi="Times New Roman"/>
+          <w:rtl w:val="0"/>
+          <w:lang w:val="en-US"/>
+        </w:rPr>
+        <w:t>migrated to</w:t>
+      </w:r>
+      <w:r>
+        <w:rPr>
+          <w:rStyle w:val="无"/>
+          <w:rFonts w:ascii="Times New Roman" w:hAnsi="Times New Roman" w:hint="default"/>
+          <w:rtl w:val="0"/>
+          <w:lang w:val="en-US"/>
+        </w:rPr>
+        <w:t>”</w:t>
+      </w:r>
+      <w:r>
+        <w:rPr>
+          <w:rStyle w:val="无"/>
+          <w:rFonts w:ascii="Times New Roman" w:hAnsi="Times New Roman"/>
+          <w:rtl w:val="0"/>
+          <w:lang w:val="en-US"/>
+        </w:rPr>
+        <w:t xml:space="preserve">, </w:t>
+      </w:r>
+      <w:r>
+        <w:rPr>
+          <w:rStyle w:val="无"/>
+          <w:rFonts w:ascii="Times New Roman" w:hAnsi="Times New Roman" w:hint="default"/>
+          <w:rtl w:val="0"/>
+          <w:lang w:val="en-US"/>
+        </w:rPr>
+        <w:t>…</w:t>
+      </w:r>
+      <w:r>
+        <w:rPr>
+          <w:rStyle w:val="无"/>
+          <w:rFonts w:ascii="Times New Roman" w:hAnsi="Times New Roman"/>
+          <w:rtl w:val="0"/>
+          <w:lang w:val="en-US"/>
+        </w:rPr>
+        <w:t xml:space="preserve">, EN+ZH), (2) the same domain via a keyword map, (3) stance-like type, and (4) injectable status of the new thought. Matched predecessors are marked </w:t>
       </w:r>
       <w:r>
         <w:rPr>
@@ -5267,173 +5271,16 @@
           <w:rtl w:val="0"/>
           <w:lang w:val="en-US"/>
         </w:rPr>
-        <w:t>low</w:t>
-      </w:r>
-      <w:r>
-        <w:rPr>
-          <w:rStyle w:val="无"/>
-          <w:rFonts w:ascii="Times New Roman" w:hAnsi="Times New Roman"/>
-          <w:rtl w:val="0"/>
-          <w:lang w:val="en-US"/>
-        </w:rPr>
-        <w:t xml:space="preserve"> similarity. Noesis detects mind-changes by requiring jointly (1) a replacement verb (</w:t>
-      </w:r>
-      <w:r>
-        <w:rPr>
-          <w:rStyle w:val="无"/>
-          <w:rFonts w:ascii="Times New Roman" w:hAnsi="Times New Roman" w:hint="default"/>
-          <w:rtl w:val="0"/>
-          <w:lang w:val="en-US"/>
-        </w:rPr>
-        <w:t>“</w:t>
-      </w:r>
-      <w:r>
-        <w:rPr>
-          <w:rStyle w:val="无"/>
-          <w:rFonts w:ascii="Times New Roman" w:hAnsi="Times New Roman"/>
-          <w:rtl w:val="0"/>
-          <w:lang w:val="en-US"/>
-        </w:rPr>
-        <w:t>switched to</w:t>
-      </w:r>
-      <w:r>
-        <w:rPr>
-          <w:rStyle w:val="无"/>
-          <w:rFonts w:ascii="Times New Roman" w:hAnsi="Times New Roman" w:hint="default"/>
-          <w:rtl w:val="0"/>
-          <w:lang w:val="en-US"/>
-        </w:rPr>
-        <w:t>”</w:t>
-      </w:r>
-      <w:r>
-        <w:rPr>
-          <w:rStyle w:val="无"/>
-          <w:rFonts w:ascii="Times New Roman" w:hAnsi="Times New Roman"/>
-          <w:rtl w:val="0"/>
-          <w:lang w:val="en-US"/>
-        </w:rPr>
-        <w:t xml:space="preserve">, </w:t>
-      </w:r>
-      <w:r>
-        <w:rPr>
-          <w:rStyle w:val="无"/>
-          <w:rFonts w:ascii="Times New Roman" w:hAnsi="Times New Roman" w:hint="default"/>
-          <w:rtl w:val="0"/>
-          <w:lang w:val="en-US"/>
-        </w:rPr>
-        <w:t>“</w:t>
-      </w:r>
-      <w:r>
-        <w:rPr>
-          <w:rStyle w:val="无"/>
-          <w:rFonts w:ascii="Times New Roman" w:hAnsi="Times New Roman"/>
-          <w:rtl w:val="0"/>
-          <w:lang w:val="en-US"/>
-        </w:rPr>
-        <w:t>migrated to</w:t>
-      </w:r>
-      <w:r>
-        <w:rPr>
-          <w:rStyle w:val="无"/>
-          <w:rFonts w:ascii="Times New Roman" w:hAnsi="Times New Roman" w:hint="default"/>
-          <w:rtl w:val="0"/>
-          <w:lang w:val="en-US"/>
-        </w:rPr>
-        <w:t>”</w:t>
-      </w:r>
-      <w:r>
-        <w:rPr>
-          <w:rStyle w:val="无"/>
-          <w:rFonts w:ascii="Times New Roman" w:hAnsi="Times New Roman"/>
-          <w:rtl w:val="0"/>
-          <w:lang w:val="en-US"/>
-        </w:rPr>
-        <w:t xml:space="preserve">, </w:t>
-      </w:r>
-      <w:r>
-        <w:rPr>
-          <w:rStyle w:val="无"/>
-          <w:rFonts w:ascii="Times New Roman" w:hAnsi="Times New Roman" w:hint="default"/>
-          <w:rtl w:val="0"/>
-          <w:lang w:val="en-US"/>
-        </w:rPr>
-        <w:t>…</w:t>
-      </w:r>
-      <w:r>
-        <w:rPr>
-          <w:rStyle w:val="无"/>
-          <w:rFonts w:ascii="Times New Roman" w:hAnsi="Times New Roman"/>
-          <w:rtl w:val="0"/>
-          <w:lang w:val="en-US"/>
-        </w:rPr>
-        <w:t xml:space="preserve">, EN+ZH), (2) the same domain via a keyword map (both stances are about </w:t>
-      </w:r>
-      <w:r>
-        <w:rPr>
-          <w:rStyle w:val="无"/>
-          <w:rFonts w:ascii="Times New Roman" w:hAnsi="Times New Roman"/>
-          <w:i w:val="1"/>
-          <w:iCs w:val="1"/>
-          <w:rtl w:val="0"/>
-          <w:lang w:val="en-US"/>
-        </w:rPr>
-        <w:t>databases</w:t>
-      </w:r>
-      <w:r>
-        <w:rPr>
-          <w:rStyle w:val="无"/>
-          <w:rFonts w:ascii="Times New Roman" w:hAnsi="Times New Roman"/>
-          <w:rtl w:val="0"/>
-          <w:lang w:val="en-US"/>
-        </w:rPr>
-        <w:t xml:space="preserve">), (3) stance-like type, and (4) injectable status of the new thought. Matched predecessors are marked </w:t>
-      </w:r>
-      <w:r>
-        <w:rPr>
-          <w:rStyle w:val="无"/>
-          <w:rFonts w:ascii="Times New Roman" w:hAnsi="Times New Roman"/>
-          <w:i w:val="1"/>
-          <w:iCs w:val="1"/>
-          <w:rtl w:val="0"/>
-          <w:lang w:val="en-US"/>
-        </w:rPr>
         <w:t>superseded</w:t>
       </w:r>
       <w:r>
         <w:rPr>
           <w:rStyle w:val="无"/>
-          <w:rFonts w:ascii="Times New Roman" w:hAnsi="Times New Roman" w:hint="default"/>
-          <w:rtl w:val="0"/>
-          <w:lang w:val="en-US"/>
-        </w:rPr>
-        <w:t>—</w:t>
-      </w:r>
-      <w:r>
-        <w:rPr>
-          <w:rStyle w:val="无"/>
-          <w:rFonts w:ascii="Times New Roman" w:hAnsi="Times New Roman"/>
-          <w:rtl w:val="0"/>
-          <w:lang w:val="en-US"/>
-        </w:rPr>
-        <w:t>excluded by every retrieval path</w:t>
-      </w:r>
-      <w:r>
-        <w:rPr>
-          <w:rStyle w:val="无"/>
-          <w:rFonts w:ascii="Times New Roman" w:hAnsi="Times New Roman" w:hint="default"/>
-          <w:rtl w:val="0"/>
-          <w:lang w:val="en-US"/>
-        </w:rPr>
-        <w:t>—</w:t>
-      </w:r>
-      <w:r>
-        <w:rPr>
-          <w:rStyle w:val="无"/>
-          <w:rFonts w:ascii="Times New Roman" w:hAnsi="Times New Roman"/>
-          <w:rtl w:val="0"/>
-          <w:lang w:val="en-US"/>
-        </w:rPr>
-        <w:t xml:space="preserve">and linked via </w:t>
+          <w:rFonts w:ascii="Times New Roman" w:hAnsi="Times New Roman"/>
+          <w:rtl w:val="0"/>
+          <w:lang w:val="en-US"/>
+        </w:rPr>
+        <w:t xml:space="preserve">, excluded by every retrieval path, and linked via </w:t>
       </w:r>
       <w:r>
         <w:rPr>
@@ -5453,7 +5300,7 @@
           <w:rtl w:val="0"/>
           <w:lang w:val="en-US"/>
         </w:rPr>
-        <w:t>. In my evaluation (the same 30 scenarios, run once before and once after the fix) this reduced stale-stance leakage from 93% to 7% (Table</w:t>
+        <w:t>. On the same 30 scenarios, run before and after the fix, this reduced stale-stance leakage from 93% to 7% (Table</w:t>
       </w:r>
       <w:r>
         <w:rPr>
@@ -5466,41 +5313,12 @@
       </w:r>
       <w:r>
         <w:rPr>
-          <w:rStyle w:val="Hyperlink.2"/>
-        </w:rPr>
-        <w:fldChar w:fldCharType="begin" w:fldLock="0"/>
-      </w:r>
-      <w:r>
-        <w:rPr>
-          <w:rStyle w:val="Hyperlink.2"/>
-        </w:rPr>
-        <w:instrText xml:space="preserve"> HYPERLINK \l "tabsupersession" </w:instrText>
-      </w:r>
-      <w:r>
-        <w:rPr>
-          <w:rStyle w:val="Hyperlink.2"/>
-        </w:rPr>
-        <w:fldChar w:fldCharType="separate" w:fldLock="0"/>
-      </w:r>
-      <w:r>
-        <w:rPr>
-          <w:rStyle w:val="Hyperlink.2"/>
-          <w:rtl w:val="0"/>
-        </w:rPr>
-        <w:t>2</w:t>
-      </w:r>
-      <w:r>
-        <w:rPr/>
-        <w:fldChar w:fldCharType="end" w:fldLock="0"/>
-      </w:r>
-      <w:r>
-        <w:rPr>
-          <w:rStyle w:val="无"/>
-          <w:rFonts w:ascii="Times New Roman" w:hAnsi="Times New Roman"/>
-          <w:rtl w:val="0"/>
-          <w:lang w:val="en-US"/>
-        </w:rPr>
-        <w:t>).</w:t>
+          <w:rStyle w:val="无"/>
+          <w:rFonts w:ascii="Times New Roman" w:hAnsi="Times New Roman"/>
+          <w:rtl w:val="0"/>
+          <w:lang w:val="en-US"/>
+        </w:rPr>
+        <w:t>2).</w:t>
       </w:r>
       <w:bookmarkEnd w:id="10"/>
     </w:p>
@@ -7079,7 +6897,7 @@
           <w:rtl w:val="0"/>
           <w:lang w:val="en-US"/>
         </w:rPr>
-        <w:t>Gemini Flash-Lite (cloud; gemini-flash-lite-latest, queried 30 June 2026), gemma3:4b and qwen2.5:3b (local via Ollama), spanning capability tiers. Answers used a 150-token limit and default sampling (no temperature set), one per question and condition; the Gemini alias and Ollama tags are not immutable, and local model digests were not recorded.</w:t>
+        <w:t>Gemini Flash-Lite (cloud; gemini-flash-lite-latest, queried 30 June 2026), gemma3:4b and qwen2.5:3b (local via Ollama). Answers used a 150-token limit and default sampling, one per question and condition; the Gemini alias and Ollama tags are mutable, and local model digests were not recorded.</w:t>
       </w:r>
       <w:bookmarkEnd w:id="15"/>
       <w:r>
@@ -7139,7 +6957,7 @@
           <w:rtl w:val="0"/>
           <w:lang w:val="en-US"/>
         </w:rPr>
-        <w:t>30 synthetic English user profiles, each with 5 build statements (an identity statement plus preferences, positions, and decisions) followed by 5 test questions whose expected keyword is known from the build statements. Each build statement is stated once and firmly (</w:t>
+        <w:t>Thirty synthetic English profiles each make 5 build statements (identity, preferences, positions, decisions), each stated once and firmly (</w:t>
       </w:r>
       <w:r>
         <w:rPr>
@@ -7175,7 +6993,7 @@
           <w:rtl w:val="0"/>
           <w:lang w:val="en-US"/>
         </w:rPr>
-        <w:t xml:space="preserve">, </w:t>
+        <w:t>), which is enough to reach provisional (</w:t>
       </w:r>
       <w:r>
         <w:rPr>
@@ -7184,42 +7002,6 @@
           <w:rtl w:val="0"/>
           <w:lang w:val="en-US"/>
         </w:rPr>
-        <w:t>“</w:t>
-      </w:r>
-      <w:r>
-        <w:rPr>
-          <w:rStyle w:val="无"/>
-          <w:rFonts w:ascii="Times New Roman" w:hAnsi="Times New Roman"/>
-          <w:rtl w:val="0"/>
-          <w:lang w:val="en-US"/>
-        </w:rPr>
-        <w:t>I decided</w:t>
-      </w:r>
-      <w:r>
-        <w:rPr>
-          <w:rStyle w:val="无"/>
-          <w:rFonts w:ascii="Times New Roman" w:hAnsi="Times New Roman" w:hint="default"/>
-          <w:rtl w:val="0"/>
-          <w:lang w:val="en-US"/>
-        </w:rPr>
-        <w:t>…”</w:t>
-      </w:r>
-      <w:r>
-        <w:rPr>
-          <w:rStyle w:val="无"/>
-          <w:rFonts w:ascii="Times New Roman" w:hAnsi="Times New Roman"/>
-          <w:rtl w:val="0"/>
-          <w:lang w:val="en-US"/>
-        </w:rPr>
-        <w:t>), which is enough to reach provisional (</w:t>
-      </w:r>
-      <w:r>
-        <w:rPr>
-          <w:rStyle w:val="无"/>
-          <w:rFonts w:ascii="Times New Roman" w:hAnsi="Times New Roman" w:hint="default"/>
-          <w:rtl w:val="0"/>
-          <w:lang w:val="en-US"/>
-        </w:rPr>
         <w:t>§</w:t>
       </w:r>
       <w:r>
@@ -7229,7 +7011,7 @@
           <w:rtl w:val="0"/>
           <w:lang w:val="en-US"/>
         </w:rPr>
-        <w:t xml:space="preserve">3.2). For each question the model answers twice: </w:t>
+        <w:t xml:space="preserve">3.2), followed by 5 test questions with a known expected keyword. Each question is answered </w:t>
       </w:r>
       <w:r>
         <w:rPr>
@@ -7249,7 +7031,7 @@
           <w:rtl w:val="0"/>
           <w:lang w:val="en-US"/>
         </w:rPr>
-        <w:t xml:space="preserve"> (via the Noesis proxy, which injects context) and </w:t>
+        <w:t xml:space="preserve"> (through the Noesis proxy) and </w:t>
       </w:r>
       <w:r>
         <w:rPr>
@@ -7260,16 +7042,16 @@
           <w:rtl w:val="0"/>
           <w:lang w:val="en-US"/>
         </w:rPr>
-        <w:t>without memory</w:t>
-      </w:r>
-      <w:r>
-        <w:rPr>
-          <w:rStyle w:val="无"/>
-          <w:rFonts w:ascii="Times New Roman" w:hAnsi="Times New Roman"/>
-          <w:rtl w:val="0"/>
-          <w:lang w:val="en-US"/>
-        </w:rPr>
-        <w:t xml:space="preserve"> (direct to the provider). All models are evaluated on the identical first </w:t>
+        <w:t>without</w:t>
+      </w:r>
+      <w:r>
+        <w:rPr>
+          <w:rStyle w:val="无"/>
+          <w:rFonts w:ascii="Times New Roman" w:hAnsi="Times New Roman"/>
+          <w:rtl w:val="0"/>
+          <w:lang w:val="en-US"/>
+        </w:rPr>
+        <w:t xml:space="preserve"> (direct to the provider); all models get the identical first </w:t>
       </w:r>
       <m:oMath>
         <m:r>
@@ -7399,7 +7181,25 @@
           <w:rtl w:val="0"/>
           <w:lang w:val="en-US"/>
         </w:rPr>
-        <w:t>Ablation, scale, and cross-tool experiments run against the real pipeline without LLM calls, measuring Recall@5, MRR, the recall and size of the full injected context, tentative leakage, and injected tokens. They call the Python API directly, and the cross-tool experiment simulates tools by labeling each statement</w:t>
+        <w:t>Ablation, scale, and cross-tool experiments call the real pipeline</w:t>
+      </w:r>
+      <w:r>
+        <w:rPr>
+          <w:rStyle w:val="无"/>
+          <w:rFonts w:ascii="Times New Roman" w:hAnsi="Times New Roman" w:hint="default"/>
+          <w:rtl w:val="0"/>
+          <w:lang w:val="en-US"/>
+        </w:rPr>
+        <w:t>’</w:t>
+      </w:r>
+      <w:r>
+        <w:rPr>
+          <w:rStyle w:val="无"/>
+          <w:rFonts w:ascii="Times New Roman" w:hAnsi="Times New Roman"/>
+          <w:rtl w:val="0"/>
+          <w:lang w:val="en-US"/>
+        </w:rPr>
+        <w:t>s Python API without LLM calls, measuring Recall@5, MRR, the recall and size of the injected context, tentative leakage, and injected tokens; the cross-tool experiment simulates tools by labeling each statement</w:t>
       </w:r>
       <w:r>
         <w:rPr>
@@ -7453,7 +7253,7 @@
           <w:rtl w:val="0"/>
           <w:lang w:val="en-US"/>
         </w:rPr>
-        <w:t>Only the proxy, which injects context and stores each exchange automatically, is evaluated end to end, in the A/B and end-to-end runs (</w:t>
+        <w:t>Only the proxy, which injects context and stores each exchange automatically, is evaluated end to end (</w:t>
       </w:r>
       <w:r>
         <w:rPr>
@@ -7485,7 +7285,7 @@
           <w:rtl w:val="0"/>
           <w:lang w:val="en-US"/>
         </w:rPr>
-        <w:t>(Model Context Protocol 2026): nothing is stored or injected unless the model calls remember or recall, so exposing them does not ensure timely use, and the MCP server has unit tests only. The browser extension only captures turns from chat web apps and is not evaluated.</w:t>
+        <w:t>(Model Context Protocol 2026): nothing is stored or injected unless the model calls remember or recall, so timely use is not ensured, and the MCP server has unit tests only. The browser extension only captures turns and is not evaluated.</w:t>
       </w:r>
       <w:bookmarkEnd w:id="17"/>
     </w:p>
@@ -7539,7 +7339,7 @@
           <w:rtl w:val="0"/>
           <w:lang w:val="en-US"/>
         </w:rPr>
-        <w:t>Every experimental number in this paper is recomputed from the raw result files by a released script (experiments/verify_paper.py), which also reads the lifecycle constants from the source. The ablation and scale experiments were re-run in October 2026 with the June software versions (Python 3.12.11, torch 2.2.2, transformers 4.44.2, sentence-transformers 3.0.1, all-MiniLM-L6-v2); they reproduced the June numbers exactly before the corrected leak metric and the top-5 baseline were added. The ablation was later corrected further (</w:t>
+        <w:t>A released script (experiments/verify_paper.py) recomputes every experimental number in this paper from the raw result files and reads the lifecycle constants from the source. The ablation and scale experiments were re-run in October 2026 with the June software (Python 3.12.11, torch 2.2.2, transformers 4.44.2, sentence-transformers 3.0.1, all-MiniLM-L6-v2) and reproduced the June numbers exactly before the metric corrections (</w:t>
       </w:r>
       <w:r>
         <w:rPr>
@@ -7557,7 +7357,7 @@
           <w:rtl w:val="0"/>
           <w:lang w:val="en-US"/>
         </w:rPr>
-        <w:t>9). verify_paper.py is an arithmetic audit: it checks that each reported number follows from the saved per-question records, not that each answer was scored correctly. Those records are incomplete. The local-model A/B runs kept the first 150 characters of each answer and the end-to-end run the first 100, although hits were scored on the full answer; the Gemini A/B run kept no answer text, because its records were recovered from the run</w:t>
+        <w:t>9) and the top-5 baseline were added. The script audits arithmetic, not answer scoring, and the saved records are incomplete: the local-model A/B runs kept the first 150 characters of each answer and the end-to-end run the first 100 (hits were scored on full answers); the Gemini A/B records were recovered from the run</w:t>
       </w:r>
       <w:r>
         <w:rPr>
@@ -7575,7 +7375,7 @@
           <w:rtl w:val="0"/>
           <w:lang w:val="en-US"/>
         </w:rPr>
-        <w:t>s console log, which printed only hit marks; and no run kept the full prompt or the injected context. The released files therefore support checking the arithmetic, not re-scoring the answers. The code, data, and paper sources used here are tagged v1.0-preprint in the repository.</w:t>
+        <w:t>s console log, which printed only hit marks; and no run kept prompts or injected contexts. Answers therefore cannot be re-scored from the released files. Code, data, and paper sources are tagged v1.0-preprint.</w:t>
       </w:r>
       <w:bookmarkEnd w:id="18"/>
     </w:p>
@@ -8997,41 +8797,12 @@
       </w:r>
       <w:r>
         <w:rPr>
-          <w:rStyle w:val="Hyperlink.2"/>
-        </w:rPr>
-        <w:fldChar w:fldCharType="begin" w:fldLock="0"/>
-      </w:r>
-      <w:r>
-        <w:rPr>
-          <w:rStyle w:val="Hyperlink.2"/>
-        </w:rPr>
-        <w:instrText xml:space="preserve"> HYPERLINK \l "tabab_results" </w:instrText>
-      </w:r>
-      <w:r>
-        <w:rPr>
-          <w:rStyle w:val="Hyperlink.2"/>
-        </w:rPr>
-        <w:fldChar w:fldCharType="separate" w:fldLock="0"/>
-      </w:r>
-      <w:r>
-        <w:rPr>
-          <w:rStyle w:val="Hyperlink.2"/>
-          <w:rtl w:val="0"/>
-        </w:rPr>
-        <w:t>3</w:t>
-      </w:r>
-      <w:r>
-        <w:rPr/>
-        <w:fldChar w:fldCharType="end" w:fldLock="0"/>
-      </w:r>
-      <w:r>
-        <w:rPr>
-          <w:rStyle w:val="无"/>
-          <w:rFonts w:ascii="Times New Roman" w:hAnsi="Times New Roman"/>
-          <w:rtl w:val="0"/>
-          <w:lang w:val="en-US"/>
-        </w:rPr>
-        <w:t xml:space="preserve"> and Figure</w:t>
+          <w:rStyle w:val="无"/>
+          <w:rFonts w:ascii="Times New Roman" w:hAnsi="Times New Roman"/>
+          <w:rtl w:val="0"/>
+          <w:lang w:val="en-US"/>
+        </w:rPr>
+        <w:t>3 and Figure</w:t>
       </w:r>
       <w:r>
         <w:rPr>
@@ -9044,41 +8815,12 @@
       </w:r>
       <w:r>
         <w:rPr>
-          <w:rStyle w:val="Hyperlink.2"/>
-        </w:rPr>
-        <w:fldChar w:fldCharType="begin" w:fldLock="0"/>
-      </w:r>
-      <w:r>
-        <w:rPr>
-          <w:rStyle w:val="Hyperlink.2"/>
-        </w:rPr>
-        <w:instrText xml:space="preserve"> HYPERLINK \l "figab" </w:instrText>
-      </w:r>
-      <w:r>
-        <w:rPr>
-          <w:rStyle w:val="Hyperlink.2"/>
-        </w:rPr>
-        <w:fldChar w:fldCharType="separate" w:fldLock="0"/>
-      </w:r>
-      <w:r>
-        <w:rPr>
-          <w:rStyle w:val="Hyperlink.2"/>
-          <w:rtl w:val="0"/>
-        </w:rPr>
-        <w:t>3</w:t>
-      </w:r>
-      <w:r>
-        <w:rPr/>
-        <w:fldChar w:fldCharType="end" w:fldLock="0"/>
-      </w:r>
-      <w:r>
-        <w:rPr>
-          <w:rStyle w:val="无"/>
-          <w:rFonts w:ascii="Times New Roman" w:hAnsi="Times New Roman"/>
-          <w:rtl w:val="0"/>
-          <w:lang w:val="en-US"/>
-        </w:rPr>
-        <w:t xml:space="preserve"> show the headline result. Three findings stand out. First, </w:t>
+          <w:rStyle w:val="无"/>
+          <w:rFonts w:ascii="Times New Roman" w:hAnsi="Times New Roman"/>
+          <w:rtl w:val="0"/>
+          <w:lang w:val="en-US"/>
+        </w:rPr>
+        <w:t xml:space="preserve">3 show the headline result. First, </w:t>
       </w:r>
       <w:r>
         <w:rPr>
@@ -9118,7 +8860,25 @@
           <w:rtl w:val="0"/>
           <w:lang w:val="en-US"/>
         </w:rPr>
-        <w:t xml:space="preserve"> in only 10 of 330 paired answers (3.0%). Because the five questions of a profile share one memory store, I also resampled whole profiles (20,000 draws over the 22 profiles): the 95% intervals for the gains are +34.5 to +51.8 points for Gemini Flash-Lite, +37.3 to +59.1 for gemma3:4b, and +13.6 to +36.4 for qwen2.5:3b, all above zero. Second, </w:t>
+        <w:t xml:space="preserve"> in only 10 of 330 paired answers (3.0%). Because a profile</w:t>
+      </w:r>
+      <w:r>
+        <w:rPr>
+          <w:rStyle w:val="无"/>
+          <w:rFonts w:ascii="Times New Roman" w:hAnsi="Times New Roman" w:hint="default"/>
+          <w:rtl w:val="0"/>
+          <w:lang w:val="en-US"/>
+        </w:rPr>
+        <w:t>’</w:t>
+      </w:r>
+      <w:r>
+        <w:rPr>
+          <w:rStyle w:val="无"/>
+          <w:rFonts w:ascii="Times New Roman" w:hAnsi="Times New Roman"/>
+          <w:rtl w:val="0"/>
+          <w:lang w:val="en-US"/>
+        </w:rPr>
+        <w:t xml:space="preserve">s five questions share one memory store, I also resampled whole profiles (20,000 draws over 22 profiles): the 95% intervals for the gains are +34.5 to +51.8 points (Gemini Flash-Lite), +37.3 to +59.1 (gemma3:4b), and +13.6 to +36.4 (qwen2.5:3b), all above zero. Second, </w:t>
       </w:r>
       <w:r>
         <w:rPr>
@@ -9138,7 +8898,7 @@
           <w:rtl w:val="0"/>
           <w:lang w:val="en-US"/>
         </w:rPr>
-        <w:t>: with injection, gemma3:4b (4B parameters, local) reaches 82.7%, nearly matching Gemini Flash-Lite</w:t>
+        <w:t>: with injection, gemma3:4b reaches 82.7%, close to Gemini Flash-Lite</w:t>
       </w:r>
       <w:r>
         <w:rPr>
@@ -9156,25 +8916,7 @@
           <w:rtl w:val="0"/>
           <w:lang w:val="en-US"/>
         </w:rPr>
-        <w:t>s 85.5%, while its no-memory baseline (34.5%) trails Gemini</w:t>
-      </w:r>
-      <w:r>
-        <w:rPr>
-          <w:rStyle w:val="无"/>
-          <w:rFonts w:ascii="Times New Roman" w:hAnsi="Times New Roman" w:hint="default"/>
-          <w:rtl w:val="0"/>
-          <w:lang w:val="en-US"/>
-        </w:rPr>
-        <w:t>’</w:t>
-      </w:r>
-      <w:r>
-        <w:rPr>
-          <w:rStyle w:val="无"/>
-          <w:rFonts w:ascii="Times New Roman" w:hAnsi="Times New Roman"/>
-          <w:rtl w:val="0"/>
-          <w:lang w:val="en-US"/>
-        </w:rPr>
-        <w:t xml:space="preserve">s 41.8%. Third, </w:t>
+        <w:t xml:space="preserve">s 85.5%, from a lower baseline (34.5% vs. 41.8%). Third, </w:t>
       </w:r>
       <w:r>
         <w:rPr>
@@ -9194,7 +8936,7 @@
           <w:rtl w:val="0"/>
           <w:lang w:val="en-US"/>
         </w:rPr>
-        <w:t>: qwen2.5:3b goes through the same retrieval pipeline but reaches only 62.7%. A model-capability ceiling is one possible reason, but the saved runs do not record the injected context, so it remains a hypothesis.</w:t>
+        <w:t>: qwen2.5:3b reaches only 62.7%; a model-capability ceiling is one possible reason, but the saved runs do not record the injected context, so it remains a hypothesis.</w:t>
       </w:r>
     </w:p>
     <w:p>
@@ -9212,7 +8954,7 @@
           <w:rtl w:val="0"/>
           <w:lang w:val="en-US"/>
         </w:rPr>
-        <w:t>The hit rate alone does not separate retrieval strategies at this scale. In a separate end-to-end run on 50 questions (10 profiles, Gemini Flash-Lite), Noesis, injecting every stored memory, and injecting the five most recent memories scored 41, 40, and 41 of 50, against 22 of 50 with no memory. With only 3</w:t>
+        <w:t>The hit rate alone does not separate retrieval strategies at this scale. In a separate end-to-end run (50 questions, 10 profiles, Gemini Flash-Lite), Noesis, injecting every stored memory, and injecting the five most recent scored 41, 40, and 41 of 50, against 22 with no memory; with only 3</w:t>
       </w:r>
       <w:r>
         <w:rPr>
@@ -9230,43 +8972,7 @@
           <w:rtl w:val="0"/>
           <w:lang w:val="en-US"/>
         </w:rPr>
-        <w:t>9 stored memories per profile in that run, all three strategies inject nearly the same context; they diverge on filtering and cost as the store grows (</w:t>
-      </w:r>
-      <w:r>
-        <w:rPr>
-          <w:rStyle w:val="无"/>
-          <w:rFonts w:ascii="Times New Roman" w:hAnsi="Times New Roman" w:hint="default"/>
-          <w:rtl w:val="0"/>
-          <w:lang w:val="en-US"/>
-        </w:rPr>
-        <w:t>§</w:t>
-      </w:r>
-      <w:r>
-        <w:rPr>
-          <w:rStyle w:val="无"/>
-          <w:rFonts w:ascii="Times New Roman" w:hAnsi="Times New Roman"/>
-          <w:rtl w:val="0"/>
-          <w:lang w:val="en-US"/>
-        </w:rPr>
-        <w:t>5.2</w:t>
-      </w:r>
-      <w:r>
-        <w:rPr>
-          <w:rStyle w:val="无"/>
-          <w:rFonts w:ascii="Times New Roman" w:hAnsi="Times New Roman" w:hint="default"/>
-          <w:rtl w:val="0"/>
-          <w:lang w:val="en-US"/>
-        </w:rPr>
-        <w:t>–§</w:t>
-      </w:r>
-      <w:r>
-        <w:rPr>
-          <w:rStyle w:val="无"/>
-          <w:rFonts w:ascii="Times New Roman" w:hAnsi="Times New Roman"/>
-          <w:rtl w:val="0"/>
-          <w:lang w:val="en-US"/>
-        </w:rPr>
-        <w:t>5.3). The A/B result therefore shows that personal context helps on these tasks, not that the lifecycle beats simpler ways of supplying the same memories.</w:t>
+        <w:t>9 memories per profile, all three inject nearly the same context. The A/B result therefore shows that personal context helps on these tasks, not that the lifecycle beats simpler ways of supplying the same memories.</w:t>
       </w:r>
     </w:p>
     <w:p>
@@ -9332,7 +9038,7 @@
           <w:rtl w:val="0"/>
           <w:lang w:val="en-US"/>
         </w:rPr>
-        <w:t xml:space="preserve"> Ablation and baselines (50 queries over 28 memories, 5 of them tentative; retrieval-layer, 2,000-token budget). A retrieved memory counts only if it is the ground-truth memory itself. Recall@5 and MRR use the first five memories in injection order, and a query that returns fewer than five memories is scored on what it returns; context recall, items, and leak cover everything the configuration injects, and leak counts tentative memories among those slots.</w:t>
+        <w:t xml:space="preserve"> Ablation and baselines (50 queries over 28 memories, 5 tentative; retrieval-layer, 2,000-token budget). A retrieved memory counts only if it is the ground-truth memory. Recall@5 and MRR use the first five memories in injection order (or all, if fewer are returned); context recall, items, and leak cover everything injected, and leak counts tentative memories among those slots.</w:t>
       </w:r>
     </w:p>
     <w:tbl>
@@ -13250,7 +12956,25 @@
           <w:rtl w:val="0"/>
           <w:lang w:val="en-US"/>
         </w:rPr>
-        <w:t>Each Noesis variant runs the real context builder with exactly one component switched off, so signal order, deduplication, and the token budget stay the same; the baselines draw from every stored memory, tentative ones included. Status and confidence are assigned when the test store is built, so this suite tests whether retrieval respects those labels, not whether the lifecycle derives them from conversation. With 28 memories the semantic channel is dense retrieval alone (BM25 fusion starts at 300 memories). Stale-memory leakage is measured only by the supersession test (Table 2).</w:t>
+        <w:t>Each Noesis variant runs the real context builder with one component switched off; the baselines draw from every stored memory, tentative ones included. Status and confidence are assigned when the test store is built, so the suite tests whether retrieval respects those labels, not how the lifecycle derives them. At 28 memories the semantic channel is dense retrieval alone, and stale-memory leakage is measured only by the supersession test (Table</w:t>
+      </w:r>
+      <w:r>
+        <w:rPr>
+          <w:rStyle w:val="无"/>
+          <w:rFonts w:ascii="Times New Roman" w:hAnsi="Times New Roman" w:hint="default"/>
+          <w:rtl w:val="0"/>
+          <w:lang w:val="en-US"/>
+        </w:rPr>
+        <w:t> </w:t>
+      </w:r>
+      <w:r>
+        <w:rPr>
+          <w:rStyle w:val="无"/>
+          <w:rFonts w:ascii="Times New Roman" w:hAnsi="Times New Roman"/>
+          <w:rtl w:val="0"/>
+          <w:lang w:val="en-US"/>
+        </w:rPr>
+        <w:t>2).</w:t>
       </w:r>
     </w:p>
     <w:p>
@@ -13294,7 +13018,7 @@
           <w:rtl w:val="0"/>
           <w:lang w:val="en-US"/>
         </w:rPr>
-        <w:t>24%), confirming it as the main source of recall (Table 4). Removing the confidence gate leaves recall unchanged but lets tentative thoughts into 73 of the 573 injected slots, where the full system injects none</w:t>
+        <w:t>24%; Table 4). Removing the confidence gate leaves recall unchanged but lets tentative thoughts into 73 of 573 injected slots, against none for the full system, and ungated top-5 retrieval, which ranks as well as Noesis (Recall@5 99%, MRR 1.000) as it does at scale (</w:t>
       </w:r>
       <w:r>
         <w:rPr>
@@ -13303,36 +13027,16 @@
           <w:rtl w:val="0"/>
           <w:lang w:val="en-US"/>
         </w:rPr>
-        <w:t>—</w:t>
-      </w:r>
-      <w:r>
-        <w:rPr>
-          <w:rStyle w:val="无"/>
-          <w:rFonts w:ascii="Times New Roman" w:hAnsi="Times New Roman"/>
-          <w:rtl w:val="0"/>
-          <w:lang w:val="en-US"/>
-        </w:rPr>
-        <w:t xml:space="preserve">gating is what keeps </w:t>
-      </w:r>
-      <w:r>
-        <w:rPr>
-          <w:rStyle w:val="无"/>
-          <w:rFonts w:ascii="Times New Roman" w:hAnsi="Times New Roman"/>
-          <w:i w:val="1"/>
-          <w:iCs w:val="1"/>
-          <w:rtl w:val="0"/>
-          <w:lang w:val="en-US"/>
-        </w:rPr>
-        <w:t>tentative</w:t>
-      </w:r>
-      <w:r>
-        <w:rPr>
-          <w:rStyle w:val="无"/>
-          <w:rFonts w:ascii="Times New Roman" w:hAnsi="Times New Roman"/>
-          <w:rtl w:val="0"/>
-          <w:lang w:val="en-US"/>
-        </w:rPr>
-        <w:t xml:space="preserve"> material out of the prompt. Ungated top-5 retrieval ranks as well as Noesis here (Recall@5 99%, MRR 1.000), as it does at scale (</w:t>
+        <w:t>§</w:t>
+      </w:r>
+      <w:r>
+        <w:rPr>
+          <w:rStyle w:val="无"/>
+          <w:rFonts w:ascii="Times New Roman" w:hAnsi="Times New Roman"/>
+          <w:rtl w:val="0"/>
+          <w:lang w:val="en-US"/>
+        </w:rPr>
+        <w:t>5.3), injects one in 19 of its 250 slots. A separate poisoning test agrees: with 5 settled facts and 8 hedged statements contradicting them, ungated top-5 retrieval returned a hedged statement in 13 of 25 slots across 5 queries, Noesis in none. Both tests use hedged statements; a firmly stated false one would pass the gate (</w:t>
       </w:r>
       <w:r>
         <w:rPr>
@@ -13350,25 +13054,7 @@
           <w:rtl w:val="0"/>
           <w:lang w:val="en-US"/>
         </w:rPr>
-        <w:t>5.3), but injects a tentative thought in 19 of its 250 slots. A separate poisoning test gives the same picture: with 5 settled facts and 8 hedged statements that contradict them, ungated top-5 retrieval returned a hedged statement in 13 of 25 slots across 5 queries, and Noesis in none. Both tests use hedged statements; a firmly stated false one would pass the gate (</w:t>
-      </w:r>
-      <w:r>
-        <w:rPr>
-          <w:rStyle w:val="无"/>
-          <w:rFonts w:ascii="Times New Roman" w:hAnsi="Times New Roman" w:hint="default"/>
-          <w:rtl w:val="0"/>
-          <w:lang w:val="en-US"/>
-        </w:rPr>
-        <w:t>§</w:t>
-      </w:r>
-      <w:r>
-        <w:rPr>
-          <w:rStyle w:val="无"/>
-          <w:rFonts w:ascii="Times New Roman" w:hAnsi="Times New Roman"/>
-          <w:rtl w:val="0"/>
-          <w:lang w:val="en-US"/>
-        </w:rPr>
-        <w:t>9). Removing the core-fact or recency signal changes nothing measurable: each adds about one memory per query (10.9 vs. 9.7 items) without changing recall. The builder adds these signals after the eight semantic results, so they never reach the first five slots; whether they help on queries the semantic channel misses needs a dedicated query set.</w:t>
+        <w:t>9). Removing the core-fact or recency signal does not change recall: each adds about one memory per query (10.9 vs. 9.7 items) and, appended after the eight semantic results, never reaches the first five slots; whether they help on queries semantic retrieval misses needs a dedicated query set.</w:t>
       </w:r>
     </w:p>
     <w:p>
@@ -13610,7 +13296,7 @@
           <w:rFonts w:ascii="Times New Roman" w:cs="Times New Roman" w:hAnsi="Times New Roman" w:eastAsia="Times New Roman"/>
           <w:outline w:val="0"/>
           <w:color w:val="000000"/>
-          <w:sz w:val="23"/>
+          <w:sz w:val="24"/>
           <w:u w:color="000000"/>
           <w14:textFill>
             <w14:solidFill>
@@ -13699,8 +13385,8 @@
             <w:rFonts w:ascii="Cambria Math" w:hAnsi="Cambria Math"/>
             <w:i/>
             <w:color w:val="000000"/>
-            <w:sz w:val="28"/>
-            <w:szCs w:val="28"/>
+            <w:sz w:val="25"/>
+            <w:szCs w:val="25"/>
           </w:rPr>
           <m:t>→</m:t>
         </m:r>
@@ -13712,7 +13398,7 @@
           <w:rtl w:val="0"/>
           <w:lang w:val="en-US"/>
         </w:rPr>
-        <w:t xml:space="preserve">207 tokens) because retrieval returns a small, confidence-gated set; the 1,200-token budget is never reached. MRR holds at 0.90: 9 of the 10 targets sit at rank 1, and the tenth is never retrieved. Naive RAG keeps recall only by injecting everything: 7,192 tokens at </w:t>
+        <w:t xml:space="preserve">207 tokens), well under the 1,200-token budget, and MRR holds at 0.90: 9 of 10 targets sit at rank 1 and the tenth is never retrieved. Naive RAG keeps recall only by injecting everything: 7,192 tokens at </w:t>
       </w:r>
       <m:oMath>
         <m:r>
@@ -13720,8 +13406,8 @@
             <w:rFonts w:ascii="Cambria Math" w:hAnsi="Cambria Math"/>
             <w:i/>
             <w:color w:val="000000"/>
-            <w:sz w:val="28"/>
-            <w:szCs w:val="28"/>
+            <w:sz w:val="25"/>
+            <w:szCs w:val="25"/>
           </w:rPr>
           <m:t>n</m:t>
         </m:r>
@@ -13730,8 +13416,8 @@
             <w:rFonts w:ascii="Cambria Math" w:hAnsi="Cambria Math"/>
             <w:i/>
             <w:color w:val="000000"/>
-            <w:sz w:val="28"/>
-            <w:szCs w:val="28"/>
+            <w:sz w:val="25"/>
+            <w:szCs w:val="25"/>
           </w:rPr>
           <m:t>=</m:t>
         </m:r>
@@ -13740,8 +13426,8 @@
             <w:rFonts w:ascii="Cambria Math" w:hAnsi="Cambria Math"/>
             <w:i/>
             <w:color w:val="000000"/>
-            <w:sz w:val="28"/>
-            <w:szCs w:val="28"/>
+            <w:sz w:val="25"/>
+            <w:szCs w:val="25"/>
           </w:rPr>
           <m:t>500</m:t>
         </m:r>
@@ -13761,8 +13447,8 @@
             <w:rFonts w:ascii="Cambria Math" w:hAnsi="Cambria Math"/>
             <w:i/>
             <w:color w:val="000000"/>
-            <w:sz w:val="28"/>
-            <w:szCs w:val="28"/>
+            <w:sz w:val="25"/>
+            <w:szCs w:val="25"/>
           </w:rPr>
           <m:t>n</m:t>
         </m:r>
@@ -13771,8 +13457,8 @@
             <w:rFonts w:ascii="Cambria Math" w:hAnsi="Cambria Math"/>
             <w:i/>
             <w:color w:val="000000"/>
-            <w:sz w:val="28"/>
-            <w:szCs w:val="28"/>
+            <w:sz w:val="25"/>
+            <w:szCs w:val="25"/>
           </w:rPr>
           <m:t>=</m:t>
         </m:r>
@@ -13781,8 +13467,8 @@
             <w:rFonts w:ascii="Cambria Math" w:hAnsi="Cambria Math"/>
             <w:i/>
             <w:color w:val="000000"/>
-            <w:sz w:val="28"/>
-            <w:szCs w:val="28"/>
+            <w:sz w:val="25"/>
+            <w:szCs w:val="25"/>
           </w:rPr>
           <m:t>10</m:t>
         </m:r>
@@ -13794,7 +13480,7 @@
           <w:rtl w:val="0"/>
           <w:lang w:val="en-US"/>
         </w:rPr>
-        <w:t>: the window forgets everything older. A standard top-5 RAG, which embeds the query and injects its five nearest memories, does as well as Noesis on this benchmark: the same 9 of 10 targets at rank 1, with 66</w:t>
+        <w:t>. A standard top-5 RAG (the query</w:t>
       </w:r>
       <w:r>
         <w:rPr>
@@ -13803,6 +13489,24 @@
           <w:rtl w:val="0"/>
           <w:lang w:val="en-US"/>
         </w:rPr>
+        <w:t>’</w:t>
+      </w:r>
+      <w:r>
+        <w:rPr>
+          <w:rStyle w:val="无"/>
+          <w:rFonts w:ascii="Times New Roman" w:hAnsi="Times New Roman"/>
+          <w:rtl w:val="0"/>
+          <w:lang w:val="en-US"/>
+        </w:rPr>
+        <w:t>s five nearest memories) does as well: the same 9 of 10 targets at rank 1, with 66</w:t>
+      </w:r>
+      <w:r>
+        <w:rPr>
+          <w:rStyle w:val="无"/>
+          <w:rFonts w:ascii="Times New Roman" w:hAnsi="Times New Roman" w:hint="default"/>
+          <w:rtl w:val="0"/>
+          <w:lang w:val="en-US"/>
+        </w:rPr>
         <w:t>–</w:t>
       </w:r>
       <w:r>
@@ -13812,7 +13516,7 @@
           <w:rtl w:val="0"/>
           <w:lang w:val="en-US"/>
         </w:rPr>
-        <w:t>68 tokens per query. Flat cost and good ranking therefore come from retrieval itself rather than from anything specific to Noesis; what Noesis adds is the gate (</w:t>
+        <w:t>68 tokens per query. Flat cost and good ranking come from retrieval itself, not from anything specific to Noesis; what Noesis adds is the gate (</w:t>
       </w:r>
       <w:r>
         <w:rPr>
@@ -13830,27 +13534,7 @@
           <w:rtl w:val="0"/>
           <w:lang w:val="en-US"/>
         </w:rPr>
-        <w:t xml:space="preserve">5.2), which top-5 RAG lacks. The methodological takeaway: </w:t>
-      </w:r>
-      <w:r>
-        <w:rPr>
-          <w:rStyle w:val="无"/>
-          <w:rFonts w:ascii="Times New Roman" w:hAnsi="Times New Roman"/>
-          <w:i w:val="1"/>
-          <w:iCs w:val="1"/>
-          <w:rtl w:val="0"/>
-          <w:lang w:val="en-US"/>
-        </w:rPr>
-        <w:t>recall alone is misleading</w:t>
-      </w:r>
-      <w:r>
-        <w:rPr>
-          <w:rStyle w:val="无"/>
-          <w:rFonts w:ascii="Times New Roman" w:hAnsi="Times New Roman"/>
-          <w:rtl w:val="0"/>
-          <w:lang w:val="en-US"/>
-        </w:rPr>
-        <w:t>; rank and token cost must be reported together.</w:t>
+        <w:t>5.2). Recall alone is therefore misleading; rank and token cost must be reported together.</w:t>
       </w:r>
     </w:p>
     <w:p>
@@ -14034,72 +13718,7 @@
           <w:rtl w:val="0"/>
           <w:lang w:val="en-US"/>
         </w:rPr>
-        <w:t>Of 40 scenarios, 27 state a stance in one tool and ask about it from another; in 7, the asking tool was one of two tools that stated it; and in 6, a third tool asks after two others stated it (Figure</w:t>
-      </w:r>
-      <w:r>
-        <w:rPr>
-          <w:rStyle w:val="无"/>
-          <w:rFonts w:ascii="Times New Roman" w:hAnsi="Times New Roman" w:hint="default"/>
-          <w:rtl w:val="0"/>
-          <w:lang w:val="en-US"/>
-        </w:rPr>
-        <w:t> </w:t>
-      </w:r>
-      <w:r>
-        <w:rPr>
-          <w:rStyle w:val="Hyperlink.3"/>
-        </w:rPr>
-        <w:fldChar w:fldCharType="begin" w:fldLock="0"/>
-      </w:r>
-      <w:r>
-        <w:rPr>
-          <w:rStyle w:val="Hyperlink.3"/>
-        </w:rPr>
-        <w:instrText xml:space="preserve"> HYPERLINK \l "figcrosstool" </w:instrText>
-      </w:r>
-      <w:r>
-        <w:rPr>
-          <w:rStyle w:val="Hyperlink.3"/>
-        </w:rPr>
-        <w:fldChar w:fldCharType="separate" w:fldLock="0"/>
-      </w:r>
-      <w:r>
-        <w:rPr>
-          <w:rStyle w:val="Hyperlink.3"/>
-          <w:rtl w:val="0"/>
-        </w:rPr>
-        <w:t>5</w:t>
-      </w:r>
-      <w:r>
-        <w:rPr/>
-        <w:fldChar w:fldCharType="end" w:fldLock="0"/>
-      </w:r>
-      <w:r>
-        <w:rPr>
-          <w:rStyle w:val="无"/>
-          <w:rFonts w:ascii="Times New Roman" w:hAnsi="Times New Roman"/>
-          <w:rtl w:val="0"/>
-          <w:lang w:val="en-US"/>
-        </w:rPr>
-        <w:t>). On the 27 strictly cross-tool queries, Noesis retrieves 37% (10/27) and the isolated baseline 0%</w:t>
-      </w:r>
-      <w:r>
-        <w:rPr>
-          <w:rStyle w:val="无"/>
-          <w:rFonts w:ascii="Times New Roman" w:hAnsi="Times New Roman" w:hint="default"/>
-          <w:rtl w:val="0"/>
-          <w:lang w:val="en-US"/>
-        </w:rPr>
-        <w:t>—</w:t>
-      </w:r>
-      <w:r>
-        <w:rPr>
-          <w:rStyle w:val="无"/>
-          <w:rFonts w:ascii="Times New Roman" w:hAnsi="Times New Roman"/>
-          <w:rtl w:val="0"/>
-          <w:lang w:val="en-US"/>
-        </w:rPr>
-        <w:t>not because it ranks poorly, but because the memory is not in its partition, so that 0% holds by construction. The 7 scenarios where the asking tool did see the stance are a fairer comparison: isolated memory retrieves 3 of 7 and Noesis 6 of 7. Over all 40 scenarios, Noesis retrieves 50% and the isolated baseline 7.5%. This is the structural argument: per-tool memory systems cannot share by design, and no amount of per-tool tuning closes the gap. The comparison therefore shows the value of access, not an advantage over another shared-memory system given the same records. Noesis</w:t>
+        <w:t>Of 40 scenarios, 27 state a stance in one tool and ask about it from another; in 7 the asking tool was one of two that stated it; in 6 a third tool asks after two others did (Figure 5). On the 27 strictly cross-tool queries Noesis retrieves 37% (10/27) and the isolated baseline 0%, by construction, since the memory is not in its partition. Where the asking tool did see the stance (7 scenarios), isolated memory retrieves 3 and Noesis 6; over all 40, Noesis retrieves 50% and the isolated baseline 7.5%. The comparison shows the value of access, not an advantage over another shared-memory system given the same records. Noesis</w:t>
       </w:r>
       <w:r>
         <w:rPr>
@@ -14262,7 +13881,7 @@
           <w:rtl w:val="0"/>
           <w:lang w:val="en-US"/>
         </w:rPr>
-        <w:t xml:space="preserve"> The star map. Semantic neighbors attract into volumetric constellations. Time runs from older (left) to newer (right), height reflects confidence, and color encodes topic; star size encodes type and activation weight, and brightness also tracks activation weight.</w:t>
+        <w:t xml:space="preserve"> The star map. Semantic neighbors cluster; time runs from older (left) to newer (right), height shows confidence, color shows topic, and size and brightness show type and activation weight.</w:t>
       </w:r>
       <w:bookmarkEnd w:id="30"/>
     </w:p>
@@ -14281,7 +13900,7 @@
           <w:rtl w:val="0"/>
           <w:lang w:val="en-US"/>
         </w:rPr>
-        <w:t>The star map displays the stored thoughts as a galaxy (Figure</w:t>
+        <w:t>The star map shows the stored thoughts as a galaxy (Figure</w:t>
       </w:r>
       <w:r>
         <w:rPr>
@@ -14294,41 +13913,12 @@
       </w:r>
       <w:r>
         <w:rPr>
-          <w:rStyle w:val="Hyperlink.2"/>
-        </w:rPr>
-        <w:fldChar w:fldCharType="begin" w:fldLock="0"/>
-      </w:r>
-      <w:r>
-        <w:rPr>
-          <w:rStyle w:val="Hyperlink.2"/>
-        </w:rPr>
-        <w:instrText xml:space="preserve"> HYPERLINK \l "figstarmap" </w:instrText>
-      </w:r>
-      <w:r>
-        <w:rPr>
-          <w:rStyle w:val="Hyperlink.2"/>
-        </w:rPr>
-        <w:fldChar w:fldCharType="separate" w:fldLock="0"/>
-      </w:r>
-      <w:r>
-        <w:rPr>
-          <w:rStyle w:val="Hyperlink.2"/>
-          <w:rtl w:val="0"/>
-        </w:rPr>
-        <w:t>6</w:t>
-      </w:r>
-      <w:r>
-        <w:rPr/>
-        <w:fldChar w:fldCharType="end" w:fldLock="0"/>
-      </w:r>
-      <w:r>
-        <w:rPr>
-          <w:rStyle w:val="无"/>
-          <w:rFonts w:ascii="Times New Roman" w:hAnsi="Times New Roman"/>
-          <w:rtl w:val="0"/>
-          <w:lang w:val="en-US"/>
-        </w:rPr>
-        <w:t xml:space="preserve">). Each thought is a star placed by a short force simulation. Weak springs pull each star toward its creation time on the horizontal axis and its confidence on the vertical axis; semantic attraction pulls it toward its most similar neighbors (embedding cosine </w:t>
+          <w:rStyle w:val="无"/>
+          <w:rFonts w:ascii="Times New Roman" w:hAnsi="Times New Roman"/>
+          <w:rtl w:val="0"/>
+          <w:lang w:val="en-US"/>
+        </w:rPr>
+        <w:t xml:space="preserve">6), placed by a short force simulation: weak springs pull each star toward its creation time (horizontal) and confidence (vertical), semantic attraction pulls it toward its most similar neighbors (cosine </w:t>
       </w:r>
       <w:r>
         <w:rPr>
@@ -14346,7 +13936,7 @@
           <w:rtl w:val="0"/>
           <w:lang w:val="en-US"/>
         </w:rPr>
-        <w:t xml:space="preserve">0.45); and repulsion keeps stars from overlapping while pushing different topics apart. The springs are weak enough that attraction wins locally, so clusters form from embedding similarity while time and confidence stay readable at a glance; topic labels only decide which clusters repel. This makes the memory store inspectable rather than a black box: older thoughts sit to the left, settled ones sit high, and hovering a star shows its text and confidence. The store shown is the local development store, populated by the experiment and demo runs rather than by real use: of its 601 thoughts, 355 sit in the catch-all </w:t>
+        <w:t xml:space="preserve">0.45), and repulsion separates topics. Clusters therefore form from embedding similarity while time and confidence stay readable, and hovering a star shows its text and confidence. The store shown is the local development store, filled by experiment and demo runs: of its 601 thoughts, 355 sit in the catch-all </w:t>
       </w:r>
       <w:r>
         <w:rPr>
@@ -14382,7 +13972,7 @@
           <w:rtl w:val="0"/>
           <w:lang w:val="en-US"/>
         </w:rPr>
-        <w:t>topic, which the extractor assigns when no known topic matches, and 18 have settled. Even so, the view surfaces such patterns at a glance; here it shows how coarse topic assignment still is. The viewer is a local web tool shipped with the system; it opens the store read-only, so inspecting memory never changes it. The map is a display only: its edges are computed by the viewer and never affect retrieval, so it says nothing about whether graph structure improves answers.</w:t>
+        <w:t>topic and 18 have settled, which shows how coarse topic assignment still is. The viewer opens the store read-only, and its edges never affect retrieval, so the map says nothing about whether graph structure improves answers.</w:t>
       </w:r>
     </w:p>
     <w:p>
@@ -14471,7 +14061,25 @@
           <w:rtl w:val="0"/>
           <w:lang w:val="en-US"/>
         </w:rPr>
-        <w:t>Gains concentrate on questions that are unanswerable without personal context (job, stack, stances). On mainstream questions both groups often answer correctly, which compresses the measured gap on those items. Other factors push the other way (see Limitations), so these results should not be read as a bound in either direction.</w:t>
+        <w:t>Gains concentrate on questions unanswerable without personal context (job, stack, stances); on mainstream questions both conditions often answer correctly. Other factors push the other way (</w:t>
+      </w:r>
+      <w:r>
+        <w:rPr>
+          <w:rStyle w:val="无"/>
+          <w:rFonts w:ascii="Times New Roman" w:hAnsi="Times New Roman" w:hint="default"/>
+          <w:rtl w:val="0"/>
+          <w:lang w:val="en-US"/>
+        </w:rPr>
+        <w:t>§</w:t>
+      </w:r>
+      <w:r>
+        <w:rPr>
+          <w:rStyle w:val="无"/>
+          <w:rFonts w:ascii="Times New Roman" w:hAnsi="Times New Roman"/>
+          <w:rtl w:val="0"/>
+          <w:lang w:val="en-US"/>
+        </w:rPr>
+        <w:t>9), so the gains are not a bound in either direction.</w:t>
       </w:r>
       <w:bookmarkEnd w:id="32"/>
     </w:p>
@@ -14560,7 +14168,7 @@
           <w:rtl w:val="0"/>
           <w:lang w:val="en-US"/>
         </w:rPr>
-        <w:t xml:space="preserve">gemma3:4b posts the largest gain (+48.2pp; +139% over its baseline), approaching Gemini Flash-Lite once memory is injected. The benefit is not monotonic in model size: qwen2.5:3b gains least (+25.5pp; </w:t>
+        <w:t xml:space="preserve">gemma3:4b gains most (+48.2pp; +139% over its baseline) and approaches Gemini Flash-Lite with memory, while qwen2.5:3b gains least (+25.5pp; </w:t>
       </w:r>
       <w:r>
         <w:rPr>
@@ -14578,7 +14186,7 @@
           <w:rtl w:val="0"/>
           <w:lang w:val="en-US"/>
         </w:rPr>
-        <w:t>5.1). Memory helps small local models most when they can use the injected context, which matters for privacy-sensitive and offline settings.</w:t>
+        <w:t>5.1), so the benefit is not monotonic in model size. It is largest for small local models that can use the injected context, which matters for private and offline use.</w:t>
       </w:r>
       <w:bookmarkEnd w:id="33"/>
     </w:p>
@@ -14632,7 +14240,7 @@
           <w:rtl w:val="0"/>
           <w:lang w:val="en-US"/>
         </w:rPr>
-        <w:t>The cross-tool misses and several A/B misses reduce to ranking failures, not architecture failures: the memory is stored but ranks below the cut. Improving ranking (rerankers, query expansion) is the highest-leverage next step. The supersession fix</w:t>
+        <w:t>The cross-tool misses and several A/B misses are ranking failures: the memory is stored but ranks below the cut, so better ranking (rerankers, query expansion) is the highest-leverage next step. The supersession fix</w:t>
       </w:r>
       <w:r>
         <w:rPr>
@@ -14650,79 +14258,7 @@
           <w:rtl w:val="0"/>
           <w:lang w:val="en-US"/>
         </w:rPr>
-        <w:t xml:space="preserve">s residual 7% is different: in both remaining leaks the detector never fired, once because </w:t>
-      </w:r>
-      <w:r>
-        <w:rPr>
-          <w:rStyle w:val="无"/>
-          <w:rFonts w:ascii="Times New Roman" w:hAnsi="Times New Roman" w:hint="default"/>
-          <w:rtl w:val="0"/>
-          <w:lang w:val="en-US"/>
-        </w:rPr>
-        <w:t>“</w:t>
-      </w:r>
-      <w:r>
-        <w:rPr>
-          <w:rStyle w:val="无"/>
-          <w:rFonts w:ascii="Times New Roman" w:hAnsi="Times New Roman"/>
-          <w:rtl w:val="0"/>
-          <w:lang w:val="en-US"/>
-        </w:rPr>
-        <w:t>I now believe microservices are better</w:t>
-      </w:r>
-      <w:r>
-        <w:rPr>
-          <w:rStyle w:val="无"/>
-          <w:rFonts w:ascii="Times New Roman" w:hAnsi="Times New Roman" w:hint="default"/>
-          <w:rtl w:val="0"/>
-          <w:lang w:val="en-US"/>
-        </w:rPr>
-        <w:t xml:space="preserve">” </w:t>
-      </w:r>
-      <w:r>
-        <w:rPr>
-          <w:rStyle w:val="无"/>
-          <w:rFonts w:ascii="Times New Roman" w:hAnsi="Times New Roman"/>
-          <w:rtl w:val="0"/>
-          <w:lang w:val="en-US"/>
-        </w:rPr>
-        <w:t xml:space="preserve">uses no listed replacement verb and names no known domain, and once because </w:t>
-      </w:r>
-      <w:r>
-        <w:rPr>
-          <w:rStyle w:val="无"/>
-          <w:rFonts w:ascii="Times New Roman" w:hAnsi="Times New Roman" w:hint="default"/>
-          <w:rtl w:val="0"/>
-          <w:lang w:val="en-US"/>
-        </w:rPr>
-        <w:t>“</w:t>
-      </w:r>
-      <w:r>
-        <w:rPr>
-          <w:rStyle w:val="无"/>
-          <w:rFonts w:ascii="Times New Roman" w:hAnsi="Times New Roman"/>
-          <w:rtl w:val="0"/>
-          <w:lang w:val="en-US"/>
-        </w:rPr>
-        <w:t>I switched to Node.js</w:t>
-      </w:r>
-      <w:r>
-        <w:rPr>
-          <w:rStyle w:val="无"/>
-          <w:rFonts w:ascii="Times New Roman" w:hAnsi="Times New Roman" w:hint="default"/>
-          <w:rtl w:val="0"/>
-          <w:lang w:val="en-US"/>
-        </w:rPr>
-        <w:t xml:space="preserve">” </w:t>
-      </w:r>
-      <w:r>
-        <w:rPr>
-          <w:rStyle w:val="无"/>
-          <w:rFonts w:ascii="Times New Roman" w:hAnsi="Times New Roman"/>
-          <w:rtl w:val="0"/>
-          <w:lang w:val="en-US"/>
-        </w:rPr>
-        <w:t>has the verb but Node.js is missing from the domain map. A broader mind-change detector is the matching fix.</w:t>
+        <w:t>s residual 7% is different: in both leaks the detector never fired, because its lexicon lacked the replacement verb in one case and the domain (Node.js) in the other.</w:t>
       </w:r>
     </w:p>
     <w:p>
@@ -14790,7 +14326,23 @@
           <w:rtl w:val="0"/>
           <w:lang w:val="en-US"/>
         </w:rPr>
-        <w:t>(Anthropic 2025); Noesis would sit inside one as a memory service, not as orchestration. None of this is implemented or evaluated here. Before a model step, the harness would insert approved memories for the current user, project, and access scope as a bounded, sourced block, and afterward send candidate memories with their sources. LangGraph separates thread-scoped checkpoints from a cross-thread store</w:t>
+        <w:t>(Anthropic 2025); Noesis would serve inside one as memory, not orchestration, though this is neither implemented nor evaluated here. The harness would insert approved memories for the current user, project, and scope as a bounded, sourced block and send back candidate memories with their sources; Noesis could fill LangGraph</w:t>
+      </w:r>
+      <w:r>
+        <w:rPr>
+          <w:rStyle w:val="无"/>
+          <w:rtl w:val="0"/>
+          <w:lang w:val="en-US"/>
+        </w:rPr>
+        <w:t>’</w:t>
+      </w:r>
+      <w:r>
+        <w:rPr>
+          <w:rStyle w:val="无"/>
+          <w:rtl w:val="0"/>
+          <w:lang w:val="en-US"/>
+        </w:rPr>
+        <w:t>s cross-thread store, not its thread checkpoints</w:t>
       </w:r>
       <w:r>
         <w:rPr>
@@ -14806,7 +14358,7 @@
           <w:rtl w:val="0"/>
           <w:lang w:val="en-US"/>
         </w:rPr>
-        <w:t>(LangChain 2026); Noesis could fill only the second role. An integration would also need corrections, deletion, audit, and source lineage. Three gaps stand out: repetition counts similar records whatever their source, and the proxy stores each request</w:t>
+        <w:t>(LangChain 2026). Integration also needs corrections, deletion, audit, and source lineage, and three gaps stand out: repetition counts similar records whatever their source, and the proxy stores each request</w:t>
       </w:r>
       <w:r>
         <w:rPr>
@@ -14838,7 +14390,7 @@
           <w:rtl w:val="0"/>
           <w:lang w:val="en-US"/>
         </w:rPr>
-        <w:t>s own summaries.</w:t>
+        <w:t>s summaries.</w:t>
       </w:r>
     </w:p>
     <w:p>
@@ -14874,7 +14426,7 @@
           <w:rtl w:val="0"/>
           <w:lang w:val="en-US"/>
         </w:rPr>
-        <w:t>The evaluated system is not a graph-based reasoner: supersession links are implemented and evaluated (Table 2); topic clusters, which limit which records the scorer compares, and wiki links are not evaluated separately; and the one-hop expansion over vault links cannot add a memory (it writes 8-character identifiers but looks up 12-character ones), while the ablation and scale stores have no links. Every reported result therefore comes from flat retrieval.</w:t>
+        <w:t>The evaluated system is not a graph-based reasoner. Supersession links are implemented and evaluated (Table 2); topic clusters and wiki links are not evaluated separately; and the one-hop expansion over vault links cannot add a memory (it writes 8-character identifiers but looks up 12-character ones). Every reported result comes from flat retrieval.</w:t>
       </w:r>
       <w:bookmarkEnd w:id="34"/>
     </w:p>
@@ -14928,7 +14480,7 @@
           <w:rtl w:val="0"/>
           <w:lang w:val="en-US"/>
         </w:rPr>
-        <w:t>I report that the supersession check initially never ran, so stale stances leaked 93% of the time until it was fixed (</w:t>
+        <w:t>I report that the supersession check initially never ran, so stale stances leaked 93% of the time (</w:t>
       </w:r>
       <w:r>
         <w:rPr>
@@ -14946,7 +14498,7 @@
           <w:rtl w:val="0"/>
           <w:lang w:val="en-US"/>
         </w:rPr>
-        <w:t>3.3); that core-fact and recency signals added no recall in my ablation suite; that a standard top-5 RAG matches Noesis</w:t>
+        <w:t>3.3); that core-fact and recency signals added no recall in my ablation; that top-5 RAG matches Noesis</w:t>
       </w:r>
       <w:r>
         <w:rPr>
@@ -14964,7 +14516,7 @@
           <w:rtl w:val="0"/>
           <w:lang w:val="en-US"/>
         </w:rPr>
-        <w:t>s ranking at lower cost on the scale benchmark; that the 3B model gains least; and that the graph expansion never adds a memory. I consider these findings part of the contribution.</w:t>
+        <w:t>s ranking at lower cost; that the 3B model gains least; and that the graph expansion never adds a memory. I consider these findings part of the contribution.</w:t>
       </w:r>
       <w:bookmarkEnd w:id="35"/>
     </w:p>
@@ -15173,27 +14725,7 @@
           <w:rtl w:val="0"/>
           <w:lang w:val="en-US"/>
         </w:rPr>
-        <w:t xml:space="preserve">), Noesis should create a </w:t>
-      </w:r>
-      <w:r>
-        <w:rPr>
-          <w:rStyle w:val="无"/>
-          <w:rFonts w:ascii="Times New Roman" w:hAnsi="Times New Roman"/>
-          <w:i w:val="1"/>
-          <w:iCs w:val="1"/>
-          <w:rtl w:val="0"/>
-          <w:lang w:val="en-US"/>
-        </w:rPr>
-        <w:t>branch</w:t>
-      </w:r>
-      <w:r>
-        <w:rPr>
-          <w:rStyle w:val="无"/>
-          <w:rFonts w:ascii="Times New Roman" w:hAnsi="Times New Roman"/>
-          <w:rtl w:val="0"/>
-          <w:lang w:val="en-US"/>
-        </w:rPr>
-        <w:t xml:space="preserve"> linked via </w:t>
+        <w:t xml:space="preserve">), Noesis should branch via </w:t>
       </w:r>
       <w:r>
         <w:rPr>
@@ -15213,7 +14745,7 @@
           <w:rtl w:val="0"/>
           <w:lang w:val="en-US"/>
         </w:rPr>
-        <w:t xml:space="preserve"> rather than superseding, preserving the full trajectory of a stance. This enables metrics I cannot compute today: stabilization depth, branching rate, and post-branch divergence</w:t>
+        <w:t xml:space="preserve"> rather than supersede, preserving a stance</w:t>
       </w:r>
       <w:r>
         <w:rPr>
@@ -15222,24 +14754,6 @@
           <w:rtl w:val="0"/>
           <w:lang w:val="en-US"/>
         </w:rPr>
-        <w:t>—</w:t>
-      </w:r>
-      <w:r>
-        <w:rPr>
-          <w:rStyle w:val="无"/>
-          <w:rFonts w:ascii="Times New Roman" w:hAnsi="Times New Roman"/>
-          <w:rtl w:val="0"/>
-          <w:lang w:val="en-US"/>
-        </w:rPr>
-        <w:t>a longitudinal record of how a user</w:t>
-      </w:r>
-      <w:r>
-        <w:rPr>
-          <w:rStyle w:val="无"/>
-          <w:rFonts w:ascii="Times New Roman" w:hAnsi="Times New Roman" w:hint="default"/>
-          <w:rtl w:val="0"/>
-          <w:lang w:val="en-US"/>
-        </w:rPr>
         <w:t>’</w:t>
       </w:r>
       <w:r>
@@ -15249,7 +14763,7 @@
           <w:rtl w:val="0"/>
           <w:lang w:val="en-US"/>
         </w:rPr>
-        <w:t>s positions evolve.</w:t>
+        <w:t>s trajectory and enabling metrics such as stabilization depth and branching rate.</w:t>
       </w:r>
       <w:bookmarkEnd w:id="37"/>
     </w:p>
@@ -15323,7 +14837,97 @@
           <w:rtl w:val="0"/>
           <w:lang w:val="en-US"/>
         </w:rPr>
-        <w:t xml:space="preserve"> (anchor topic, trajectory with weights, cross-links) may help small models use injected memory.</w:t>
+        <w:t xml:space="preserve"> may help small models use injected memory. Typed, timed claims with support, contradiction, derivation, and supersession relations would let </w:t>
+      </w:r>
+      <w:r>
+        <w:rPr>
+          <w:rStyle w:val="无"/>
+          <w:rFonts w:ascii="Times New Roman" w:hAnsi="Times New Roman" w:hint="default"/>
+          <w:rtl w:val="0"/>
+          <w:lang w:val="en-US"/>
+        </w:rPr>
+        <w:t>“</w:t>
+      </w:r>
+      <w:r>
+        <w:rPr>
+          <w:rStyle w:val="无"/>
+          <w:rFonts w:ascii="Times New Roman" w:hAnsi="Times New Roman"/>
+          <w:rtl w:val="0"/>
+          <w:lang w:val="en-US"/>
+        </w:rPr>
+        <w:t>PostgreSQL for analytics</w:t>
+      </w:r>
+      <w:r>
+        <w:rPr>
+          <w:rStyle w:val="无"/>
+          <w:rFonts w:ascii="Times New Roman" w:hAnsi="Times New Roman" w:hint="default"/>
+          <w:rtl w:val="0"/>
+          <w:lang w:val="en-US"/>
+        </w:rPr>
+        <w:t xml:space="preserve">” </w:t>
+      </w:r>
+      <w:r>
+        <w:rPr>
+          <w:rStyle w:val="无"/>
+          <w:rFonts w:ascii="Times New Roman" w:hAnsi="Times New Roman"/>
+          <w:rtl w:val="0"/>
+          <w:lang w:val="en-US"/>
+        </w:rPr>
+        <w:t xml:space="preserve">and </w:t>
+      </w:r>
+      <w:r>
+        <w:rPr>
+          <w:rStyle w:val="无"/>
+          <w:rFonts w:ascii="Times New Roman" w:hAnsi="Times New Roman" w:hint="default"/>
+          <w:rtl w:val="0"/>
+          <w:lang w:val="en-US"/>
+        </w:rPr>
+        <w:t>“</w:t>
+      </w:r>
+      <w:r>
+        <w:rPr>
+          <w:rStyle w:val="无"/>
+          <w:rFonts w:ascii="Times New Roman" w:hAnsi="Times New Roman"/>
+          <w:rtl w:val="0"/>
+          <w:lang w:val="en-US"/>
+        </w:rPr>
+        <w:t>MySQL for a legacy app</w:t>
+      </w:r>
+      <w:r>
+        <w:rPr>
+          <w:rStyle w:val="无"/>
+          <w:rFonts w:ascii="Times New Roman" w:hAnsi="Times New Roman" w:hint="default"/>
+          <w:rtl w:val="0"/>
+          <w:lang w:val="en-US"/>
+        </w:rPr>
+        <w:t xml:space="preserve">” </w:t>
+      </w:r>
+      <w:r>
+        <w:rPr>
+          <w:rStyle w:val="无"/>
+          <w:rFonts w:ascii="Times New Roman" w:hAnsi="Times New Roman"/>
+          <w:rtl w:val="0"/>
+          <w:lang w:val="en-US"/>
+        </w:rPr>
+        <w:t>coexist, as in Zep</w:t>
+      </w:r>
+      <w:r>
+        <w:rPr>
+          <w:rStyle w:val="无"/>
+          <w:rFonts w:ascii="Times New Roman" w:hAnsi="Times New Roman" w:hint="default"/>
+          <w:rtl w:val="0"/>
+          <w:lang w:val="en-US"/>
+        </w:rPr>
+        <w:t> </w:t>
+      </w:r>
+      <w:r>
+        <w:rPr>
+          <w:rStyle w:val="无"/>
+          <w:rFonts w:ascii="Times New Roman" w:hAnsi="Times New Roman"/>
+          <w:rtl w:val="0"/>
+          <w:lang w:val="en-US"/>
+        </w:rPr>
+        <w:t>(Rasmussen et al. 2025); derived claims are not independent evidence, so graph centrality should not raise confidence, and the deciding test crosses flat and graph-backed stores with and without the same gate.</w:t>
       </w:r>
       <w:bookmarkEnd w:id="38"/>
     </w:p>
@@ -15377,7 +14981,7 @@
           <w:rtl w:val="0"/>
           <w:lang w:val="en-US"/>
         </w:rPr>
-        <w:t>LLM-as-judge scoring to complement keyword hits; distractor questions; a second cloud model to replicate the Gemini result; longitudinal deployment data beyond synthetic profiles. Some questions need tentative thoughts (</w:t>
+        <w:t>LLM-as-judge scoring to complement keyword hits; distractor questions; a second cloud model; longitudinal data beyond synthetic profiles; and a harness-level comparison of native harness memory, a simple shared store, and Noesis, with model, tasks, tools, and budget fixed. Questions about alternatives the user was considering need tentative thoughts, so excluding them should be compared with retrieving them with their uncertainty and source, adapting the risk</w:t>
       </w:r>
       <w:r>
         <w:rPr>
@@ -15386,16 +14990,16 @@
           <w:rtl w:val="0"/>
           <w:lang w:val="en-US"/>
         </w:rPr>
-        <w:t>“</w:t>
-      </w:r>
-      <w:r>
-        <w:rPr>
-          <w:rStyle w:val="无"/>
-          <w:rFonts w:ascii="Times New Roman" w:hAnsi="Times New Roman"/>
-          <w:rtl w:val="0"/>
-          <w:lang w:val="en-US"/>
-        </w:rPr>
-        <w:t>what alternatives was I considering last week?</w:t>
+        <w:t>–</w:t>
+      </w:r>
+      <w:r>
+        <w:rPr>
+          <w:rStyle w:val="无"/>
+          <w:rFonts w:ascii="Times New Roman" w:hAnsi="Times New Roman"/>
+          <w:rtl w:val="0"/>
+          <w:lang w:val="en-US"/>
+        </w:rPr>
+        <w:t>coverage view of selective prediction</w:t>
       </w:r>
       <w:r>
         <w:rPr>
@@ -15404,16 +15008,16 @@
           <w:rtl w:val="0"/>
           <w:lang w:val="en-US"/>
         </w:rPr>
-        <w:t>”</w:t>
-      </w:r>
-      <w:r>
-        <w:rPr>
-          <w:rStyle w:val="无"/>
-          <w:rFonts w:ascii="Times New Roman" w:hAnsi="Times New Roman"/>
-          <w:rtl w:val="0"/>
-          <w:lang w:val="en-US"/>
-        </w:rPr>
-        <w:t>), which the gate withholds; tests should compare excluding them with retrieving them alongside their uncertainty and source, adapting the risk</w:t>
+        <w:t> </w:t>
+      </w:r>
+      <w:r>
+        <w:rPr>
+          <w:rStyle w:val="无"/>
+          <w:rFonts w:ascii="Times New Roman" w:hAnsi="Times New Roman"/>
+          <w:rtl w:val="0"/>
+          <w:lang w:val="en-US"/>
+        </w:rPr>
+        <w:t xml:space="preserve">(Geifman and El-Yaniv 2017). Counting repetition only across distinct user statements would close the first gap in </w:t>
       </w:r>
       <w:r>
         <w:rPr>
@@ -15422,202 +15026,16 @@
           <w:rtl w:val="0"/>
           <w:lang w:val="en-US"/>
         </w:rPr>
-        <w:t>–</w:t>
-      </w:r>
-      <w:r>
-        <w:rPr>
-          <w:rStyle w:val="无"/>
-          <w:rFonts w:ascii="Times New Roman" w:hAnsi="Times New Roman"/>
-          <w:rtl w:val="0"/>
-          <w:lang w:val="en-US"/>
-        </w:rPr>
-        <w:t>coverage view of selective prediction</w:t>
-      </w:r>
-      <w:r>
-        <w:rPr>
-          <w:rStyle w:val="无"/>
-          <w:rFonts w:ascii="Times New Roman" w:hAnsi="Times New Roman" w:hint="default"/>
-          <w:rtl w:val="0"/>
-          <w:lang w:val="en-US"/>
-        </w:rPr>
-        <w:t> </w:t>
-      </w:r>
-      <w:r>
-        <w:rPr>
-          <w:rStyle w:val="无"/>
-          <w:rFonts w:ascii="Times New Roman" w:hAnsi="Times New Roman"/>
-          <w:rtl w:val="0"/>
-          <w:lang w:val="en-US"/>
-        </w:rPr>
-        <w:t>(Geifman and El-Yaniv 2017).</w:t>
-      </w:r>
-    </w:p>
-    <w:p>
-      <w:pPr>
-        <w:pStyle w:val="Body Text"/>
-        <w:rPr>
-          <w:rStyle w:val="无"/>
-          <w:i w:val="1"/>
-          <w:iCs w:val="1"/>
-        </w:rPr>
-      </w:pPr>
-      <w:r>
-        <w:rPr>
-          <w:rStyle w:val="无"/>
-          <w:i w:val="1"/>
-          <w:iCs w:val="1"/>
-          <w:rtl w:val="0"/>
-          <w:lang w:val="en-US"/>
-        </w:rPr>
-        <w:t>Harness-level evaluation.</w:t>
-      </w:r>
-    </w:p>
-    <w:p>
-      <w:pPr>
-        <w:pStyle w:val="First Paragraph"/>
-        <w:rPr>
-          <w:rStyle w:val="无"/>
-        </w:rPr>
-      </w:pPr>
-      <w:r>
-        <w:rPr>
-          <w:rStyle w:val="无"/>
-          <w:rtl w:val="0"/>
-          <w:lang w:val="en-US"/>
-        </w:rPr>
-        <w:t xml:space="preserve">With model, tasks, tools, and budget fixed, compare native harness memory, a simple shared store, and Noesis on task completion, preference use, resumption, stale information, project isolation, and needless retrieval, counting cost from capture to generation. Counting repetition only across distinct user statements would close the first gap in </w:t>
-      </w:r>
-      <w:r>
-        <w:rPr>
-          <w:rStyle w:val="无"/>
-          <w:rtl w:val="0"/>
-          <w:lang w:val="en-US"/>
-        </w:rPr>
         <w:t>§</w:t>
       </w:r>
       <w:r>
         <w:rPr>
           <w:rStyle w:val="无"/>
+          <w:rFonts w:ascii="Times New Roman" w:hAnsi="Times New Roman"/>
           <w:rtl w:val="0"/>
           <w:lang w:val="en-US"/>
         </w:rPr>
         <w:t>7.</w:t>
-      </w:r>
-    </w:p>
-    <w:p>
-      <w:pPr>
-        <w:pStyle w:val="Body Text"/>
-        <w:rPr>
-          <w:rStyle w:val="无"/>
-          <w:i w:val="1"/>
-          <w:iCs w:val="1"/>
-        </w:rPr>
-      </w:pPr>
-      <w:r>
-        <w:rPr>
-          <w:rStyle w:val="无"/>
-          <w:i w:val="1"/>
-          <w:iCs w:val="1"/>
-          <w:rtl w:val="0"/>
-          <w:lang w:val="en-US"/>
-        </w:rPr>
-        <w:t>Typed temporal claim graph.</w:t>
-      </w:r>
-    </w:p>
-    <w:p>
-      <w:pPr>
-        <w:pStyle w:val="First Paragraph"/>
-        <w:rPr>
-          <w:rStyle w:val="无"/>
-        </w:rPr>
-      </w:pPr>
-      <w:r>
-        <w:rPr>
-          <w:rStyle w:val="无"/>
-          <w:rtl w:val="0"/>
-          <w:lang w:val="en-US"/>
-        </w:rPr>
-        <w:t xml:space="preserve">Claims linked to user, project, source, tool, and time, with support, contradiction, derivation, and supersession relations, would let </w:t>
-      </w:r>
-      <w:r>
-        <w:rPr>
-          <w:rStyle w:val="无"/>
-          <w:rtl w:val="0"/>
-          <w:lang w:val="en-US"/>
-        </w:rPr>
-        <w:t>“</w:t>
-      </w:r>
-      <w:r>
-        <w:rPr>
-          <w:rStyle w:val="无"/>
-          <w:rtl w:val="0"/>
-          <w:lang w:val="en-US"/>
-        </w:rPr>
-        <w:t>PostgreSQL for analytics</w:t>
-      </w:r>
-      <w:r>
-        <w:rPr>
-          <w:rStyle w:val="无"/>
-          <w:rtl w:val="0"/>
-          <w:lang w:val="en-US"/>
-        </w:rPr>
-        <w:t xml:space="preserve">” </w:t>
-      </w:r>
-      <w:r>
-        <w:rPr>
-          <w:rStyle w:val="无"/>
-          <w:rtl w:val="0"/>
-          <w:lang w:val="en-US"/>
-        </w:rPr>
-        <w:t xml:space="preserve">and </w:t>
-      </w:r>
-      <w:r>
-        <w:rPr>
-          <w:rStyle w:val="无"/>
-          <w:rtl w:val="0"/>
-          <w:lang w:val="en-US"/>
-        </w:rPr>
-        <w:t>“</w:t>
-      </w:r>
-      <w:r>
-        <w:rPr>
-          <w:rStyle w:val="无"/>
-          <w:rtl w:val="0"/>
-          <w:lang w:val="en-US"/>
-        </w:rPr>
-        <w:t>MySQL for a legacy app</w:t>
-      </w:r>
-      <w:r>
-        <w:rPr>
-          <w:rStyle w:val="无"/>
-          <w:rtl w:val="0"/>
-          <w:lang w:val="en-US"/>
-        </w:rPr>
-        <w:t xml:space="preserve">” </w:t>
-      </w:r>
-      <w:r>
-        <w:rPr>
-          <w:rStyle w:val="无"/>
-          <w:rtl w:val="0"/>
-          <w:lang w:val="en-US"/>
-        </w:rPr>
-        <w:t>coexist; Zep</w:t>
-      </w:r>
-      <w:r>
-        <w:rPr>
-          <w:rStyle w:val="无"/>
-          <w:rtl w:val="0"/>
-          <w:lang w:val="en-US"/>
-        </w:rPr>
-        <w:t> </w:t>
-      </w:r>
-      <w:r>
-        <w:rPr>
-          <w:rStyle w:val="无"/>
-          <w:rtl w:val="0"/>
-          <w:lang w:val="en-US"/>
-        </w:rPr>
-        <w:t>(Rasmussen et al. 2025) is the closest precedent. Derived claims are not independent observations, so graph centrality should not raise confidence. The deciding experiment crosses flat and graph-backed stores with and without the same gate, all else fixed.</w:t>
       </w:r>
       <w:bookmarkEnd w:id="39"/>
     </w:p>
@@ -15680,7 +15098,7 @@
           <w:rtl w:val="0"/>
           <w:lang w:val="en-US"/>
         </w:rPr>
-        <w:t xml:space="preserve">Scoring is keyword-hit, which is objective but coarse: it checks whether an answer contains the expected keyword, not whether the answer is right. </w:t>
+        <w:t xml:space="preserve">Keyword-hit scoring checks whether an answer contains the expected keyword, not whether it is right: </w:t>
       </w:r>
       <w:r>
         <w:rPr>
@@ -15698,7 +15116,7 @@
           <w:rtl w:val="0"/>
           <w:lang w:val="en-US"/>
         </w:rPr>
-        <w:t>You do not prefer Python</w:t>
+        <w:t>you do not prefer Python</w:t>
       </w:r>
       <w:r>
         <w:rPr>
@@ -15752,7 +15170,7 @@
           <w:rtl w:val="0"/>
           <w:lang w:val="en-US"/>
         </w:rPr>
-        <w:t xml:space="preserve">, and a correct answer worded differently or given in another language counts as a miss. Personas are synthetic; build/test alignment may overstate real-world gains, and real conversations are noisier. The cloud A/B uses one provider (Gemini Flash-Lite) and </w:t>
+        <w:t xml:space="preserve">, and a correct answer worded differently or in another language counts as a miss. Personas are synthetic, build/test alignment may overstate real gains, and real conversations are noisier. The cloud A/B uses one provider and </w:t>
       </w:r>
       <m:oMath>
         <m:r>
@@ -15793,7 +15211,7 @@
           <w:rtl w:val="0"/>
           <w:lang w:val="en-US"/>
         </w:rPr>
-        <w:t xml:space="preserve"> rather than the planned 150: free-tier rate limits stopped the 30 June run after 111 questions. A later session added 35 more, but because the gemini-flash-lite-latest alias may have pointed to a different model version by then, I use only the first 110 questions (22 complete profiles) from the single June run; all significance thresholds are still exceeded by wide margins. Retrieval-layer experiments measure what reaches the prompt, not final answer quality. The supersession detector relies on replacement verbs and a domain keyword map; paraphrased mind-changes outside its lexicon will be missed. The supersession fix was developed and validated on the same 30 scenarios, so its 93% </w:t>
+        <w:t xml:space="preserve"> rather than the planned 150: rate limits stopped the 30 June run after 111 questions, and I did not add the 35 answered in a later session because the gemini-flash-lite-latest alias may by then have pointed to another model. Retrieval-layer experiments measure what reaches the prompt, not answer quality. The supersession detector relies on replacement verbs and a domain keyword map, and its 93% </w:t>
       </w:r>
       <w:r>
         <w:rPr>
@@ -15811,7 +15229,7 @@
           <w:rtl w:val="0"/>
           <w:lang w:val="en-US"/>
         </w:rPr>
-        <w:t>7% result is in-sample; held-out, paraphrased mind-changes, unseen domains, and legitimate simultaneous preferences, which a detector that matches by domain could wrongly retire, are needed to measure it fairly. The scale experiment</w:t>
+        <w:t xml:space="preserve">7% result is in-sample: it was developed on the same 30 scenarios, and held-out paraphrases, unseen domains, and legitimate simultaneous preferences (which a domain match could wrongly retire) are needed. On the scale benchmark top-5 RAG ties Noesis on ranking. The ablation and poisoning leak counts were corrected in October 2026 to stop counting settled memories that merely shared a word with a tentative one (for example, </w:t>
       </w:r>
       <w:r>
         <w:rPr>
@@ -15820,16 +15238,16 @@
           <w:rtl w:val="0"/>
           <w:lang w:val="en-US"/>
         </w:rPr>
-        <w:t>’</w:t>
-      </w:r>
-      <w:r>
-        <w:rPr>
-          <w:rStyle w:val="无"/>
-          <w:rFonts w:ascii="Times New Roman" w:hAnsi="Times New Roman"/>
-          <w:rtl w:val="0"/>
-          <w:lang w:val="en-US"/>
-        </w:rPr>
-        <w:t xml:space="preserve">s naive-RAG baseline injects every stored memory; the top-5 baseline added in </w:t>
+        <w:t>“</w:t>
+      </w:r>
+      <w:r>
+        <w:rPr>
+          <w:rStyle w:val="无"/>
+          <w:rFonts w:ascii="Times New Roman" w:hAnsi="Times New Roman"/>
+          <w:rtl w:val="0"/>
+          <w:lang w:val="en-US"/>
+        </w:rPr>
+        <w:t>Kafka</w:t>
       </w:r>
       <w:r>
         <w:rPr>
@@ -15838,16 +15256,16 @@
           <w:rtl w:val="0"/>
           <w:lang w:val="en-US"/>
         </w:rPr>
-        <w:t>§</w:t>
-      </w:r>
-      <w:r>
-        <w:rPr>
-          <w:rStyle w:val="无"/>
-          <w:rFonts w:ascii="Times New Roman" w:hAnsi="Times New Roman"/>
-          <w:rtl w:val="0"/>
-          <w:lang w:val="en-US"/>
-        </w:rPr>
-        <w:t xml:space="preserve">5.3 is the stronger comparison, and on this benchmark it ties Noesis on ranking. The ablation and poisoning leak counts were corrected in October 2026: the original keyword-based metric also counted settled memories that merely shared a word with a tentative one (for example, </w:t>
+        <w:t>”</w:t>
+      </w:r>
+      <w:r>
+        <w:rPr>
+          <w:rStyle w:val="无"/>
+          <w:rFonts w:ascii="Times New Roman" w:hAnsi="Times New Roman"/>
+          <w:rtl w:val="0"/>
+          <w:lang w:val="en-US"/>
+        </w:rPr>
+        <w:t xml:space="preserve">). After an external review, the ablation also scores exact memory identity (phrase matching had credited any memory sharing wording such as </w:t>
       </w:r>
       <w:r>
         <w:rPr>
@@ -15865,7 +15283,7 @@
           <w:rtl w:val="0"/>
           <w:lang w:val="en-US"/>
         </w:rPr>
-        <w:t>Kafka</w:t>
+        <w:t>I prefer</w:t>
       </w:r>
       <w:r>
         <w:rPr>
@@ -15883,7 +15301,7 @@
           <w:rtl w:val="0"/>
           <w:lang w:val="en-US"/>
         </w:rPr>
-        <w:t xml:space="preserve">). After an external review, the ablation now scores exact memory identity (phrase matching had credited any memory sharing wording such as </w:t>
+        <w:t xml:space="preserve">), drops </w:t>
       </w:r>
       <w:r>
         <w:rPr>
@@ -15901,7 +15319,7 @@
           <w:rtl w:val="0"/>
           <w:lang w:val="en-US"/>
         </w:rPr>
-        <w:t>I prefer</w:t>
+        <w:t>Precision@5</w:t>
       </w:r>
       <w:r>
         <w:rPr>
@@ -15910,16 +15328,16 @@
           <w:rtl w:val="0"/>
           <w:lang w:val="en-US"/>
         </w:rPr>
-        <w:t>”</w:t>
-      </w:r>
-      <w:r>
-        <w:rPr>
-          <w:rStyle w:val="无"/>
-          <w:rFonts w:ascii="Times New Roman" w:hAnsi="Times New Roman"/>
-          <w:rtl w:val="0"/>
-          <w:lang w:val="en-US"/>
-        </w:rPr>
-        <w:t xml:space="preserve">), drops </w:t>
+        <w:t xml:space="preserve">” </w:t>
+      </w:r>
+      <w:r>
+        <w:rPr>
+          <w:rStyle w:val="无"/>
+          <w:rFonts w:ascii="Times New Roman" w:hAnsi="Times New Roman"/>
+          <w:rtl w:val="0"/>
+          <w:lang w:val="en-US"/>
+        </w:rPr>
+        <w:t>(a non-tentative rate), runs every variant through the same context builder (the old core-fact and recency rows could not differ from the full system), applies the memories</w:t>
       </w:r>
       <w:r>
         <w:rPr>
@@ -15928,16 +15346,16 @@
           <w:rtl w:val="0"/>
           <w:lang w:val="en-US"/>
         </w:rPr>
-        <w:t>“</w:t>
-      </w:r>
-      <w:r>
-        <w:rPr>
-          <w:rStyle w:val="无"/>
-          <w:rFonts w:ascii="Times New Roman" w:hAnsi="Times New Roman"/>
-          <w:rtl w:val="0"/>
-          <w:lang w:val="en-US"/>
-        </w:rPr>
-        <w:t>Precision@5</w:t>
+        <w:t xml:space="preserve">’ </w:t>
+      </w:r>
+      <w:r>
+        <w:rPr>
+          <w:rStyle w:val="无"/>
+          <w:rFonts w:ascii="Times New Roman" w:hAnsi="Times New Roman"/>
+          <w:rtl w:val="0"/>
+          <w:lang w:val="en-US"/>
+        </w:rPr>
+        <w:t xml:space="preserve">ages (previously dropped), and lets the recent-window and random baselines return tentative memories. This lowered the weak baselines (random 45% </w:t>
       </w:r>
       <w:r>
         <w:rPr>
@@ -15946,16 +15364,16 @@
           <w:rtl w:val="0"/>
           <w:lang w:val="en-US"/>
         </w:rPr>
-        <w:t xml:space="preserve">” </w:t>
-      </w:r>
-      <w:r>
-        <w:rPr>
-          <w:rStyle w:val="无"/>
-          <w:rFonts w:ascii="Times New Roman" w:hAnsi="Times New Roman"/>
-          <w:rtl w:val="0"/>
-          <w:lang w:val="en-US"/>
-        </w:rPr>
-        <w:t>(a non-tentative rate), runs every variant through the same context builder (the old core-fact and recency rows could not differ from the full system), applies the memories</w:t>
+        <w:t xml:space="preserve">→ </w:t>
+      </w:r>
+      <w:r>
+        <w:rPr>
+          <w:rStyle w:val="无"/>
+          <w:rFonts w:ascii="Times New Roman" w:hAnsi="Times New Roman"/>
+          <w:rtl w:val="0"/>
+          <w:lang w:val="en-US"/>
+        </w:rPr>
+        <w:t xml:space="preserve">12%, w/o semantic 49% </w:t>
       </w:r>
       <w:r>
         <w:rPr>
@@ -15964,24 +15382,6 @@
           <w:rtl w:val="0"/>
           <w:lang w:val="en-US"/>
         </w:rPr>
-        <w:t xml:space="preserve">’ </w:t>
-      </w:r>
-      <w:r>
-        <w:rPr>
-          <w:rStyle w:val="无"/>
-          <w:rFonts w:ascii="Times New Roman" w:hAnsi="Times New Roman"/>
-          <w:rtl w:val="0"/>
-          <w:lang w:val="en-US"/>
-        </w:rPr>
-        <w:t xml:space="preserve">ages (previously dropped), and lets the recent-window and random baselines return tentative memories. This lowered the weak baselines (random 45% </w:t>
-      </w:r>
-      <w:r>
-        <w:rPr>
-          <w:rStyle w:val="无"/>
-          <w:rFonts w:ascii="Times New Roman" w:hAnsi="Times New Roman" w:hint="default"/>
-          <w:rtl w:val="0"/>
-          <w:lang w:val="en-US"/>
-        </w:rPr>
         <w:t xml:space="preserve">→ </w:t>
       </w:r>
       <w:r>
@@ -15991,25 +15391,7 @@
           <w:rtl w:val="0"/>
           <w:lang w:val="en-US"/>
         </w:rPr>
-        <w:t xml:space="preserve">12%, w/o semantic 49% </w:t>
-      </w:r>
-      <w:r>
-        <w:rPr>
-          <w:rStyle w:val="无"/>
-          <w:rFonts w:ascii="Times New Roman" w:hAnsi="Times New Roman" w:hint="default"/>
-          <w:rtl w:val="0"/>
-          <w:lang w:val="en-US"/>
-        </w:rPr>
-        <w:t xml:space="preserve">→ </w:t>
-      </w:r>
-      <w:r>
-        <w:rPr>
-          <w:rStyle w:val="无"/>
-          <w:rFonts w:ascii="Times New Roman" w:hAnsi="Times New Roman"/>
-          <w:rtl w:val="0"/>
-          <w:lang w:val="en-US"/>
-        </w:rPr>
-        <w:t>24% Recall@5); Noesis moved from 100% to 99%. All results come from my own runs and have not been independently replicated.</w:t>
+        <w:t>24% Recall@5); Noesis moved from 100% to 99%. No result has been independently replicated.</w:t>
       </w:r>
     </w:p>
     <w:p>
@@ -16023,7 +15405,7 @@
           <w:rtl w:val="0"/>
           <w:lang w:val="en-US"/>
         </w:rPr>
-        <w:t>Noesis also adds an attack surface. The local proxy sees every request, including provider API keys and full conversations; enabling cloud extraction sends conversation text to a third-party API, which weakens the local-first guarantee; and because a single firmly stated sentence already reaches provisional (</w:t>
+        <w:t>Noesis also adds an attack surface: the local proxy sees every request, including provider API keys and full conversations; optional cloud extraction sends conversation text to a third party; and because one firmly stated sentence reaches provisional (</w:t>
       </w:r>
       <w:r>
         <w:rPr>
@@ -16041,7 +15423,7 @@
           <w:rtl w:val="0"/>
           <w:lang w:val="en-US"/>
         </w:rPr>
-        <w:t>3.2), a planted or mistaken statement can enter future prompts. The confidence gate filters hedged statements but is not a defense against deliberate poisoning.</w:t>
+        <w:t>3.2), a planted or mistaken statement can enter future prompts. The gate filters hedged statements but is no defense against deliberate poisoning.</w:t>
       </w:r>
       <w:bookmarkEnd w:id="40"/>
     </w:p>
@@ -16122,7 +15504,7 @@
           <w:rtl w:val="0"/>
           <w:lang w:val="en-US"/>
         </w:rPr>
-        <w:t>s own memories raised the keyword-hit rate of all three models on personal questions; whether Noesis</w:t>
+        <w:t>s own memories raised all three models</w:t>
       </w:r>
       <w:r>
         <w:rPr>
@@ -16131,6 +15513,24 @@
           <w:rtl w:val="0"/>
           <w:lang w:val="en-US"/>
         </w:rPr>
+        <w:t xml:space="preserve">’ </w:t>
+      </w:r>
+      <w:r>
+        <w:rPr>
+          <w:rStyle w:val="无"/>
+          <w:rFonts w:ascii="Times New Roman" w:hAnsi="Times New Roman"/>
+          <w:rtl w:val="0"/>
+          <w:lang w:val="en-US"/>
+        </w:rPr>
+        <w:t>keyword-hit rates on personal questions, though whether Noesis</w:t>
+      </w:r>
+      <w:r>
+        <w:rPr>
+          <w:rStyle w:val="无"/>
+          <w:rFonts w:ascii="Times New Roman" w:hAnsi="Times New Roman" w:hint="default"/>
+          <w:rtl w:val="0"/>
+          <w:lang w:val="en-US"/>
+        </w:rPr>
         <w:t>’</w:t>
       </w:r>
       <w:r>
@@ -16140,7 +15540,7 @@
           <w:rtl w:val="0"/>
           <w:lang w:val="en-US"/>
         </w:rPr>
-        <w:t xml:space="preserve">s lifecycle beats simpler ways of supplying the same memories is not yet shown. Its confidence gate kept tentative and hedged statements out of the prompt in constructed tests where plain retrieval let them in, though it judges how firmly something was said, not whether it is true. Retrieval keeps cost flat as memory grows (35 times cheaper than injecting everything at </w:t>
+        <w:t xml:space="preserve">s lifecycle beats simpler ways of supplying them is not yet shown. Its gate kept tentative and hedged statements out of the prompt in constructed tests where plain retrieval let them in, judging how firmly something was said rather than whether it is true. Retrieval keeps cost flat (35 times cheaper than injecting everything at </w:t>
       </w:r>
       <m:oMath>
         <m:r>
@@ -16181,43 +15581,7 @@
           <w:rtl w:val="0"/>
           <w:lang w:val="en-US"/>
         </w:rPr>
-        <w:t>, though a standard top-5 RAG is cheaper still), and a shared per-user store gives every connected tool the same records, which per-tool stores cannot. The result is a local-first layer that brings a 4B local model close to a small cloud model</w:t>
-      </w:r>
-      <w:r>
-        <w:rPr>
-          <w:rStyle w:val="无"/>
-          <w:rFonts w:ascii="Times New Roman" w:hAnsi="Times New Roman" w:hint="default"/>
-          <w:rtl w:val="0"/>
-          <w:lang w:val="en-US"/>
-        </w:rPr>
-        <w:t>’</w:t>
-      </w:r>
-      <w:r>
-        <w:rPr>
-          <w:rStyle w:val="无"/>
-          <w:rFonts w:ascii="Times New Roman" w:hAnsi="Times New Roman"/>
-          <w:rtl w:val="0"/>
-          <w:lang w:val="en-US"/>
-        </w:rPr>
-        <w:t>s keyword-hit rate (82.7% vs. 85.5% for Gemini Flash-Lite; not significantly different on this set, which does not make them equivalent)</w:t>
-      </w:r>
-      <w:r>
-        <w:rPr>
-          <w:rStyle w:val="无"/>
-          <w:rFonts w:ascii="Times New Roman" w:hAnsi="Times New Roman" w:hint="default"/>
-          <w:rtl w:val="0"/>
-          <w:lang w:val="en-US"/>
-        </w:rPr>
-        <w:t>—</w:t>
-      </w:r>
-      <w:r>
-        <w:rPr>
-          <w:rStyle w:val="无"/>
-          <w:rFonts w:ascii="Times New Roman" w:hAnsi="Times New Roman"/>
-          <w:rtl w:val="0"/>
-          <w:lang w:val="en-US"/>
-        </w:rPr>
-        <w:t>and that keeps the user</w:t>
+        <w:t>; top-5 RAG is cheaper still), and a shared per-user store gives every tool the same records. The result is a local-first layer that brings a 4B local model close to a small cloud model (82.7% vs. 85.5%; not significantly different here, which does not make them equivalent) and keeps the user</w:t>
       </w:r>
       <w:r>
         <w:rPr>
@@ -19940,22 +19304,6 @@
       </w:numPr>
     </w:pPr>
   </w:style>
-  <w:style w:type="character" w:styleId="Hyperlink.3">
-    <w:name w:val="Hyperlink.3"/>
-    <w:basedOn w:val="无"/>
-    <w:next w:val="Hyperlink.3"/>
-    <w:rPr>
-      <w:rFonts w:ascii="Times New Roman" w:cs="Times New Roman" w:hAnsi="Times New Roman" w:eastAsia="Times New Roman"/>
-      <w:outline w:val="0"/>
-      <w:color w:val="4f81bd"/>
-      <w:u w:val="none" w:color="4f81bd"/>
-      <w14:textFill>
-        <w14:solidFill>
-          <w14:srgbClr w14:val="4F81BD"/>
-        </w14:solidFill>
-      </w14:textFill>
-    </w:rPr>
-  </w:style>
   <w:style w:type="paragraph" w:styleId="Bibliography">
     <w:name w:val="Bibliography"/>
     <w:next w:val="Bibliography"/>

</xml_diff>

<commit_message>
docs(paper): smooth the wording left stiff by the length cuts
- RQ2: the top-5 leak no longer reads as "one in 19"; verbless clauses
  ("Noesis none", "Noesis in none") get their verbs back
- A/B design and the Limitations list of ablation changes split into
  readable sentences; Hindsight, Discussion and Conclusion phrasing eased
- "experiment harness" spelled out in the abstract; gains written as pp
  throughout; the gate caveat dropped from the conclusion, kept in the
  abstract, RQ2 and Limitations
- no number changed; verify_paper.py 81/81

Co-Authored-By: Claude Opus 5.5 <noreply@anthropic.com>
</commit_message>
<xml_diff>
--- a/paper/noesis_paper.docx
+++ b/paper/noesis_paper.docx
@@ -258,7 +258,7 @@
           <w:rtl w:val="0"/>
           <w:lang w:val="en-US"/>
         </w:rPr>
-        <w:t>s distinct gain is filtering: ungated retrieval surfaced tentative or hedged statements 19 and 13 times in two constructed tests, Noesis none, though its gate judges how firmly something was said, not whether it is true. On strictly cross-tool queries Noesis retrieves 37% of targets, where per-tool isolation is bound to 0%. Code, harness, and raw results are released.</w:t>
+        <w:t>s distinct gain is filtering: in two constructed tests, ungated retrieval surfaced tentative or hedged statements 19 and 13 times, and Noesis surfaced none. Its gate judges how firmly something was said, not whether it is true. On strictly cross-tool queries Noesis retrieves 37% of targets, where per-tool isolation is bound to 0%. The code, experiment harness, and raw results are released.</w:t>
       </w:r>
     </w:p>
     <w:p>
@@ -1853,7 +1853,7 @@
           <w:rtl w:val="0"/>
           <w:lang w:val="en-US"/>
         </w:rPr>
-        <w:t xml:space="preserve">s experiences, opinions, and entity observations, recalls through four channels under a token budget, and gives each opinion an evolving confidence, so none of these is a Noesis contribution. Its confidence belongs to opinions the </w:t>
+        <w:t xml:space="preserve">s experiences, opinions, and entity observations, recalls through four channels under a token budget, and gives each opinion an evolving confidence, so typed memory, budgeted multi-channel retrieval, and evolving confidence are not Noesis contributions. Its confidence belongs to opinions the </w:t>
       </w:r>
       <w:r>
         <w:rPr>
@@ -6957,7 +6957,7 @@
           <w:rtl w:val="0"/>
           <w:lang w:val="en-US"/>
         </w:rPr>
-        <w:t>Thirty synthetic English profiles each make 5 build statements (identity, preferences, positions, decisions), each stated once and firmly (</w:t>
+        <w:t>Each of 30 synthetic English profiles consists of 5 build statements (identity, preferences, positions, decisions) followed by 5 test questions with a known expected keyword. Each statement is made once and firmly (</w:t>
       </w:r>
       <w:r>
         <w:rPr>
@@ -7011,7 +7011,7 @@
           <w:rtl w:val="0"/>
           <w:lang w:val="en-US"/>
         </w:rPr>
-        <w:t xml:space="preserve">3.2), followed by 5 test questions with a known expected keyword. Each question is answered </w:t>
+        <w:t xml:space="preserve">3.2). Each question is answered </w:t>
       </w:r>
       <w:r>
         <w:rPr>
@@ -8878,7 +8878,7 @@
           <w:rtl w:val="0"/>
           <w:lang w:val="en-US"/>
         </w:rPr>
-        <w:t xml:space="preserve">s five questions share one memory store, I also resampled whole profiles (20,000 draws over 22 profiles): the 95% intervals for the gains are +34.5 to +51.8 points (Gemini Flash-Lite), +37.3 to +59.1 (gemma3:4b), and +13.6 to +36.4 (qwen2.5:3b), all above zero. Second, </w:t>
+        <w:t xml:space="preserve">s five questions share one memory store, I also resampled whole profiles (20,000 draws over 22 profiles): the 95% intervals for the gains are +34.5 to +51.8pp (Gemini Flash-Lite), +37.3 to +59.1pp (gemma3:4b), and +13.6 to +36.4pp (qwen2.5:3b), all above zero. Second, </w:t>
       </w:r>
       <w:r>
         <w:rPr>
@@ -13018,7 +13018,7 @@
           <w:rtl w:val="0"/>
           <w:lang w:val="en-US"/>
         </w:rPr>
-        <w:t>24%; Table 4). Removing the confidence gate leaves recall unchanged but lets tentative thoughts into 73 of 573 injected slots, against none for the full system, and ungated top-5 retrieval, which ranks as well as Noesis (Recall@5 99%, MRR 1.000) as it does at scale (</w:t>
+        <w:t>24%; Table 4). Removing the confidence gate leaves recall unchanged but lets tentative thoughts into 73 of 573 injected slots, where the full system injects none. Ungated top-5 retrieval ranks as well as Noesis (Recall@5 99%, MRR 1.000), as it does at scale (</w:t>
       </w:r>
       <w:r>
         <w:rPr>
@@ -13036,7 +13036,7 @@
           <w:rtl w:val="0"/>
           <w:lang w:val="en-US"/>
         </w:rPr>
-        <w:t>5.3), injects one in 19 of its 250 slots. A separate poisoning test agrees: with 5 settled facts and 8 hedged statements contradicting them, ungated top-5 retrieval returned a hedged statement in 13 of 25 slots across 5 queries, Noesis in none. Both tests use hedged statements; a firmly stated false one would pass the gate (</w:t>
+        <w:t>5.3), but lets a tentative thought into 19 of its 250 slots. A separate poisoning test agrees: with 5 settled facts and 8 hedged statements contradicting them, ungated top-5 retrieval returned a hedged statement in 13 of 25 slots across 5 queries, and Noesis returned none. Both tests use hedged statements; a firmly stated false one would pass the gate (</w:t>
       </w:r>
       <w:r>
         <w:rPr>
@@ -13054,7 +13054,7 @@
           <w:rtl w:val="0"/>
           <w:lang w:val="en-US"/>
         </w:rPr>
-        <w:t>9). Removing the core-fact or recency signal does not change recall: each adds about one memory per query (10.9 vs. 9.7 items) and, appended after the eight semantic results, never reaches the first five slots; whether they help on queries semantic retrieval misses needs a dedicated query set.</w:t>
+        <w:t>9). Removing the core-fact or recency signal does not change recall: each adds about one memory per query (10.9 vs. 9.7 items), and because the builder appends them after the eight semantic results, they never reach the first five slots. Whether they help on queries that semantic retrieval misses needs a dedicated query set.</w:t>
       </w:r>
     </w:p>
     <w:p>
@@ -14079,7 +14079,7 @@
           <w:rtl w:val="0"/>
           <w:lang w:val="en-US"/>
         </w:rPr>
-        <w:t>9), so the gains are not a bound in either direction.</w:t>
+        <w:t>9), so these gains should not be read as an upper or lower bound.</w:t>
       </w:r>
       <w:bookmarkEnd w:id="32"/>
     </w:p>
@@ -14391,6 +14391,14 @@
           <w:lang w:val="en-US"/>
         </w:rPr>
         <w:t>s summaries.</w:t>
+      </w:r>
+      <w:r>
+        <w:rPr>
+          <w:rStyle w:val="无"/>
+          <w:rtl w:val="0"/>
+          <w:lang w:val="zh-CN" w:eastAsia="zh-CN"/>
+        </w:rPr>
+        <w:t xml:space="preserve"> c</w:t>
       </w:r>
     </w:p>
     <w:p>
@@ -15265,7 +15273,7 @@
           <w:rtl w:val="0"/>
           <w:lang w:val="en-US"/>
         </w:rPr>
-        <w:t xml:space="preserve">). After an external review, the ablation also scores exact memory identity (phrase matching had credited any memory sharing wording such as </w:t>
+        <w:t xml:space="preserve">). After an external review, I changed the ablation in five ways: it scores exact memory identity instead of shared phrases such as </w:t>
       </w:r>
       <w:r>
         <w:rPr>
@@ -15301,7 +15309,7 @@
           <w:rtl w:val="0"/>
           <w:lang w:val="en-US"/>
         </w:rPr>
-        <w:t xml:space="preserve">), drops </w:t>
+        <w:t xml:space="preserve">; it drops </w:t>
       </w:r>
       <w:r>
         <w:rPr>
@@ -15328,16 +15336,16 @@
           <w:rtl w:val="0"/>
           <w:lang w:val="en-US"/>
         </w:rPr>
-        <w:t xml:space="preserve">” </w:t>
-      </w:r>
-      <w:r>
-        <w:rPr>
-          <w:rStyle w:val="无"/>
-          <w:rFonts w:ascii="Times New Roman" w:hAnsi="Times New Roman"/>
-          <w:rtl w:val="0"/>
-          <w:lang w:val="en-US"/>
-        </w:rPr>
-        <w:t>(a non-tentative rate), runs every variant through the same context builder (the old core-fact and recency rows could not differ from the full system), applies the memories</w:t>
+        <w:t>”</w:t>
+      </w:r>
+      <w:r>
+        <w:rPr>
+          <w:rStyle w:val="无"/>
+          <w:rFonts w:ascii="Times New Roman" w:hAnsi="Times New Roman"/>
+          <w:rtl w:val="0"/>
+          <w:lang w:val="en-US"/>
+        </w:rPr>
+        <w:t>, which measured non-tentative results rather than relevant ones; it runs every variant through the same context builder, so each differs from the full system in one component only; it applies the memories</w:t>
       </w:r>
       <w:r>
         <w:rPr>
@@ -15355,7 +15363,7 @@
           <w:rtl w:val="0"/>
           <w:lang w:val="en-US"/>
         </w:rPr>
-        <w:t xml:space="preserve">ages (previously dropped), and lets the recent-window and random baselines return tentative memories. This lowered the weak baselines (random 45% </w:t>
+        <w:t xml:space="preserve">ages, which the test store had dropped; and it lets the recent-window and random baselines return tentative memories. This lowered the weak baselines (random 45% </w:t>
       </w:r>
       <w:r>
         <w:rPr>
@@ -15540,7 +15548,7 @@
           <w:rtl w:val="0"/>
           <w:lang w:val="en-US"/>
         </w:rPr>
-        <w:t xml:space="preserve">s lifecycle beats simpler ways of supplying them is not yet shown. Its gate kept tentative and hedged statements out of the prompt in constructed tests where plain retrieval let them in, judging how firmly something was said rather than whether it is true. Retrieval keeps cost flat (35 times cheaper than injecting everything at </w:t>
+        <w:t xml:space="preserve">s lifecycle beats simpler ways of supplying them is not yet shown. Its gate kept tentative and hedged statements out of the prompt in constructed tests where plain retrieval let them in. Retrieval keeps cost flat (35 times cheaper than injecting everything at </w:t>
       </w:r>
       <m:oMath>
         <m:r>
@@ -15581,7 +15589,43 @@
           <w:rtl w:val="0"/>
           <w:lang w:val="en-US"/>
         </w:rPr>
-        <w:t>; top-5 RAG is cheaper still), and a shared per-user store gives every tool the same records. The result is a local-first layer that brings a 4B local model close to a small cloud model (82.7% vs. 85.5%; not significantly different here, which does not make them equivalent) and keeps the user</w:t>
+        <w:t>; top-5 RAG is cheaper still), and a shared per-user store gives every tool the same records. The result is a local-first layer that brings a 4B local model</w:t>
+      </w:r>
+      <w:r>
+        <w:rPr>
+          <w:rStyle w:val="无"/>
+          <w:rFonts w:ascii="Times New Roman" w:hAnsi="Times New Roman" w:hint="default"/>
+          <w:rtl w:val="0"/>
+          <w:lang w:val="en-US"/>
+        </w:rPr>
+        <w:t>’</w:t>
+      </w:r>
+      <w:r>
+        <w:rPr>
+          <w:rStyle w:val="无"/>
+          <w:rFonts w:ascii="Times New Roman" w:hAnsi="Times New Roman"/>
+          <w:rtl w:val="0"/>
+          <w:lang w:val="en-US"/>
+        </w:rPr>
+        <w:t>s keyword-hit rate close to a small cloud model</w:t>
+      </w:r>
+      <w:r>
+        <w:rPr>
+          <w:rStyle w:val="无"/>
+          <w:rFonts w:ascii="Times New Roman" w:hAnsi="Times New Roman" w:hint="default"/>
+          <w:rtl w:val="0"/>
+          <w:lang w:val="en-US"/>
+        </w:rPr>
+        <w:t>’</w:t>
+      </w:r>
+      <w:r>
+        <w:rPr>
+          <w:rStyle w:val="无"/>
+          <w:rFonts w:ascii="Times New Roman" w:hAnsi="Times New Roman"/>
+          <w:rtl w:val="0"/>
+          <w:lang w:val="en-US"/>
+        </w:rPr>
+        <w:t>s (82.7% vs. 85.5%; the gap is not significant, though that does not make them equal) and keeps the user</w:t>
       </w:r>
       <w:r>
         <w:rPr>

</xml_diff>

<commit_message>
docs(paper): trim the bibliography to the references the argument needs; cite McNemar
- drop Self-RAG, FLARE, t-SNE, UMAP, LongMemEval-V2, GraphRAG, both
  surveys, MRAgent and PALR: none supported a specific claim, and none was
  among the comparisons the external review required
- cite McNemar (1947) where the A/B test is described
- Related Work: "Learned memory control" keeps AgeMem as its one example;
  RAG, personalization and visualization paragraphs reworded without the
  dropped citations
- references.bib loses the unused entries; docs/related_systems.md drops
  the MRAgent row; 21 references, verify_paper.py 81/81

Co-Authored-By: Claude Opus 5.5 <noreply@anthropic.com>
</commit_message>
<xml_diff>
--- a/paper/noesis_paper.docx
+++ b/paper/noesis_paper.docx
@@ -1753,7 +1753,7 @@
           <w:rtl w:val="0"/>
           <w:lang w:val="en-US"/>
         </w:rPr>
-        <w:t>(Maharana et al. 2024), LongMemEval</w:t>
+        <w:t>(Maharana et al. 2024) and LongMemEval</w:t>
       </w:r>
       <w:r>
         <w:rPr>
@@ -1769,23 +1769,7 @@
           <w:rtl w:val="0"/>
           <w:lang w:val="en-US"/>
         </w:rPr>
-        <w:t>(Wu et al. 2025), and LongMemEval-V2</w:t>
-      </w:r>
-      <w:r>
-        <w:rPr>
-          <w:rStyle w:val="无"/>
-          <w:rtl w:val="0"/>
-          <w:lang w:val="en-US"/>
-        </w:rPr>
-        <w:t> </w:t>
-      </w:r>
-      <w:r>
-        <w:rPr>
-          <w:rStyle w:val="无"/>
-          <w:rtl w:val="0"/>
-          <w:lang w:val="en-US"/>
-        </w:rPr>
-        <w:t>(Wu et al. 2026) (in progress; it adds workflow memory) are not yet used here.</w:t>
+        <w:t>(Wu et al. 2025) are not yet used here.</w:t>
       </w:r>
     </w:p>
     <w:p>
@@ -1929,7 +1913,7 @@
           <w:rtl w:val="0"/>
           <w:lang w:val="en-US"/>
         </w:rPr>
-        <w:t>Learned and graph-structured memory control.</w:t>
+        <w:t>Learned memory control.</w:t>
       </w:r>
     </w:p>
     <w:p>
@@ -1945,7 +1929,7 @@
           <w:rtl w:val="0"/>
           <w:lang w:val="en-US"/>
         </w:rPr>
-        <w:t>Surveys organize agent memory by forms, functions, and dynamics</w:t>
+        <w:t>AgeMem</w:t>
       </w:r>
       <w:r>
         <w:rPr>
@@ -1961,87 +1945,7 @@
           <w:rtl w:val="0"/>
           <w:lang w:val="en-US"/>
         </w:rPr>
-        <w:t>(Hu et al. 2025) and graph memory by extraction, storage, retrieval, and evolution</w:t>
-      </w:r>
-      <w:r>
-        <w:rPr>
-          <w:rStyle w:val="无"/>
-          <w:rtl w:val="0"/>
-          <w:lang w:val="en-US"/>
-        </w:rPr>
-        <w:t> </w:t>
-      </w:r>
-      <w:r>
-        <w:rPr>
-          <w:rStyle w:val="无"/>
-          <w:rtl w:val="0"/>
-          <w:lang w:val="en-US"/>
-        </w:rPr>
-        <w:t>(Yang et al. 2026). GraphRAG</w:t>
-      </w:r>
-      <w:r>
-        <w:rPr>
-          <w:rStyle w:val="无"/>
-          <w:rtl w:val="0"/>
-          <w:lang w:val="en-US"/>
-        </w:rPr>
-        <w:t> </w:t>
-      </w:r>
-      <w:r>
-        <w:rPr>
-          <w:rStyle w:val="无"/>
-          <w:rtl w:val="0"/>
-          <w:lang w:val="en-US"/>
-        </w:rPr>
-        <w:t>(Edge et al. 2024) summarizes entity communities over a corpus, a different task from tracking one user</w:t>
-      </w:r>
-      <w:r>
-        <w:rPr>
-          <w:rStyle w:val="无"/>
-          <w:rtl w:val="0"/>
-          <w:lang w:val="en-US"/>
-        </w:rPr>
-        <w:t>’</w:t>
-      </w:r>
-      <w:r>
-        <w:rPr>
-          <w:rStyle w:val="无"/>
-          <w:rtl w:val="0"/>
-          <w:lang w:val="en-US"/>
-        </w:rPr>
-        <w:t>s preferences; AgeMem</w:t>
-      </w:r>
-      <w:r>
-        <w:rPr>
-          <w:rStyle w:val="无"/>
-          <w:rtl w:val="0"/>
-          <w:lang w:val="en-US"/>
-        </w:rPr>
-        <w:t> </w:t>
-      </w:r>
-      <w:r>
-        <w:rPr>
-          <w:rStyle w:val="无"/>
-          <w:rtl w:val="0"/>
-          <w:lang w:val="en-US"/>
-        </w:rPr>
-        <w:t>(Yu et al. 2026) learns when to store, retrieve, update, summarize, or discard; MRAgent</w:t>
-      </w:r>
-      <w:r>
-        <w:rPr>
-          <w:rStyle w:val="无"/>
-          <w:rtl w:val="0"/>
-          <w:lang w:val="en-US"/>
-        </w:rPr>
-        <w:t> </w:t>
-      </w:r>
-      <w:r>
-        <w:rPr>
-          <w:rStyle w:val="无"/>
-          <w:rtl w:val="0"/>
-          <w:lang w:val="en-US"/>
-        </w:rPr>
-        <w:t xml:space="preserve">(Ji et al. 2026) explores an associative memory graph guided by reasoning. Noesis uses fixed rules instead; its intended advantages (transparency, low overhead, portability) are not measured here beyond the latencies in </w:t>
+        <w:t xml:space="preserve">(Yu et al. 2026) learns when to store, retrieve, update, summarize, or discard memories. Noesis uses fixed rules instead; its intended advantages (transparency, low overhead, portability) are not measured here beyond the latencies in </w:t>
       </w:r>
       <w:r>
         <w:rPr>
@@ -2225,39 +2129,7 @@
           <w:rtl w:val="0"/>
           <w:lang w:val="en-US"/>
         </w:rPr>
-        <w:t>(Lewis et al. 2020) and successors such as Self-RAG</w:t>
-      </w:r>
-      <w:r>
-        <w:rPr>
-          <w:rStyle w:val="无"/>
-          <w:rtl w:val="0"/>
-          <w:lang w:val="en-US"/>
-        </w:rPr>
-        <w:t> </w:t>
-      </w:r>
-      <w:r>
-        <w:rPr>
-          <w:rStyle w:val="无"/>
-          <w:rtl w:val="0"/>
-          <w:lang w:val="en-US"/>
-        </w:rPr>
-        <w:t>(Asai et al. 2024) and FLARE</w:t>
-      </w:r>
-      <w:r>
-        <w:rPr>
-          <w:rStyle w:val="无"/>
-          <w:rtl w:val="0"/>
-          <w:lang w:val="en-US"/>
-        </w:rPr>
-        <w:t> </w:t>
-      </w:r>
-      <w:r>
-        <w:rPr>
-          <w:rStyle w:val="无"/>
-          <w:rtl w:val="0"/>
-          <w:lang w:val="en-US"/>
-        </w:rPr>
-        <w:t>(Jiang et al. 2023) improve per-query retrieval for corpus QA, not a user</w:t>
+        <w:t>(Lewis et al. 2020) and its successors improve per-query retrieval for corpus question answering, not a user</w:t>
       </w:r>
       <w:r>
         <w:rPr>
@@ -2341,23 +2213,7 @@
           <w:rtl w:val="0"/>
           <w:lang w:val="en-US"/>
         </w:rPr>
-        <w:t>PALR</w:t>
-      </w:r>
-      <w:r>
-        <w:rPr>
-          <w:rStyle w:val="无"/>
-          <w:rtl w:val="0"/>
-          <w:lang w:val="en-US"/>
-        </w:rPr>
-        <w:t> </w:t>
-      </w:r>
-      <w:r>
-        <w:rPr>
-          <w:rStyle w:val="无"/>
-          <w:rtl w:val="0"/>
-          <w:lang w:val="en-US"/>
-        </w:rPr>
-        <w:t>(Yang et al. 2023) and related work personalize outputs from interaction history, mostly for recommendation; chat vendors</w:t>
+        <w:t>Chat vendors</w:t>
       </w:r>
       <w:r>
         <w:rPr>
@@ -2373,7 +2229,7 @@
           <w:rtl w:val="0"/>
           <w:lang w:val="en-US"/>
         </w:rPr>
-        <w:t>memory features (e.g., ChatGPT memory) are per-product and closed. Noesis scopes memory to the user rather than the tool (</w:t>
+        <w:t>memory features (e.g., ChatGPT memory) are per-product and closed; Noesis scopes memory to the user rather than the tool (</w:t>
       </w:r>
       <w:r>
         <w:rPr>
@@ -2425,7 +2281,7 @@
           <w:rtl w:val="0"/>
           <w:lang w:val="en-US"/>
         </w:rPr>
-        <w:t>t-SNE</w:t>
+        <w:t>Force-directed layouts</w:t>
       </w:r>
       <w:r>
         <w:rPr>
@@ -2441,39 +2297,7 @@
           <w:rtl w:val="0"/>
           <w:lang w:val="en-US"/>
         </w:rPr>
-        <w:t>(Maaten and Hinton 2008) and UMAP</w:t>
-      </w:r>
-      <w:r>
-        <w:rPr>
-          <w:rStyle w:val="无"/>
-          <w:rtl w:val="0"/>
-          <w:lang w:val="en-US"/>
-        </w:rPr>
-        <w:t> </w:t>
-      </w:r>
-      <w:r>
-        <w:rPr>
-          <w:rStyle w:val="无"/>
-          <w:rtl w:val="0"/>
-          <w:lang w:val="en-US"/>
-        </w:rPr>
-        <w:t>(McInnes et al. 2018) project embeddings for inspection, and force-directed layouts</w:t>
-      </w:r>
-      <w:r>
-        <w:rPr>
-          <w:rStyle w:val="无"/>
-          <w:rtl w:val="0"/>
-          <w:lang w:val="en-US"/>
-        </w:rPr>
-        <w:t> </w:t>
-      </w:r>
-      <w:r>
-        <w:rPr>
-          <w:rStyle w:val="无"/>
-          <w:rtl w:val="0"/>
-          <w:lang w:val="en-US"/>
-        </w:rPr>
-        <w:t>(Fruchterman and Reingold 1991) model attraction and repulsion; the star map (</w:t>
+        <w:t>(Fruchterman and Reingold 1991) place points by attraction and repulsion; the star map (</w:t>
       </w:r>
       <w:r>
         <w:rPr>
@@ -2489,7 +2313,7 @@
           <w:rtl w:val="0"/>
           <w:lang w:val="en-US"/>
         </w:rPr>
-        <w:t>6) adds weak time and confidence springs to a 3D force-directed layout.</w:t>
+        <w:t>6) adds weak time and confidence springs to a 3D force-directed layout of thought embeddings.</w:t>
       </w:r>
       <w:bookmarkEnd w:id="5"/>
     </w:p>
@@ -7123,11 +6947,20 @@
       <w:r>
         <w:rPr>
           <w:rStyle w:val="无"/>
-          <w:rFonts w:ascii="Times New Roman" w:hAnsi="Times New Roman"/>
-          <w:rtl w:val="0"/>
-          <w:lang w:val="en-US"/>
-        </w:rPr>
-        <w:t>.</w:t>
+          <w:rFonts w:ascii="Times New Roman" w:hAnsi="Times New Roman" w:hint="default"/>
+          <w:rtl w:val="0"/>
+          <w:lang w:val="en-US"/>
+        </w:rPr>
+        <w:t> </w:t>
+      </w:r>
+      <w:r>
+        <w:rPr>
+          <w:rStyle w:val="无"/>
+          <w:rFonts w:ascii="Times New Roman" w:hAnsi="Times New Roman"/>
+          <w:rtl w:val="0"/>
+          <w:lang w:val="en-US"/>
+        </w:rPr>
+        <w:t>(McNemar 1947).</w:t>
       </w:r>
       <w:bookmarkEnd w:id="16"/>
     </w:p>
@@ -15789,6 +15622,7 @@
         </w:rPr>
         <w:t>Engineering blog, November 26, 2025. https://www.anthropic.com/engineering/effective-harnesses-for-long-running-agents.</w:t>
       </w:r>
+      <w:bookmarkEnd w:id="42"/>
     </w:p>
     <w:p>
       <w:pPr>
@@ -15798,25 +15632,15 @@
           <w:rFonts w:ascii="Times New Roman" w:cs="Times New Roman" w:hAnsi="Times New Roman" w:eastAsia="Times New Roman"/>
         </w:rPr>
       </w:pPr>
-      <w:r>
-        <w:rPr>
-          <w:rStyle w:val="无"/>
-          <w:rFonts w:ascii="Times New Roman" w:hAnsi="Times New Roman"/>
-          <w:rtl w:val="0"/>
-          <w:lang w:val="en-US"/>
-        </w:rPr>
-        <w:t>A</w:t>
-      </w:r>
-      <w:bookmarkEnd w:id="42"/>
-      <w:bookmarkStart w:name="refs" w:id="43"/>
-      <w:r>
-        <w:rPr>
-          <w:rStyle w:val="无"/>
-          <w:rFonts w:ascii="Times New Roman" w:hAnsi="Times New Roman"/>
-          <w:rtl w:val="0"/>
-          <w:lang w:val="en-US"/>
-        </w:rPr>
-        <w:t xml:space="preserve">sai, Akari, Zeqiu Wu, Yizhong Wang, Avirup Sil, and Hannaneh Hajishirzi. 2024. </w:t>
+      <w:bookmarkStart w:name="refmem0" w:id="43"/>
+      <w:r>
+        <w:rPr>
+          <w:rStyle w:val="无"/>
+          <w:rFonts w:ascii="Times New Roman" w:hAnsi="Times New Roman"/>
+          <w:rtl w:val="0"/>
+          <w:lang w:val="en-US"/>
+        </w:rPr>
+        <w:t xml:space="preserve">Chhikara, Prateek, Dev Khant, Sparsh Aryan, et al. 2025. </w:t>
       </w:r>
       <w:r>
         <w:rPr>
@@ -15834,7 +15658,7 @@
           <w:rtl w:val="0"/>
           <w:lang w:val="en-US"/>
         </w:rPr>
-        <w:t>Self-RAG: Learning to Retrieve, Generate, and Critique Through Self-Reflection.</w:t>
+        <w:t>Mem0: Building Production-Ready AI Agents with Scalable Long-Term Memory.</w:t>
       </w:r>
       <w:r>
         <w:rPr>
@@ -15854,12 +15678,70 @@
           <w:rtl w:val="0"/>
           <w:lang w:val="en-US"/>
         </w:rPr>
-        <w:t>International Conference on Learning Representations (ICLR)</w:t>
-      </w:r>
-      <w:r>
-        <w:rPr>
-          <w:rStyle w:val="无"/>
-          <w:rFonts w:ascii="Times New Roman" w:hAnsi="Times New Roman"/>
+        <w:t>arXiv Preprint arXiv:2504.19413</w:t>
+      </w:r>
+      <w:r>
+        <w:rPr>
+          <w:rStyle w:val="无"/>
+          <w:rFonts w:ascii="Times New Roman" w:hAnsi="Times New Roman"/>
+          <w:rtl w:val="0"/>
+          <w:lang w:val="en-US"/>
+        </w:rPr>
+        <w:t>.</w:t>
+      </w:r>
+    </w:p>
+    <w:p>
+      <w:pPr>
+        <w:pStyle w:val="Bibliography"/>
+        <w:rPr>
+          <w:rStyle w:val="无"/>
+        </w:rPr>
+      </w:pPr>
+      <w:r>
+        <w:rPr>
+          <w:rStyle w:val="无"/>
+          <w:rtl w:val="0"/>
+          <w:lang w:val="en-US"/>
+        </w:rPr>
+        <w:t xml:space="preserve">Dong, Shen, Shaochen Xu, Pengfei He, et al. 2025. </w:t>
+      </w:r>
+      <w:r>
+        <w:rPr>
+          <w:rStyle w:val="无"/>
+          <w:rtl w:val="0"/>
+          <w:lang w:val="en-US"/>
+        </w:rPr>
+        <w:t>“</w:t>
+      </w:r>
+      <w:r>
+        <w:rPr>
+          <w:rStyle w:val="无"/>
+          <w:rtl w:val="0"/>
+          <w:lang w:val="en-US"/>
+        </w:rPr>
+        <w:t>Memory Injection Attacks on LLM Agents via Query-Only Interaction.</w:t>
+      </w:r>
+      <w:r>
+        <w:rPr>
+          <w:rStyle w:val="无"/>
+          <w:rtl w:val="0"/>
+          <w:lang w:val="en-US"/>
+        </w:rPr>
+        <w:t xml:space="preserve">” </w:t>
+      </w:r>
+      <w:r>
+        <w:rPr>
+          <w:rStyle w:val="无"/>
+          <w:i w:val="1"/>
+          <w:iCs w:val="1"/>
+          <w:rtl w:val="0"/>
+          <w:lang w:val="en-US"/>
+        </w:rPr>
+        <w:t>arXiv Preprint arXiv:2503.03704</w:t>
+      </w:r>
+      <w:r>
+        <w:rPr>
+          <w:rStyle w:val="无"/>
           <w:rtl w:val="0"/>
           <w:lang w:val="en-US"/>
         </w:rPr>
@@ -15875,15 +15757,15 @@
           <w:rFonts w:ascii="Times New Roman" w:cs="Times New Roman" w:hAnsi="Times New Roman" w:eastAsia="Times New Roman"/>
         </w:rPr>
       </w:pPr>
-      <w:bookmarkStart w:name="refmem0" w:id="44"/>
-      <w:r>
-        <w:rPr>
-          <w:rStyle w:val="无"/>
-          <w:rFonts w:ascii="Times New Roman" w:hAnsi="Times New Roman"/>
-          <w:rtl w:val="0"/>
-          <w:lang w:val="en-US"/>
-        </w:rPr>
-        <w:t xml:space="preserve">Chhikara, Prateek, Dev Khant, Sparsh Aryan, et al. 2025. </w:t>
+      <w:bookmarkStart w:name="refforcedirected" w:id="44"/>
+      <w:r>
+        <w:rPr>
+          <w:rStyle w:val="无"/>
+          <w:rFonts w:ascii="Times New Roman" w:hAnsi="Times New Roman"/>
+          <w:rtl w:val="0"/>
+          <w:lang w:val="en-US"/>
+        </w:rPr>
+        <w:t xml:space="preserve">Fruchterman, Thomas M. J., and Edward M. Reingold. 1991. </w:t>
       </w:r>
       <w:r>
         <w:rPr>
@@ -15901,7 +15783,7 @@
           <w:rtl w:val="0"/>
           <w:lang w:val="en-US"/>
         </w:rPr>
-        <w:t>Mem0: Building Production-Ready AI Agents with Scalable Long-Term Memory.</w:t>
+        <w:t>Graph Drawing by Force-Directed Placement.</w:t>
       </w:r>
       <w:r>
         <w:rPr>
@@ -15921,16 +15803,34 @@
           <w:rtl w:val="0"/>
           <w:lang w:val="en-US"/>
         </w:rPr>
-        <w:t>arXiv Preprint arXiv:2504.19413</w:t>
-      </w:r>
-      <w:r>
-        <w:rPr>
-          <w:rStyle w:val="无"/>
-          <w:rFonts w:ascii="Times New Roman" w:hAnsi="Times New Roman"/>
-          <w:rtl w:val="0"/>
-          <w:lang w:val="en-US"/>
-        </w:rPr>
-        <w:t>.</w:t>
+        <w:t>Software: Practice and Experience</w:t>
+      </w:r>
+      <w:r>
+        <w:rPr>
+          <w:rStyle w:val="无"/>
+          <w:rFonts w:ascii="Times New Roman" w:hAnsi="Times New Roman"/>
+          <w:rtl w:val="0"/>
+          <w:lang w:val="en-US"/>
+        </w:rPr>
+        <w:t xml:space="preserve"> 21 (11): 1129</w:t>
+      </w:r>
+      <w:r>
+        <w:rPr>
+          <w:rStyle w:val="无"/>
+          <w:rFonts w:ascii="Times New Roman" w:hAnsi="Times New Roman" w:hint="default"/>
+          <w:rtl w:val="0"/>
+          <w:lang w:val="en-US"/>
+        </w:rPr>
+        <w:t>–</w:t>
+      </w:r>
+      <w:r>
+        <w:rPr>
+          <w:rStyle w:val="无"/>
+          <w:rFonts w:ascii="Times New Roman" w:hAnsi="Times New Roman"/>
+          <w:rtl w:val="0"/>
+          <w:lang w:val="en-US"/>
+        </w:rPr>
+        <w:t>64.</w:t>
       </w:r>
     </w:p>
     <w:p>
@@ -15946,7 +15846,7 @@
           <w:rtl w:val="0"/>
           <w:lang w:val="en-US"/>
         </w:rPr>
-        <w:t xml:space="preserve">Dong, Shen, Shaochen Xu, Pengfei He, et al. 2025. </w:t>
+        <w:t xml:space="preserve">Geifman, Yonatan, and Ran El-Yaniv. 2017. </w:t>
       </w:r>
       <w:r>
         <w:rPr>
@@ -15962,7 +15862,7 @@
           <w:rtl w:val="0"/>
           <w:lang w:val="en-US"/>
         </w:rPr>
-        <w:t>Memory Injection Attacks on LLM Agents via Query-Only Interaction.</w:t>
+        <w:t>Selective Classification for Deep Neural Networks.</w:t>
       </w:r>
       <w:r>
         <w:rPr>
@@ -15980,15 +15880,15 @@
           <w:rtl w:val="0"/>
           <w:lang w:val="en-US"/>
         </w:rPr>
-        <w:t>arXiv Preprint arXiv:2503.03704</w:t>
-      </w:r>
-      <w:r>
-        <w:rPr>
-          <w:rStyle w:val="无"/>
-          <w:rtl w:val="0"/>
-          <w:lang w:val="en-US"/>
-        </w:rPr>
-        <w:t>.</w:t>
+        <w:t>Advances in Neural Information Processing Systems</w:t>
+      </w:r>
+      <w:r>
+        <w:rPr>
+          <w:rStyle w:val="无"/>
+          <w:rtl w:val="0"/>
+          <w:lang w:val="en-US"/>
+        </w:rPr>
+        <w:t xml:space="preserve"> 30.</w:t>
       </w:r>
     </w:p>
     <w:p>
@@ -16004,7 +15904,7 @@
           <w:rtl w:val="0"/>
           <w:lang w:val="en-US"/>
         </w:rPr>
-        <w:t xml:space="preserve">Edge, Darren, Ha Trinh, Newman Cheng, et al. 2024. </w:t>
+        <w:t xml:space="preserve">Guo, Chuan, Geoff Pleiss, Yu Sun, and Kilian Q. Weinberger. 2017. </w:t>
       </w:r>
       <w:r>
         <w:rPr>
@@ -16020,7 +15920,7 @@
           <w:rtl w:val="0"/>
           <w:lang w:val="en-US"/>
         </w:rPr>
-        <w:t>From Local to Global: A Graph RAG Approach to Query-Focused Summarization.</w:t>
+        <w:t>On Calibration of Modern Neural Networks.</w:t>
       </w:r>
       <w:r>
         <w:rPr>
@@ -16038,40 +15938,53 @@
           <w:rtl w:val="0"/>
           <w:lang w:val="en-US"/>
         </w:rPr>
-        <w:t>arXiv Preprint arXiv:2404.16130</w:t>
-      </w:r>
-      <w:r>
-        <w:rPr>
-          <w:rStyle w:val="无"/>
-          <w:rtl w:val="0"/>
-          <w:lang w:val="en-US"/>
-        </w:rPr>
-        <w:t>.</w:t>
+        <w:t>Proceedings of the 34th International Conference on Machine Learning (ICML)</w:t>
+      </w:r>
+      <w:r>
+        <w:rPr>
+          <w:rStyle w:val="无"/>
+          <w:rtl w:val="0"/>
+          <w:lang w:val="en-US"/>
+        </w:rPr>
+        <w:t>, 1321</w:t>
+      </w:r>
+      <w:r>
+        <w:rPr>
+          <w:rStyle w:val="无"/>
+          <w:rtl w:val="0"/>
+          <w:lang w:val="en-US"/>
+        </w:rPr>
+        <w:t>–</w:t>
+      </w:r>
+      <w:r>
+        <w:rPr>
+          <w:rStyle w:val="无"/>
+          <w:rtl w:val="0"/>
+          <w:lang w:val="en-US"/>
+        </w:rPr>
+        <w:t>30.</w:t>
       </w:r>
       <w:bookmarkEnd w:id="44"/>
+      <w:bookmarkStart w:name="refflare" w:id="45"/>
     </w:p>
     <w:p>
       <w:pPr>
         <w:pStyle w:val="Bibliography"/>
         <w:rPr>
           <w:rStyle w:val="无"/>
-          <w:rFonts w:ascii="Times New Roman" w:cs="Times New Roman" w:hAnsi="Times New Roman" w:eastAsia="Times New Roman"/>
         </w:rPr>
       </w:pPr>
-      <w:bookmarkStart w:name="refforcedirected" w:id="45"/>
-      <w:r>
-        <w:rPr>
-          <w:rStyle w:val="无"/>
-          <w:rFonts w:ascii="Times New Roman" w:hAnsi="Times New Roman"/>
-          <w:rtl w:val="0"/>
-          <w:lang w:val="en-US"/>
-        </w:rPr>
-        <w:t xml:space="preserve">Fruchterman, Thomas M. J., and Edward M. Reingold. 1991. </w:t>
-      </w:r>
-      <w:r>
-        <w:rPr>
-          <w:rStyle w:val="无"/>
-          <w:rFonts w:ascii="Times New Roman" w:hAnsi="Times New Roman" w:hint="default"/>
+      <w:r>
+        <w:rPr>
+          <w:rStyle w:val="无"/>
+          <w:rtl w:val="0"/>
+          <w:lang w:val="en-US"/>
+        </w:rPr>
+        <w:t xml:space="preserve">LangChain. 2026. </w:t>
+      </w:r>
+      <w:r>
+        <w:rPr>
+          <w:rStyle w:val="无"/>
           <w:rtl w:val="0"/>
           <w:lang w:val="en-US"/>
         </w:rPr>
@@ -16080,16 +15993,14 @@
       <w:r>
         <w:rPr>
           <w:rStyle w:val="无"/>
-          <w:rFonts w:ascii="Times New Roman" w:hAnsi="Times New Roman"/>
-          <w:rtl w:val="0"/>
-          <w:lang w:val="en-US"/>
-        </w:rPr>
-        <w:t>Graph Drawing by Force-Directed Placement.</w:t>
-      </w:r>
-      <w:r>
-        <w:rPr>
-          <w:rStyle w:val="无"/>
-          <w:rFonts w:ascii="Times New Roman" w:hAnsi="Times New Roman" w:hint="default"/>
+          <w:rtl w:val="0"/>
+          <w:lang w:val="en-US"/>
+        </w:rPr>
+        <w:t>Persistence.</w:t>
+      </w:r>
+      <w:r>
+        <w:rPr>
+          <w:rStyle w:val="无"/>
           <w:rtl w:val="0"/>
           <w:lang w:val="en-US"/>
         </w:rPr>
@@ -16098,40 +16009,10 @@
       <w:r>
         <w:rPr>
           <w:rStyle w:val="无"/>
-          <w:rFonts w:ascii="Times New Roman" w:hAnsi="Times New Roman"/>
-          <w:i w:val="1"/>
-          <w:iCs w:val="1"/>
-          <w:rtl w:val="0"/>
-          <w:lang w:val="en-US"/>
-        </w:rPr>
-        <w:t>Software: Practice and Experience</w:t>
-      </w:r>
-      <w:r>
-        <w:rPr>
-          <w:rStyle w:val="无"/>
-          <w:rFonts w:ascii="Times New Roman" w:hAnsi="Times New Roman"/>
-          <w:rtl w:val="0"/>
-          <w:lang w:val="en-US"/>
-        </w:rPr>
-        <w:t xml:space="preserve"> 21 (11): 1129</w:t>
-      </w:r>
-      <w:r>
-        <w:rPr>
-          <w:rStyle w:val="无"/>
-          <w:rFonts w:ascii="Times New Roman" w:hAnsi="Times New Roman" w:hint="default"/>
-          <w:rtl w:val="0"/>
-          <w:lang w:val="en-US"/>
-        </w:rPr>
-        <w:t>–</w:t>
-      </w:r>
-      <w:r>
-        <w:rPr>
-          <w:rStyle w:val="无"/>
-          <w:rFonts w:ascii="Times New Roman" w:hAnsi="Times New Roman"/>
-          <w:rtl w:val="0"/>
-          <w:lang w:val="en-US"/>
-        </w:rPr>
-        <w:t>64.</w:t>
+          <w:rtl w:val="0"/>
+          <w:lang w:val="en-US"/>
+        </w:rPr>
+        <w:t>LangGraph documentation, accessed October 17, 2026. https://docs.langchain.com/oss/python/langgraph/persistence.</w:t>
       </w:r>
     </w:p>
     <w:p>
@@ -16147,7 +16028,23 @@
           <w:rtl w:val="0"/>
           <w:lang w:val="en-US"/>
         </w:rPr>
-        <w:t xml:space="preserve">Geifman, Yonatan, and Ran El-Yaniv. 2017. </w:t>
+        <w:t>Latimer, Christopher, Nicol</w:t>
+      </w:r>
+      <w:r>
+        <w:rPr>
+          <w:rStyle w:val="无"/>
+          <w:rtl w:val="0"/>
+          <w:lang w:val="en-US"/>
+        </w:rPr>
+        <w:t xml:space="preserve">ò </w:t>
+      </w:r>
+      <w:r>
+        <w:rPr>
+          <w:rStyle w:val="无"/>
+          <w:rtl w:val="0"/>
+          <w:lang w:val="en-US"/>
+        </w:rPr>
+        <w:t xml:space="preserve">Boschi, Andrew Neeser, et al. 2026. </w:t>
       </w:r>
       <w:r>
         <w:rPr>
@@ -16163,7 +16060,7 @@
           <w:rtl w:val="0"/>
           <w:lang w:val="en-US"/>
         </w:rPr>
-        <w:t>Selective Classification for Deep Neural Networks.</w:t>
+        <w:t>Hindsight: Structured Agent Memory That Retains, Recalls, and Reflects.</w:t>
       </w:r>
       <w:r>
         <w:rPr>
@@ -16181,73 +16078,15 @@
           <w:rtl w:val="0"/>
           <w:lang w:val="en-US"/>
         </w:rPr>
-        <w:t>Advances in Neural Information Processing Systems</w:t>
-      </w:r>
-      <w:r>
-        <w:rPr>
-          <w:rStyle w:val="无"/>
-          <w:rtl w:val="0"/>
-          <w:lang w:val="en-US"/>
-        </w:rPr>
-        <w:t xml:space="preserve"> 30.</w:t>
-      </w:r>
-    </w:p>
-    <w:p>
-      <w:pPr>
-        <w:pStyle w:val="Bibliography"/>
-        <w:rPr>
-          <w:rStyle w:val="无"/>
-        </w:rPr>
-      </w:pPr>
-      <w:r>
-        <w:rPr>
-          <w:rStyle w:val="无"/>
-          <w:rtl w:val="0"/>
-          <w:lang w:val="en-US"/>
-        </w:rPr>
-        <w:t xml:space="preserve">Guo, Chuan, Geoff Pleiss, Yu Sun, and Kilian Q. Weinberger. 2017. </w:t>
-      </w:r>
-      <w:r>
-        <w:rPr>
-          <w:rStyle w:val="无"/>
-          <w:rtl w:val="0"/>
-          <w:lang w:val="en-US"/>
-        </w:rPr>
-        <w:t>“</w:t>
-      </w:r>
-      <w:r>
-        <w:rPr>
-          <w:rStyle w:val="无"/>
-          <w:rtl w:val="0"/>
-          <w:lang w:val="en-US"/>
-        </w:rPr>
-        <w:t>On Calibration of Modern Neural Networks.</w:t>
-      </w:r>
-      <w:r>
-        <w:rPr>
-          <w:rStyle w:val="无"/>
-          <w:rtl w:val="0"/>
-          <w:lang w:val="en-US"/>
-        </w:rPr>
-        <w:t xml:space="preserve">” </w:t>
-      </w:r>
-      <w:r>
-        <w:rPr>
-          <w:rStyle w:val="无"/>
-          <w:i w:val="1"/>
-          <w:iCs w:val="1"/>
-          <w:rtl w:val="0"/>
-          <w:lang w:val="en-US"/>
-        </w:rPr>
-        <w:t>Proceedings of the 34th International Conference on Machine Learning (ICML)</w:t>
-      </w:r>
-      <w:r>
-        <w:rPr>
-          <w:rStyle w:val="无"/>
-          <w:rtl w:val="0"/>
-          <w:lang w:val="en-US"/>
-        </w:rPr>
-        <w:t>, 1321</w:t>
+        <w:t>Proceedings of the 64th Annual Meeting of the Association for Computational Linguistics (Volume 3: System Demonstrations)</w:t>
+      </w:r>
+      <w:r>
+        <w:rPr>
+          <w:rStyle w:val="无"/>
+          <w:rtl w:val="0"/>
+          <w:lang w:val="en-US"/>
+        </w:rPr>
+        <w:t>, 275</w:t>
       </w:r>
       <w:r>
         <w:rPr>
@@ -16263,123 +16102,7 @@
           <w:rtl w:val="0"/>
           <w:lang w:val="en-US"/>
         </w:rPr>
-        <w:t>30.</w:t>
-      </w:r>
-    </w:p>
-    <w:p>
-      <w:pPr>
-        <w:pStyle w:val="Bibliography"/>
-        <w:rPr>
-          <w:rStyle w:val="无"/>
-        </w:rPr>
-      </w:pPr>
-      <w:r>
-        <w:rPr>
-          <w:rStyle w:val="无"/>
-          <w:rtl w:val="0"/>
-          <w:lang w:val="en-US"/>
-        </w:rPr>
-        <w:t xml:space="preserve">Hu, Yuyang, Shichun Liu, Yanwei Yue, et al. 2025. </w:t>
-      </w:r>
-      <w:r>
-        <w:rPr>
-          <w:rStyle w:val="无"/>
-          <w:rtl w:val="0"/>
-          <w:lang w:val="en-US"/>
-        </w:rPr>
-        <w:t>“</w:t>
-      </w:r>
-      <w:r>
-        <w:rPr>
-          <w:rStyle w:val="无"/>
-          <w:rtl w:val="0"/>
-          <w:lang w:val="en-US"/>
-        </w:rPr>
-        <w:t>Memory in the Age of AI Agents.</w:t>
-      </w:r>
-      <w:r>
-        <w:rPr>
-          <w:rStyle w:val="无"/>
-          <w:rtl w:val="0"/>
-          <w:lang w:val="en-US"/>
-        </w:rPr>
-        <w:t xml:space="preserve">” </w:t>
-      </w:r>
-      <w:r>
-        <w:rPr>
-          <w:rStyle w:val="无"/>
-          <w:i w:val="1"/>
-          <w:iCs w:val="1"/>
-          <w:rtl w:val="0"/>
-          <w:lang w:val="en-US"/>
-        </w:rPr>
-        <w:t>arXiv Preprint arXiv:2512.13564</w:t>
-      </w:r>
-      <w:r>
-        <w:rPr>
-          <w:rStyle w:val="无"/>
-          <w:rtl w:val="0"/>
-          <w:lang w:val="en-US"/>
-        </w:rPr>
-        <w:t>.</w:t>
-      </w:r>
-    </w:p>
-    <w:p>
-      <w:pPr>
-        <w:pStyle w:val="Bibliography"/>
-        <w:rPr>
-          <w:rStyle w:val="无"/>
-        </w:rPr>
-      </w:pPr>
-      <w:r>
-        <w:rPr>
-          <w:rStyle w:val="无"/>
-          <w:rtl w:val="0"/>
-          <w:lang w:val="en-US"/>
-        </w:rPr>
-        <w:t xml:space="preserve">Ji, Shuo, Yibo Li, and Bryan Hooi. 2026. </w:t>
-      </w:r>
-      <w:r>
-        <w:rPr>
-          <w:rStyle w:val="无"/>
-          <w:rtl w:val="0"/>
-          <w:lang w:val="en-US"/>
-        </w:rPr>
-        <w:t>“</w:t>
-      </w:r>
-      <w:r>
-        <w:rPr>
-          <w:rStyle w:val="无"/>
-          <w:rtl w:val="0"/>
-          <w:lang w:val="en-US"/>
-        </w:rPr>
-        <w:t>Memory Is Reconstructed, Not Retrieved: Graph Memory for LLM Agents.</w:t>
-      </w:r>
-      <w:r>
-        <w:rPr>
-          <w:rStyle w:val="无"/>
-          <w:rtl w:val="0"/>
-          <w:lang w:val="en-US"/>
-        </w:rPr>
-        <w:t xml:space="preserve">” </w:t>
-      </w:r>
-      <w:r>
-        <w:rPr>
-          <w:rStyle w:val="无"/>
-          <w:i w:val="1"/>
-          <w:iCs w:val="1"/>
-          <w:rtl w:val="0"/>
-          <w:lang w:val="en-US"/>
-        </w:rPr>
-        <w:t>arXiv Preprint arXiv:2606.06036</w:t>
-      </w:r>
-      <w:r>
-        <w:rPr>
-          <w:rStyle w:val="无"/>
-          <w:rtl w:val="0"/>
-          <w:lang w:val="en-US"/>
-        </w:rPr>
-        <w:t>. ICML 2026.</w:t>
+        <w:t>85. https://doi.org/10.18653/v1/2026.acl-demo.27.</w:t>
       </w:r>
       <w:bookmarkEnd w:id="45"/>
     </w:p>
@@ -16391,15 +16114,15 @@
           <w:rFonts w:ascii="Times New Roman" w:cs="Times New Roman" w:hAnsi="Times New Roman" w:eastAsia="Times New Roman"/>
         </w:rPr>
       </w:pPr>
-      <w:bookmarkStart w:name="refflare" w:id="46"/>
-      <w:r>
-        <w:rPr>
-          <w:rStyle w:val="无"/>
-          <w:rFonts w:ascii="Times New Roman" w:hAnsi="Times New Roman"/>
-          <w:rtl w:val="0"/>
-          <w:lang w:val="en-US"/>
-        </w:rPr>
-        <w:t xml:space="preserve">Jiang, Zheng, Frank F. Xu, Luyu Gao, et al. 2023. </w:t>
+      <w:bookmarkStart w:name="reflewis2020rag" w:id="46"/>
+      <w:r>
+        <w:rPr>
+          <w:rStyle w:val="无"/>
+          <w:rFonts w:ascii="Times New Roman" w:hAnsi="Times New Roman"/>
+          <w:rtl w:val="0"/>
+          <w:lang w:val="en-US"/>
+        </w:rPr>
+        <w:t xml:space="preserve">Lewis, Patrick, Ethan Perez, Aleksandra Piktus, et al. 2020. </w:t>
       </w:r>
       <w:r>
         <w:rPr>
@@ -16417,7 +16140,7 @@
           <w:rtl w:val="0"/>
           <w:lang w:val="en-US"/>
         </w:rPr>
-        <w:t>Active Retrieval Augmented Generation.</w:t>
+        <w:t>Retrieval-Augmented Generation for Knowledge-Intensive NLP Tasks.</w:t>
       </w:r>
       <w:r>
         <w:rPr>
@@ -16437,16 +16160,16 @@
           <w:rtl w:val="0"/>
           <w:lang w:val="en-US"/>
         </w:rPr>
-        <w:t>Proceedings of the 2023 Conference on Empirical Methods in Natural Language Processing (EMNLP)</w:t>
-      </w:r>
-      <w:r>
-        <w:rPr>
-          <w:rStyle w:val="无"/>
-          <w:rFonts w:ascii="Times New Roman" w:hAnsi="Times New Roman"/>
-          <w:rtl w:val="0"/>
-          <w:lang w:val="en-US"/>
-        </w:rPr>
-        <w:t>, 7969</w:t>
+        <w:t>Advances in Neural Information Processing Systems</w:t>
+      </w:r>
+      <w:r>
+        <w:rPr>
+          <w:rStyle w:val="无"/>
+          <w:rFonts w:ascii="Times New Roman" w:hAnsi="Times New Roman"/>
+          <w:rtl w:val="0"/>
+          <w:lang w:val="en-US"/>
+        </w:rPr>
+        <w:t xml:space="preserve"> 33: 9459</w:t>
       </w:r>
       <w:r>
         <w:rPr>
@@ -16464,7 +16187,7 @@
           <w:rtl w:val="0"/>
           <w:lang w:val="en-US"/>
         </w:rPr>
-        <w:t>92.</w:t>
+        <w:t>74.</w:t>
       </w:r>
     </w:p>
     <w:p>
@@ -16480,7 +16203,7 @@
           <w:rtl w:val="0"/>
           <w:lang w:val="en-US"/>
         </w:rPr>
-        <w:t xml:space="preserve">LangChain. 2026. </w:t>
+        <w:t xml:space="preserve">Lin, Zehao, Xixuan Hao, Renyu Fu, et al. 2026. </w:t>
       </w:r>
       <w:r>
         <w:rPr>
@@ -16496,7 +16219,7 @@
           <w:rtl w:val="0"/>
           <w:lang w:val="en-US"/>
         </w:rPr>
-        <w:t>Persistence.</w:t>
+        <w:t>A Survey on Long-Term Memory Security in LLM Agents: Attacks, Defenses, and Governance Across the Memory Lifecycle.</w:t>
       </w:r>
       <w:r>
         <w:rPr>
@@ -16509,46 +16232,45 @@
       <w:r>
         <w:rPr>
           <w:rStyle w:val="无"/>
-          <w:rtl w:val="0"/>
-          <w:lang w:val="en-US"/>
-        </w:rPr>
-        <w:t>LangGraph documentation, accessed October 17, 2026. https://docs.langchain.com/oss/python/langgraph/persistence.</w:t>
-      </w:r>
+          <w:i w:val="1"/>
+          <w:iCs w:val="1"/>
+          <w:rtl w:val="0"/>
+          <w:lang w:val="en-US"/>
+        </w:rPr>
+        <w:t>arXiv Preprint arXiv:2604.16548</w:t>
+      </w:r>
+      <w:r>
+        <w:rPr>
+          <w:rStyle w:val="无"/>
+          <w:rtl w:val="0"/>
+          <w:lang w:val="en-US"/>
+        </w:rPr>
+        <w:t>. EMNLP 2026.</w:t>
+      </w:r>
+      <w:bookmarkEnd w:id="46"/>
+      <w:bookmarkStart w:name="reftsne" w:id="47"/>
     </w:p>
     <w:p>
       <w:pPr>
         <w:pStyle w:val="Bibliography"/>
         <w:rPr>
           <w:rStyle w:val="无"/>
+          <w:rFonts w:ascii="Times New Roman" w:cs="Times New Roman" w:hAnsi="Times New Roman" w:eastAsia="Times New Roman"/>
         </w:rPr>
       </w:pPr>
       <w:r>
         <w:rPr>
           <w:rStyle w:val="无"/>
-          <w:rtl w:val="0"/>
-          <w:lang w:val="en-US"/>
-        </w:rPr>
-        <w:t>Latimer, Christopher, Nicol</w:t>
-      </w:r>
-      <w:r>
-        <w:rPr>
-          <w:rStyle w:val="无"/>
-          <w:rtl w:val="0"/>
-          <w:lang w:val="en-US"/>
-        </w:rPr>
-        <w:t xml:space="preserve">ò </w:t>
-      </w:r>
-      <w:r>
-        <w:rPr>
-          <w:rStyle w:val="无"/>
-          <w:rtl w:val="0"/>
-          <w:lang w:val="en-US"/>
-        </w:rPr>
-        <w:t xml:space="preserve">Boschi, Andrew Neeser, et al. 2026. </w:t>
-      </w:r>
-      <w:r>
-        <w:rPr>
-          <w:rStyle w:val="无"/>
+          <w:rFonts w:ascii="Times New Roman" w:hAnsi="Times New Roman"/>
+          <w:rtl w:val="0"/>
+          <w:lang w:val="en-US"/>
+        </w:rPr>
+        <w:t xml:space="preserve">Maharana, Adyasha, Dong-Ho Lee, Sergey Tulyakov, Mohit Bansal, Francesco Barbieri, and Yuwei Fang. 2024. </w:t>
+      </w:r>
+      <w:r>
+        <w:rPr>
+          <w:rStyle w:val="无"/>
+          <w:rFonts w:ascii="Times New Roman" w:hAnsi="Times New Roman" w:hint="default"/>
           <w:rtl w:val="0"/>
           <w:lang w:val="en-US"/>
         </w:rPr>
@@ -16557,14 +16279,16 @@
       <w:r>
         <w:rPr>
           <w:rStyle w:val="无"/>
-          <w:rtl w:val="0"/>
-          <w:lang w:val="en-US"/>
-        </w:rPr>
-        <w:t>Hindsight: Structured Agent Memory That Retains, Recalls, and Reflects.</w:t>
-      </w:r>
-      <w:r>
-        <w:rPr>
-          <w:rStyle w:val="无"/>
+          <w:rFonts w:ascii="Times New Roman" w:hAnsi="Times New Roman"/>
+          <w:rtl w:val="0"/>
+          <w:lang w:val="en-US"/>
+        </w:rPr>
+        <w:t>Evaluating Very Long-Term Conversational Memory of LLM Agents.</w:t>
+      </w:r>
+      <w:r>
+        <w:rPr>
+          <w:rStyle w:val="无"/>
+          <w:rFonts w:ascii="Times New Roman" w:hAnsi="Times New Roman" w:hint="default"/>
           <w:rtl w:val="0"/>
           <w:lang w:val="en-US"/>
         </w:rPr>
@@ -16573,38 +16297,25 @@
       <w:r>
         <w:rPr>
           <w:rStyle w:val="无"/>
+          <w:rFonts w:ascii="Times New Roman" w:hAnsi="Times New Roman"/>
           <w:i w:val="1"/>
           <w:iCs w:val="1"/>
           <w:rtl w:val="0"/>
           <w:lang w:val="en-US"/>
         </w:rPr>
-        <w:t>Proceedings of the 64th Annual Meeting of the Association for Computational Linguistics (Volume 3: System Demonstrations)</w:t>
-      </w:r>
-      <w:r>
-        <w:rPr>
-          <w:rStyle w:val="无"/>
-          <w:rtl w:val="0"/>
-          <w:lang w:val="en-US"/>
-        </w:rPr>
-        <w:t>, 275</w:t>
-      </w:r>
-      <w:r>
-        <w:rPr>
-          <w:rStyle w:val="无"/>
-          <w:rtl w:val="0"/>
-          <w:lang w:val="en-US"/>
-        </w:rPr>
-        <w:t>–</w:t>
-      </w:r>
-      <w:r>
-        <w:rPr>
-          <w:rStyle w:val="无"/>
-          <w:rtl w:val="0"/>
-          <w:lang w:val="en-US"/>
-        </w:rPr>
-        <w:t>85. https://doi.org/10.18653/v1/2026.acl-demo.27.</w:t>
-      </w:r>
-      <w:bookmarkEnd w:id="46"/>
+        <w:t>Proceedings of the 62nd Annual Meeting of the Association for Computational Linguistics (ACL)</w:t>
+      </w:r>
+      <w:r>
+        <w:rPr>
+          <w:rStyle w:val="无"/>
+          <w:rFonts w:ascii="Times New Roman" w:hAnsi="Times New Roman"/>
+          <w:rtl w:val="0"/>
+          <w:lang w:val="en-US"/>
+        </w:rPr>
+        <w:t>.</w:t>
+      </w:r>
+      <w:bookmarkEnd w:id="47"/>
+      <w:bookmarkStart w:name="refumap" w:id="48"/>
     </w:p>
     <w:p>
       <w:pPr>
@@ -16614,15 +16325,14 @@
           <w:rFonts w:ascii="Times New Roman" w:cs="Times New Roman" w:hAnsi="Times New Roman" w:eastAsia="Times New Roman"/>
         </w:rPr>
       </w:pPr>
-      <w:bookmarkStart w:name="reflewis2020rag" w:id="47"/>
-      <w:r>
-        <w:rPr>
-          <w:rStyle w:val="无"/>
-          <w:rFonts w:ascii="Times New Roman" w:hAnsi="Times New Roman"/>
-          <w:rtl w:val="0"/>
-          <w:lang w:val="en-US"/>
-        </w:rPr>
-        <w:t xml:space="preserve">Lewis, Patrick, Ethan Perez, Aleksandra Piktus, et al. 2020. </w:t>
+      <w:r>
+        <w:rPr>
+          <w:rStyle w:val="无"/>
+          <w:rFonts w:ascii="Times New Roman" w:hAnsi="Times New Roman"/>
+          <w:rtl w:val="0"/>
+          <w:lang w:val="en-US"/>
+        </w:rPr>
+        <w:t xml:space="preserve">McNemar, Quinn. 1947. </w:t>
       </w:r>
       <w:r>
         <w:rPr>
@@ -16640,7 +16350,7 @@
           <w:rtl w:val="0"/>
           <w:lang w:val="en-US"/>
         </w:rPr>
-        <w:t>Retrieval-Augmented Generation for Knowledge-Intensive NLP Tasks.</w:t>
+        <w:t>Note on the Sampling Error of the Difference Between Correlated Proportions or Percentages.</w:t>
       </w:r>
       <w:r>
         <w:rPr>
@@ -16660,16 +16370,16 @@
           <w:rtl w:val="0"/>
           <w:lang w:val="en-US"/>
         </w:rPr>
-        <w:t>Advances in Neural Information Processing Systems</w:t>
-      </w:r>
-      <w:r>
-        <w:rPr>
-          <w:rStyle w:val="无"/>
-          <w:rFonts w:ascii="Times New Roman" w:hAnsi="Times New Roman"/>
-          <w:rtl w:val="0"/>
-          <w:lang w:val="en-US"/>
-        </w:rPr>
-        <w:t xml:space="preserve"> 33: 9459</w:t>
+        <w:t>Psychometrika</w:t>
+      </w:r>
+      <w:r>
+        <w:rPr>
+          <w:rStyle w:val="无"/>
+          <w:rFonts w:ascii="Times New Roman" w:hAnsi="Times New Roman"/>
+          <w:rtl w:val="0"/>
+          <w:lang w:val="en-US"/>
+        </w:rPr>
+        <w:t xml:space="preserve"> 12 (2): 153</w:t>
       </w:r>
       <w:r>
         <w:rPr>
@@ -16687,7 +16397,7 @@
           <w:rtl w:val="0"/>
           <w:lang w:val="en-US"/>
         </w:rPr>
-        <w:t>74.</w:t>
+        <w:t>57.</w:t>
       </w:r>
     </w:p>
     <w:p>
@@ -16695,19 +16405,22 @@
         <w:pStyle w:val="Bibliography"/>
         <w:rPr>
           <w:rStyle w:val="无"/>
+          <w:rFonts w:ascii="Times New Roman" w:cs="Times New Roman" w:hAnsi="Times New Roman" w:eastAsia="Times New Roman"/>
         </w:rPr>
       </w:pPr>
       <w:r>
         <w:rPr>
           <w:rStyle w:val="无"/>
-          <w:rtl w:val="0"/>
-          <w:lang w:val="en-US"/>
-        </w:rPr>
-        <w:t xml:space="preserve">Lin, Zehao, Xixuan Hao, Renyu Fu, et al. 2026. </w:t>
-      </w:r>
-      <w:r>
-        <w:rPr>
-          <w:rStyle w:val="无"/>
+          <w:rFonts w:ascii="Times New Roman" w:hAnsi="Times New Roman"/>
+          <w:rtl w:val="0"/>
+          <w:lang w:val="en-US"/>
+        </w:rPr>
+        <w:t xml:space="preserve">Mem0. 2025. </w:t>
+      </w:r>
+      <w:r>
+        <w:rPr>
+          <w:rStyle w:val="无"/>
+          <w:rFonts w:ascii="Times New Roman" w:hAnsi="Times New Roman" w:hint="default"/>
           <w:rtl w:val="0"/>
           <w:lang w:val="en-US"/>
         </w:rPr>
@@ -16716,14 +16429,16 @@
       <w:r>
         <w:rPr>
           <w:rStyle w:val="无"/>
-          <w:rtl w:val="0"/>
-          <w:lang w:val="en-US"/>
-        </w:rPr>
-        <w:t>A Survey on Long-Term Memory Security in LLM Agents: Attacks, Defenses, and Governance Across the Memory Lifecycle.</w:t>
-      </w:r>
-      <w:r>
-        <w:rPr>
-          <w:rStyle w:val="无"/>
+          <w:rFonts w:ascii="Times New Roman" w:hAnsi="Times New Roman"/>
+          <w:rtl w:val="0"/>
+          <w:lang w:val="en-US"/>
+        </w:rPr>
+        <w:t>Introducing OpenMemory MCP.</w:t>
+      </w:r>
+      <w:r>
+        <w:rPr>
+          <w:rStyle w:val="无"/>
+          <w:rFonts w:ascii="Times New Roman" w:hAnsi="Times New Roman" w:hint="default"/>
           <w:rtl w:val="0"/>
           <w:lang w:val="en-US"/>
         </w:rPr>
@@ -16732,45 +16447,31 @@
       <w:r>
         <w:rPr>
           <w:rStyle w:val="无"/>
-          <w:i w:val="1"/>
-          <w:iCs w:val="1"/>
-          <w:rtl w:val="0"/>
-          <w:lang w:val="en-US"/>
-        </w:rPr>
-        <w:t>arXiv Preprint arXiv:2604.16548</w:t>
-      </w:r>
-      <w:r>
-        <w:rPr>
-          <w:rStyle w:val="无"/>
-          <w:rtl w:val="0"/>
-          <w:lang w:val="en-US"/>
-        </w:rPr>
-        <w:t>. EMNLP 2026.</w:t>
-      </w:r>
-      <w:bookmarkEnd w:id="47"/>
+          <w:rFonts w:ascii="Times New Roman" w:hAnsi="Times New Roman"/>
+          <w:rtl w:val="0"/>
+          <w:lang w:val="en-US"/>
+        </w:rPr>
+        <w:t>Vendor announcement, Mem0 blog, May 13, 2025. https://mem0.ai/blog/introducing-openmemory-mcp.</w:t>
+      </w:r>
     </w:p>
     <w:p>
       <w:pPr>
         <w:pStyle w:val="Bibliography"/>
         <w:rPr>
           <w:rStyle w:val="无"/>
-          <w:rFonts w:ascii="Times New Roman" w:cs="Times New Roman" w:hAnsi="Times New Roman" w:eastAsia="Times New Roman"/>
         </w:rPr>
       </w:pPr>
-      <w:bookmarkStart w:name="reftsne" w:id="48"/>
-      <w:r>
-        <w:rPr>
-          <w:rStyle w:val="无"/>
-          <w:rFonts w:ascii="Times New Roman" w:hAnsi="Times New Roman"/>
-          <w:rtl w:val="0"/>
-          <w:lang w:val="en-US"/>
-        </w:rPr>
-        <w:t xml:space="preserve">Maaten, Laurens van der, and Geoffrey Hinton. 2008. </w:t>
-      </w:r>
-      <w:r>
-        <w:rPr>
-          <w:rStyle w:val="无"/>
-          <w:rFonts w:ascii="Times New Roman" w:hAnsi="Times New Roman" w:hint="default"/>
+      <w:r>
+        <w:rPr>
+          <w:rStyle w:val="无"/>
+          <w:rtl w:val="0"/>
+          <w:lang w:val="en-US"/>
+        </w:rPr>
+        <w:t xml:space="preserve">Model Context Protocol. 2026. </w:t>
+      </w:r>
+      <w:r>
+        <w:rPr>
+          <w:rStyle w:val="无"/>
           <w:rtl w:val="0"/>
           <w:lang w:val="en-US"/>
         </w:rPr>
@@ -16779,16 +16480,14 @@
       <w:r>
         <w:rPr>
           <w:rStyle w:val="无"/>
-          <w:rFonts w:ascii="Times New Roman" w:hAnsi="Times New Roman"/>
-          <w:rtl w:val="0"/>
-          <w:lang w:val="en-US"/>
-        </w:rPr>
-        <w:t>Visualizing Data Using t-SNE.</w:t>
-      </w:r>
-      <w:r>
-        <w:rPr>
-          <w:rStyle w:val="无"/>
-          <w:rFonts w:ascii="Times New Roman" w:hAnsi="Times New Roman" w:hint="default"/>
+          <w:rtl w:val="0"/>
+          <w:lang w:val="en-US"/>
+        </w:rPr>
+        <w:t>Model Context Protocol Specification, Revision 2026-07-28.</w:t>
+      </w:r>
+      <w:r>
+        <w:rPr>
+          <w:rStyle w:val="无"/>
           <w:rtl w:val="0"/>
           <w:lang w:val="en-US"/>
         </w:rPr>
@@ -16797,105 +16496,10 @@
       <w:r>
         <w:rPr>
           <w:rStyle w:val="无"/>
-          <w:rFonts w:ascii="Times New Roman" w:hAnsi="Times New Roman"/>
-          <w:i w:val="1"/>
-          <w:iCs w:val="1"/>
-          <w:rtl w:val="0"/>
-          <w:lang w:val="en-US"/>
-        </w:rPr>
-        <w:t>Journal of Machine Learning Research</w:t>
-      </w:r>
-      <w:r>
-        <w:rPr>
-          <w:rStyle w:val="无"/>
-          <w:rFonts w:ascii="Times New Roman" w:hAnsi="Times New Roman"/>
-          <w:rtl w:val="0"/>
-          <w:lang w:val="en-US"/>
-        </w:rPr>
-        <w:t xml:space="preserve"> 9: 2579</w:t>
-      </w:r>
-      <w:r>
-        <w:rPr>
-          <w:rStyle w:val="无"/>
-          <w:rFonts w:ascii="Times New Roman" w:hAnsi="Times New Roman" w:hint="default"/>
-          <w:rtl w:val="0"/>
-          <w:lang w:val="en-US"/>
-        </w:rPr>
-        <w:t>–</w:t>
-      </w:r>
-      <w:r>
-        <w:rPr>
-          <w:rStyle w:val="无"/>
-          <w:rFonts w:ascii="Times New Roman" w:hAnsi="Times New Roman"/>
-          <w:rtl w:val="0"/>
-          <w:lang w:val="en-US"/>
-        </w:rPr>
-        <w:t>605.</w:t>
-      </w:r>
-    </w:p>
-    <w:p>
-      <w:pPr>
-        <w:pStyle w:val="Bibliography"/>
-        <w:rPr>
-          <w:rStyle w:val="无"/>
-          <w:rFonts w:ascii="Times New Roman" w:cs="Times New Roman" w:hAnsi="Times New Roman" w:eastAsia="Times New Roman"/>
-        </w:rPr>
-      </w:pPr>
-      <w:r>
-        <w:rPr>
-          <w:rStyle w:val="无"/>
-          <w:rFonts w:ascii="Times New Roman" w:hAnsi="Times New Roman"/>
-          <w:rtl w:val="0"/>
-          <w:lang w:val="en-US"/>
-        </w:rPr>
-        <w:t xml:space="preserve">Maharana, Adyasha, Dong-Ho Lee, Sergey Tulyakov, Mohit Bansal, Francesco Barbieri, and Yuwei Fang. 2024. </w:t>
-      </w:r>
-      <w:r>
-        <w:rPr>
-          <w:rStyle w:val="无"/>
-          <w:rFonts w:ascii="Times New Roman" w:hAnsi="Times New Roman" w:hint="default"/>
-          <w:rtl w:val="0"/>
-          <w:lang w:val="en-US"/>
-        </w:rPr>
-        <w:t>“</w:t>
-      </w:r>
-      <w:r>
-        <w:rPr>
-          <w:rStyle w:val="无"/>
-          <w:rFonts w:ascii="Times New Roman" w:hAnsi="Times New Roman"/>
-          <w:rtl w:val="0"/>
-          <w:lang w:val="en-US"/>
-        </w:rPr>
-        <w:t>Evaluating Very Long-Term Conversational Memory of LLM Agents.</w:t>
-      </w:r>
-      <w:r>
-        <w:rPr>
-          <w:rStyle w:val="无"/>
-          <w:rFonts w:ascii="Times New Roman" w:hAnsi="Times New Roman" w:hint="default"/>
-          <w:rtl w:val="0"/>
-          <w:lang w:val="en-US"/>
-        </w:rPr>
-        <w:t xml:space="preserve">” </w:t>
-      </w:r>
-      <w:r>
-        <w:rPr>
-          <w:rStyle w:val="无"/>
-          <w:rFonts w:ascii="Times New Roman" w:hAnsi="Times New Roman"/>
-          <w:i w:val="1"/>
-          <w:iCs w:val="1"/>
-          <w:rtl w:val="0"/>
-          <w:lang w:val="en-US"/>
-        </w:rPr>
-        <w:t>Proceedings of the 62nd Annual Meeting of the Association for Computational Linguistics (ACL)</w:t>
-      </w:r>
-      <w:r>
-        <w:rPr>
-          <w:rStyle w:val="无"/>
-          <w:rFonts w:ascii="Times New Roman" w:hAnsi="Times New Roman"/>
-          <w:rtl w:val="0"/>
-          <w:lang w:val="en-US"/>
-        </w:rPr>
-        <w:t>.</w:t>
+          <w:rtl w:val="0"/>
+          <w:lang w:val="en-US"/>
+        </w:rPr>
+        <w:t>Accessed October 17, 2026. https://modelcontextprotocol.io/specification/2026-07-28/architecture.</w:t>
       </w:r>
       <w:bookmarkEnd w:id="48"/>
     </w:p>
@@ -16907,15 +16511,15 @@
           <w:rFonts w:ascii="Times New Roman" w:cs="Times New Roman" w:hAnsi="Times New Roman" w:eastAsia="Times New Roman"/>
         </w:rPr>
       </w:pPr>
-      <w:bookmarkStart w:name="refumap" w:id="49"/>
-      <w:r>
-        <w:rPr>
-          <w:rStyle w:val="无"/>
-          <w:rFonts w:ascii="Times New Roman" w:hAnsi="Times New Roman"/>
-          <w:rtl w:val="0"/>
-          <w:lang w:val="en-US"/>
-        </w:rPr>
-        <w:t xml:space="preserve">McInnes, Leland, John Healy, and James Melville. 2018. </w:t>
+      <w:bookmarkStart w:name="refmemgpt" w:id="49"/>
+      <w:r>
+        <w:rPr>
+          <w:rStyle w:val="无"/>
+          <w:rFonts w:ascii="Times New Roman" w:hAnsi="Times New Roman"/>
+          <w:rtl w:val="0"/>
+          <w:lang w:val="en-US"/>
+        </w:rPr>
+        <w:t xml:space="preserve">Packer, Charles, Vivian Fang, Shishir G. Patil, Kevin Lin, Sarah Wooders, and Joseph E. Gonzalez. 2023. </w:t>
       </w:r>
       <w:r>
         <w:rPr>
@@ -16933,7 +16537,7 @@
           <w:rtl w:val="0"/>
           <w:lang w:val="en-US"/>
         </w:rPr>
-        <w:t>UMAP: Uniform Manifold Approximation and Projection for Dimension Reduction.</w:t>
+        <w:t>MemGPT: Towards LLMs as Operating Systems.</w:t>
       </w:r>
       <w:r>
         <w:rPr>
@@ -16953,7 +16557,7 @@
           <w:rtl w:val="0"/>
           <w:lang w:val="en-US"/>
         </w:rPr>
-        <w:t>arXiv Preprint arXiv:1802.03426</w:t>
+        <w:t>arXiv Preprint arXiv:2310.08560</w:t>
       </w:r>
       <w:r>
         <w:rPr>
@@ -16980,7 +16584,7 @@
           <w:rtl w:val="0"/>
           <w:lang w:val="en-US"/>
         </w:rPr>
-        <w:t xml:space="preserve">Mem0. 2025. </w:t>
+        <w:t>Park, Joon Sung, Joseph C. O</w:t>
       </w:r>
       <w:r>
         <w:rPr>
@@ -16989,6 +16593,24 @@
           <w:rtl w:val="0"/>
           <w:lang w:val="en-US"/>
         </w:rPr>
+        <w:t>’</w:t>
+      </w:r>
+      <w:r>
+        <w:rPr>
+          <w:rStyle w:val="无"/>
+          <w:rFonts w:ascii="Times New Roman" w:hAnsi="Times New Roman"/>
+          <w:rtl w:val="0"/>
+          <w:lang w:val="en-US"/>
+        </w:rPr>
+        <w:t xml:space="preserve">Brien, Carrie J. Cai, Meredith Ringel Morris, Percy Liang, and Michael S. Bernstein. 2023. </w:t>
+      </w:r>
+      <w:r>
+        <w:rPr>
+          <w:rStyle w:val="无"/>
+          <w:rFonts w:ascii="Times New Roman" w:hAnsi="Times New Roman" w:hint="default"/>
+          <w:rtl w:val="0"/>
+          <w:lang w:val="en-US"/>
+        </w:rPr>
         <w:t>“</w:t>
       </w:r>
       <w:r>
@@ -16998,7 +16620,7 @@
           <w:rtl w:val="0"/>
           <w:lang w:val="en-US"/>
         </w:rPr>
-        <w:t>Introducing OpenMemory MCP.</w:t>
+        <w:t>Generative Agents: Interactive Simulacra of Human Behavior.</w:t>
       </w:r>
       <w:r>
         <w:rPr>
@@ -17013,10 +16635,21 @@
         <w:rPr>
           <w:rStyle w:val="无"/>
           <w:rFonts w:ascii="Times New Roman" w:hAnsi="Times New Roman"/>
-          <w:rtl w:val="0"/>
-          <w:lang w:val="en-US"/>
-        </w:rPr>
-        <w:t>Vendor announcement, Mem0 blog, May 13, 2025. https://mem0.ai/blog/introducing-openmemory-mcp.</w:t>
+          <w:i w:val="1"/>
+          <w:iCs w:val="1"/>
+          <w:rtl w:val="0"/>
+          <w:lang w:val="en-US"/>
+        </w:rPr>
+        <w:t>Proceedings of the 36th Annual ACM Symposium on User Interface Software and Technology (UIST)</w:t>
+      </w:r>
+      <w:r>
+        <w:rPr>
+          <w:rStyle w:val="无"/>
+          <w:rFonts w:ascii="Times New Roman" w:hAnsi="Times New Roman"/>
+          <w:rtl w:val="0"/>
+          <w:lang w:val="en-US"/>
+        </w:rPr>
+        <w:t>.</w:t>
       </w:r>
     </w:p>
     <w:p>
@@ -17024,19 +16657,22 @@
         <w:pStyle w:val="Bibliography"/>
         <w:rPr>
           <w:rStyle w:val="无"/>
+          <w:rFonts w:ascii="Times New Roman" w:cs="Times New Roman" w:hAnsi="Times New Roman" w:eastAsia="Times New Roman"/>
         </w:rPr>
       </w:pPr>
       <w:r>
         <w:rPr>
           <w:rStyle w:val="无"/>
-          <w:rtl w:val="0"/>
-          <w:lang w:val="en-US"/>
-        </w:rPr>
-        <w:t xml:space="preserve">Model Context Protocol. 2026. </w:t>
-      </w:r>
-      <w:r>
-        <w:rPr>
-          <w:rStyle w:val="无"/>
+          <w:rFonts w:ascii="Times New Roman" w:hAnsi="Times New Roman"/>
+          <w:rtl w:val="0"/>
+          <w:lang w:val="en-US"/>
+        </w:rPr>
+        <w:t xml:space="preserve">Rasmussen, Preston, Pavlo Paliychuk, Travis Beauvais, Jack Ryan, and Daniel Chalef. 2025. </w:t>
+      </w:r>
+      <w:r>
+        <w:rPr>
+          <w:rStyle w:val="无"/>
+          <w:rFonts w:ascii="Times New Roman" w:hAnsi="Times New Roman" w:hint="default"/>
           <w:rtl w:val="0"/>
           <w:lang w:val="en-US"/>
         </w:rPr>
@@ -17045,14 +16681,16 @@
       <w:r>
         <w:rPr>
           <w:rStyle w:val="无"/>
-          <w:rtl w:val="0"/>
-          <w:lang w:val="en-US"/>
-        </w:rPr>
-        <w:t>Model Context Protocol Specification, Revision 2026-07-28.</w:t>
-      </w:r>
-      <w:r>
-        <w:rPr>
-          <w:rStyle w:val="无"/>
+          <w:rFonts w:ascii="Times New Roman" w:hAnsi="Times New Roman"/>
+          <w:rtl w:val="0"/>
+          <w:lang w:val="en-US"/>
+        </w:rPr>
+        <w:t>Zep: A Temporal Knowledge Graph Architecture for Agent Memory.</w:t>
+      </w:r>
+      <w:r>
+        <w:rPr>
+          <w:rStyle w:val="无"/>
+          <w:rFonts w:ascii="Times New Roman" w:hAnsi="Times New Roman" w:hint="default"/>
           <w:rtl w:val="0"/>
           <w:lang w:val="en-US"/>
         </w:rPr>
@@ -17061,12 +16699,23 @@
       <w:r>
         <w:rPr>
           <w:rStyle w:val="无"/>
-          <w:rtl w:val="0"/>
-          <w:lang w:val="en-US"/>
-        </w:rPr>
-        <w:t>Accessed October 17, 2026. https://modelcontextprotocol.io/specification/2026-07-28/architecture.</w:t>
-      </w:r>
-      <w:bookmarkEnd w:id="49"/>
+          <w:rFonts w:ascii="Times New Roman" w:hAnsi="Times New Roman"/>
+          <w:i w:val="1"/>
+          <w:iCs w:val="1"/>
+          <w:rtl w:val="0"/>
+          <w:lang w:val="en-US"/>
+        </w:rPr>
+        <w:t>arXiv Preprint arXiv:2501.13956</w:t>
+      </w:r>
+      <w:r>
+        <w:rPr>
+          <w:rStyle w:val="无"/>
+          <w:rFonts w:ascii="Times New Roman" w:hAnsi="Times New Roman"/>
+          <w:rtl w:val="0"/>
+          <w:lang w:val="en-US"/>
+        </w:rPr>
+        <w:t>.</w:t>
+      </w:r>
     </w:p>
     <w:p>
       <w:pPr>
@@ -17076,15 +16725,14 @@
           <w:rFonts w:ascii="Times New Roman" w:cs="Times New Roman" w:hAnsi="Times New Roman" w:eastAsia="Times New Roman"/>
         </w:rPr>
       </w:pPr>
-      <w:bookmarkStart w:name="refmemgpt" w:id="50"/>
-      <w:r>
-        <w:rPr>
-          <w:rStyle w:val="无"/>
-          <w:rFonts w:ascii="Times New Roman" w:hAnsi="Times New Roman"/>
-          <w:rtl w:val="0"/>
-          <w:lang w:val="en-US"/>
-        </w:rPr>
-        <w:t xml:space="preserve">Packer, Charles, Vivian Fang, Shishir G. Patil, Kevin Lin, Sarah Wooders, and Joseph E. Gonzalez. 2023. </w:t>
+      <w:r>
+        <w:rPr>
+          <w:rStyle w:val="无"/>
+          <w:rFonts w:ascii="Times New Roman" w:hAnsi="Times New Roman"/>
+          <w:rtl w:val="0"/>
+          <w:lang w:val="en-US"/>
+        </w:rPr>
+        <w:t xml:space="preserve">Wu, Di, Hongwei Wang, Wenhao Yu, Yuwei Zhang, Kai-Wei Chang, and Dong Yu. 2025. </w:t>
       </w:r>
       <w:r>
         <w:rPr>
@@ -17102,7 +16750,7 @@
           <w:rtl w:val="0"/>
           <w:lang w:val="en-US"/>
         </w:rPr>
-        <w:t>MemGPT: Towards LLMs as Operating Systems.</w:t>
+        <w:t>LongMemEval: Benchmarking Chat Assistants on Long-Term Interactive Memory.</w:t>
       </w:r>
       <w:r>
         <w:rPr>
@@ -17122,7 +16770,7 @@
           <w:rtl w:val="0"/>
           <w:lang w:val="en-US"/>
         </w:rPr>
-        <w:t>arXiv Preprint arXiv:2310.08560</w:t>
+        <w:t>International Conference on Learning Representations (ICLR)</w:t>
       </w:r>
       <w:r>
         <w:rPr>
@@ -17149,7 +16797,7 @@
           <w:rtl w:val="0"/>
           <w:lang w:val="en-US"/>
         </w:rPr>
-        <w:t>Park, Joon Sung, Joseph C. O</w:t>
+        <w:t xml:space="preserve">Xu, Wujiang, Zujie Liang, Kai Mei, Hang Gao, Juntao Tan, and Yongfeng Zhang. 2025. </w:t>
       </w:r>
       <w:r>
         <w:rPr>
@@ -17158,24 +16806,6 @@
           <w:rtl w:val="0"/>
           <w:lang w:val="en-US"/>
         </w:rPr>
-        <w:t>’</w:t>
-      </w:r>
-      <w:r>
-        <w:rPr>
-          <w:rStyle w:val="无"/>
-          <w:rFonts w:ascii="Times New Roman" w:hAnsi="Times New Roman"/>
-          <w:rtl w:val="0"/>
-          <w:lang w:val="en-US"/>
-        </w:rPr>
-        <w:t xml:space="preserve">Brien, Carrie J. Cai, Meredith Ringel Morris, Percy Liang, and Michael S. Bernstein. 2023. </w:t>
-      </w:r>
-      <w:r>
-        <w:rPr>
-          <w:rStyle w:val="无"/>
-          <w:rFonts w:ascii="Times New Roman" w:hAnsi="Times New Roman" w:hint="default"/>
-          <w:rtl w:val="0"/>
-          <w:lang w:val="en-US"/>
-        </w:rPr>
         <w:t>“</w:t>
       </w:r>
       <w:r>
@@ -17185,7 +16815,7 @@
           <w:rtl w:val="0"/>
           <w:lang w:val="en-US"/>
         </w:rPr>
-        <w:t>Generative Agents: Interactive Simulacra of Human Behavior.</w:t>
+        <w:t>A-MEM: Agentic Memory for LLM Agents.</w:t>
       </w:r>
       <w:r>
         <w:rPr>
@@ -17205,7 +16835,7 @@
           <w:rtl w:val="0"/>
           <w:lang w:val="en-US"/>
         </w:rPr>
-        <w:t>Proceedings of the 36th Annual ACM Symposium on User Interface Software and Technology (UIST)</w:t>
+        <w:t>Advances in Neural Information Processing Systems (NeurIPS)</w:t>
       </w:r>
       <w:r>
         <w:rPr>
@@ -17216,384 +16846,8 @@
         </w:rPr>
         <w:t>.</w:t>
       </w:r>
-    </w:p>
-    <w:p>
-      <w:pPr>
-        <w:pStyle w:val="Bibliography"/>
-        <w:rPr>
-          <w:rStyle w:val="无"/>
-          <w:rFonts w:ascii="Times New Roman" w:cs="Times New Roman" w:hAnsi="Times New Roman" w:eastAsia="Times New Roman"/>
-        </w:rPr>
-      </w:pPr>
-      <w:r>
-        <w:rPr>
-          <w:rStyle w:val="无"/>
-          <w:rFonts w:ascii="Times New Roman" w:hAnsi="Times New Roman"/>
-          <w:rtl w:val="0"/>
-          <w:lang w:val="en-US"/>
-        </w:rPr>
-        <w:t xml:space="preserve">Rasmussen, Preston, Pavlo Paliychuk, Travis Beauvais, Jack Ryan, and Daniel Chalef. 2025. </w:t>
-      </w:r>
-      <w:r>
-        <w:rPr>
-          <w:rStyle w:val="无"/>
-          <w:rFonts w:ascii="Times New Roman" w:hAnsi="Times New Roman" w:hint="default"/>
-          <w:rtl w:val="0"/>
-          <w:lang w:val="en-US"/>
-        </w:rPr>
-        <w:t>“</w:t>
-      </w:r>
-      <w:r>
-        <w:rPr>
-          <w:rStyle w:val="无"/>
-          <w:rFonts w:ascii="Times New Roman" w:hAnsi="Times New Roman"/>
-          <w:rtl w:val="0"/>
-          <w:lang w:val="en-US"/>
-        </w:rPr>
-        <w:t>Zep: A Temporal Knowledge Graph Architecture for Agent Memory.</w:t>
-      </w:r>
-      <w:r>
-        <w:rPr>
-          <w:rStyle w:val="无"/>
-          <w:rFonts w:ascii="Times New Roman" w:hAnsi="Times New Roman" w:hint="default"/>
-          <w:rtl w:val="0"/>
-          <w:lang w:val="en-US"/>
-        </w:rPr>
-        <w:t xml:space="preserve">” </w:t>
-      </w:r>
-      <w:r>
-        <w:rPr>
-          <w:rStyle w:val="无"/>
-          <w:rFonts w:ascii="Times New Roman" w:hAnsi="Times New Roman"/>
-          <w:i w:val="1"/>
-          <w:iCs w:val="1"/>
-          <w:rtl w:val="0"/>
-          <w:lang w:val="en-US"/>
-        </w:rPr>
-        <w:t>arXiv Preprint arXiv:2501.13956</w:t>
-      </w:r>
-      <w:r>
-        <w:rPr>
-          <w:rStyle w:val="无"/>
-          <w:rFonts w:ascii="Times New Roman" w:hAnsi="Times New Roman"/>
-          <w:rtl w:val="0"/>
-          <w:lang w:val="en-US"/>
-        </w:rPr>
-        <w:t>.</w:t>
-      </w:r>
-    </w:p>
-    <w:p>
-      <w:pPr>
-        <w:pStyle w:val="Bibliography"/>
-        <w:rPr>
-          <w:rStyle w:val="无"/>
-          <w:rFonts w:ascii="Times New Roman" w:cs="Times New Roman" w:hAnsi="Times New Roman" w:eastAsia="Times New Roman"/>
-        </w:rPr>
-      </w:pPr>
-      <w:r>
-        <w:rPr>
-          <w:rStyle w:val="无"/>
-          <w:rFonts w:ascii="Times New Roman" w:hAnsi="Times New Roman"/>
-          <w:rtl w:val="0"/>
-          <w:lang w:val="en-US"/>
-        </w:rPr>
-        <w:t xml:space="preserve">Wu, Di, Hongwei Wang, Wenhao Yu, Yuwei Zhang, Kai-Wei Chang, and Dong Yu. 2025. </w:t>
-      </w:r>
-      <w:r>
-        <w:rPr>
-          <w:rStyle w:val="无"/>
-          <w:rFonts w:ascii="Times New Roman" w:hAnsi="Times New Roman" w:hint="default"/>
-          <w:rtl w:val="0"/>
-          <w:lang w:val="en-US"/>
-        </w:rPr>
-        <w:t>“</w:t>
-      </w:r>
-      <w:r>
-        <w:rPr>
-          <w:rStyle w:val="无"/>
-          <w:rFonts w:ascii="Times New Roman" w:hAnsi="Times New Roman"/>
-          <w:rtl w:val="0"/>
-          <w:lang w:val="en-US"/>
-        </w:rPr>
-        <w:t>LongMemEval: Benchmarking Chat Assistants on Long-Term Interactive Memory.</w:t>
-      </w:r>
-      <w:r>
-        <w:rPr>
-          <w:rStyle w:val="无"/>
-          <w:rFonts w:ascii="Times New Roman" w:hAnsi="Times New Roman" w:hint="default"/>
-          <w:rtl w:val="0"/>
-          <w:lang w:val="en-US"/>
-        </w:rPr>
-        <w:t xml:space="preserve">” </w:t>
-      </w:r>
-      <w:r>
-        <w:rPr>
-          <w:rStyle w:val="无"/>
-          <w:rFonts w:ascii="Times New Roman" w:hAnsi="Times New Roman"/>
-          <w:i w:val="1"/>
-          <w:iCs w:val="1"/>
-          <w:rtl w:val="0"/>
-          <w:lang w:val="en-US"/>
-        </w:rPr>
-        <w:t>International Conference on Learning Representations (ICLR)</w:t>
-      </w:r>
-      <w:r>
-        <w:rPr>
-          <w:rStyle w:val="无"/>
-          <w:rFonts w:ascii="Times New Roman" w:hAnsi="Times New Roman"/>
-          <w:rtl w:val="0"/>
-          <w:lang w:val="en-US"/>
-        </w:rPr>
-        <w:t>.</w:t>
-      </w:r>
-    </w:p>
-    <w:p>
-      <w:pPr>
-        <w:pStyle w:val="Bibliography"/>
-        <w:rPr>
-          <w:rStyle w:val="无"/>
-        </w:rPr>
-      </w:pPr>
-      <w:r>
-        <w:rPr>
-          <w:rStyle w:val="无"/>
-          <w:rtl w:val="0"/>
-          <w:lang w:val="en-US"/>
-        </w:rPr>
-        <w:t xml:space="preserve">Wu, Di, Zixiang Ji, Asmi Kawatkar, et al. 2026. </w:t>
-      </w:r>
-      <w:r>
-        <w:rPr>
-          <w:rStyle w:val="无"/>
-          <w:rtl w:val="0"/>
-          <w:lang w:val="en-US"/>
-        </w:rPr>
-        <w:t>“</w:t>
-      </w:r>
-      <w:r>
-        <w:rPr>
-          <w:rStyle w:val="无"/>
-          <w:rtl w:val="0"/>
-          <w:lang w:val="en-US"/>
-        </w:rPr>
-        <w:t>LongMemEval-V2: Evaluating Long-Term Agent Memory Toward Experienced Colleagues.</w:t>
-      </w:r>
-      <w:r>
-        <w:rPr>
-          <w:rStyle w:val="无"/>
-          <w:rtl w:val="0"/>
-          <w:lang w:val="en-US"/>
-        </w:rPr>
-        <w:t xml:space="preserve">” </w:t>
-      </w:r>
-      <w:r>
-        <w:rPr>
-          <w:rStyle w:val="无"/>
-          <w:i w:val="1"/>
-          <w:iCs w:val="1"/>
-          <w:rtl w:val="0"/>
-          <w:lang w:val="en-US"/>
-        </w:rPr>
-        <w:t>arXiv Preprint arXiv:2605.12493</w:t>
-      </w:r>
-      <w:r>
-        <w:rPr>
-          <w:rStyle w:val="无"/>
-          <w:rtl w:val="0"/>
-          <w:lang w:val="en-US"/>
-        </w:rPr>
-        <w:t>. Work in progress.</w:t>
-      </w:r>
-    </w:p>
-    <w:p>
-      <w:pPr>
-        <w:pStyle w:val="Bibliography"/>
-        <w:rPr>
-          <w:rStyle w:val="无"/>
-          <w:rFonts w:ascii="Times New Roman" w:cs="Times New Roman" w:hAnsi="Times New Roman" w:eastAsia="Times New Roman"/>
-        </w:rPr>
-      </w:pPr>
-      <w:r>
-        <w:rPr>
-          <w:rStyle w:val="无"/>
-          <w:rFonts w:ascii="Times New Roman" w:hAnsi="Times New Roman"/>
-          <w:rtl w:val="0"/>
-          <w:lang w:val="en-US"/>
-        </w:rPr>
-        <w:t xml:space="preserve">Xu, Wujiang, Zujie Liang, Kai Mei, Hang Gao, Juntao Tan, and Yongfeng Zhang. 2025. </w:t>
-      </w:r>
-      <w:r>
-        <w:rPr>
-          <w:rStyle w:val="无"/>
-          <w:rFonts w:ascii="Times New Roman" w:hAnsi="Times New Roman" w:hint="default"/>
-          <w:rtl w:val="0"/>
-          <w:lang w:val="en-US"/>
-        </w:rPr>
-        <w:t>“</w:t>
-      </w:r>
-      <w:r>
-        <w:rPr>
-          <w:rStyle w:val="无"/>
-          <w:rFonts w:ascii="Times New Roman" w:hAnsi="Times New Roman"/>
-          <w:rtl w:val="0"/>
-          <w:lang w:val="en-US"/>
-        </w:rPr>
-        <w:t>A-MEM: Agentic Memory for LLM Agents.</w:t>
-      </w:r>
-      <w:r>
-        <w:rPr>
-          <w:rStyle w:val="无"/>
-          <w:rFonts w:ascii="Times New Roman" w:hAnsi="Times New Roman" w:hint="default"/>
-          <w:rtl w:val="0"/>
-          <w:lang w:val="en-US"/>
-        </w:rPr>
-        <w:t xml:space="preserve">” </w:t>
-      </w:r>
-      <w:r>
-        <w:rPr>
-          <w:rStyle w:val="无"/>
-          <w:rFonts w:ascii="Times New Roman" w:hAnsi="Times New Roman"/>
-          <w:i w:val="1"/>
-          <w:iCs w:val="1"/>
-          <w:rtl w:val="0"/>
-          <w:lang w:val="en-US"/>
-        </w:rPr>
-        <w:t>Advances in Neural Information Processing Systems (NeurIPS)</w:t>
-      </w:r>
-      <w:r>
-        <w:rPr>
-          <w:rStyle w:val="无"/>
-          <w:rFonts w:ascii="Times New Roman" w:hAnsi="Times New Roman"/>
-          <w:rtl w:val="0"/>
-          <w:lang w:val="en-US"/>
-        </w:rPr>
-        <w:t>.</w:t>
-      </w:r>
-    </w:p>
-    <w:p>
-      <w:pPr>
-        <w:pStyle w:val="Bibliography"/>
-        <w:rPr>
-          <w:rStyle w:val="无"/>
-        </w:rPr>
-      </w:pPr>
-      <w:r>
-        <w:rPr>
-          <w:rStyle w:val="无"/>
-          <w:rtl w:val="0"/>
-          <w:lang w:val="en-US"/>
-        </w:rPr>
-        <w:t xml:space="preserve">Yang, Chang, Chuang Zhou, Yilin Xiao, et al. 2026. </w:t>
-      </w:r>
-      <w:r>
-        <w:rPr>
-          <w:rStyle w:val="无"/>
-          <w:rtl w:val="0"/>
-          <w:lang w:val="en-US"/>
-        </w:rPr>
-        <w:t>“</w:t>
-      </w:r>
-      <w:r>
-        <w:rPr>
-          <w:rStyle w:val="无"/>
-          <w:rtl w:val="0"/>
-          <w:lang w:val="en-US"/>
-        </w:rPr>
-        <w:t>Graph-Based Agent Memory: Taxonomy, Techniques, and Applications.</w:t>
-      </w:r>
-      <w:r>
-        <w:rPr>
-          <w:rStyle w:val="无"/>
-          <w:rtl w:val="0"/>
-          <w:lang w:val="en-US"/>
-        </w:rPr>
-        <w:t xml:space="preserve">” </w:t>
-      </w:r>
-      <w:r>
-        <w:rPr>
-          <w:rStyle w:val="无"/>
-          <w:i w:val="1"/>
-          <w:iCs w:val="1"/>
-          <w:rtl w:val="0"/>
-          <w:lang w:val="en-US"/>
-        </w:rPr>
-        <w:t>arXiv Preprint arXiv:2602.05665</w:t>
-      </w:r>
-      <w:r>
-        <w:rPr>
-          <w:rStyle w:val="无"/>
-          <w:rtl w:val="0"/>
-          <w:lang w:val="en-US"/>
-        </w:rPr>
-        <w:t>.</w:t>
-      </w:r>
-      <w:bookmarkEnd w:id="50"/>
-    </w:p>
-    <w:p>
-      <w:pPr>
-        <w:pStyle w:val="Bibliography"/>
-        <w:rPr>
-          <w:rStyle w:val="无"/>
-          <w:rFonts w:ascii="Times New Roman" w:cs="Times New Roman" w:hAnsi="Times New Roman" w:eastAsia="Times New Roman"/>
-        </w:rPr>
-      </w:pPr>
-      <w:bookmarkStart w:name="refpalr" w:id="51"/>
-      <w:r>
-        <w:rPr>
-          <w:rStyle w:val="无"/>
-          <w:rFonts w:ascii="Times New Roman" w:hAnsi="Times New Roman"/>
-          <w:rtl w:val="0"/>
-          <w:lang w:val="en-US"/>
-        </w:rPr>
-        <w:t xml:space="preserve">Yang, Liangwei, Zhiwei Chen, Lixin Xia, Chen Yang, Yu Zhang, and Ben Kao. 2023. </w:t>
-      </w:r>
-      <w:r>
-        <w:rPr>
-          <w:rStyle w:val="无"/>
-          <w:rFonts w:ascii="Times New Roman" w:hAnsi="Times New Roman" w:hint="default"/>
-          <w:rtl w:val="0"/>
-          <w:lang w:val="en-US"/>
-        </w:rPr>
-        <w:t>“</w:t>
-      </w:r>
-      <w:r>
-        <w:rPr>
-          <w:rStyle w:val="无"/>
-          <w:rFonts w:ascii="Times New Roman" w:hAnsi="Times New Roman"/>
-          <w:rtl w:val="0"/>
-          <w:lang w:val="en-US"/>
-        </w:rPr>
-        <w:t>PALR: Personalization Aware LLMs for Recommendation.</w:t>
-      </w:r>
-      <w:r>
-        <w:rPr>
-          <w:rStyle w:val="无"/>
-          <w:rFonts w:ascii="Times New Roman" w:hAnsi="Times New Roman" w:hint="default"/>
-          <w:rtl w:val="0"/>
-          <w:lang w:val="en-US"/>
-        </w:rPr>
-        <w:t xml:space="preserve">” </w:t>
-      </w:r>
-      <w:r>
-        <w:rPr>
-          <w:rStyle w:val="无"/>
-          <w:rFonts w:ascii="Times New Roman" w:hAnsi="Times New Roman"/>
-          <w:i w:val="1"/>
-          <w:iCs w:val="1"/>
-          <w:rtl w:val="0"/>
-          <w:lang w:val="en-US"/>
-        </w:rPr>
-        <w:t>arXiv Preprint arXiv:2305.07622</w:t>
-      </w:r>
-      <w:r>
-        <w:rPr>
-          <w:rStyle w:val="无"/>
-          <w:rFonts w:ascii="Times New Roman" w:hAnsi="Times New Roman"/>
-          <w:rtl w:val="0"/>
-          <w:lang w:val="en-US"/>
-        </w:rPr>
-        <w:t>.</w:t>
-      </w:r>
+      <w:bookmarkEnd w:id="49"/>
+      <w:bookmarkStart w:name="refpalr" w:id="50"/>
     </w:p>
     <w:p>
       <w:pPr>
@@ -17713,7 +16967,7 @@
         </w:rPr>
         <w:t>.</w:t>
       </w:r>
-      <w:bookmarkEnd w:id="51"/>
+      <w:bookmarkEnd w:id="50"/>
     </w:p>
     <w:sectPr>
       <w:headerReference w:type="default" r:id="rId10"/>

</xml_diff>

<commit_message>
docs(paper): restore the reviewer's suggested references; relabel Figure 3
- bring back the seven sources the external review pointed to: the agent-
  memory and graph-memory surveys, GraphRAG, MRAgent, LongMemEval-V2, graph
  networks (Battaglia et al.), and Anthropic's 2026 harness article
- "Learned and graph-structured memory control" regains its survey,
  GraphRAG and MRAgent sentences; the benchmark, harness and structured-
  injection sentences cite the rest; docs/related_systems.md regains MRAgent
- Figure 3's y-axis now reads "Keyword-hit rate", matching the text
- 28 references; verify_paper.py 81/81

Co-Authored-By: Claude Opus 5.5 <noreply@anthropic.com>
</commit_message>
<xml_diff>
--- a/paper/noesis_paper.docx
+++ b/paper/noesis_paper.docx
@@ -1753,7 +1753,7 @@
           <w:rtl w:val="0"/>
           <w:lang w:val="en-US"/>
         </w:rPr>
-        <w:t>(Maharana et al. 2024) and LongMemEval</w:t>
+        <w:t>(Maharana et al. 2024), LongMemEval</w:t>
       </w:r>
       <w:r>
         <w:rPr>
@@ -1769,7 +1769,23 @@
           <w:rtl w:val="0"/>
           <w:lang w:val="en-US"/>
         </w:rPr>
-        <w:t>(Wu et al. 2025) are not yet used here.</w:t>
+        <w:t>(Wu et al. 2025), and the in-progress LongMemEval-V2</w:t>
+      </w:r>
+      <w:r>
+        <w:rPr>
+          <w:rStyle w:val="无"/>
+          <w:rtl w:val="0"/>
+          <w:lang w:val="en-US"/>
+        </w:rPr>
+        <w:t> </w:t>
+      </w:r>
+      <w:r>
+        <w:rPr>
+          <w:rStyle w:val="无"/>
+          <w:rtl w:val="0"/>
+          <w:lang w:val="en-US"/>
+        </w:rPr>
+        <w:t>(Wu et al. 2026) are not yet used here.</w:t>
       </w:r>
     </w:p>
     <w:p>
@@ -1913,7 +1929,7 @@
           <w:rtl w:val="0"/>
           <w:lang w:val="en-US"/>
         </w:rPr>
-        <w:t>Learned memory control.</w:t>
+        <w:t>Learned and graph-structured memory control.</w:t>
       </w:r>
     </w:p>
     <w:p>
@@ -1929,7 +1945,7 @@
           <w:rtl w:val="0"/>
           <w:lang w:val="en-US"/>
         </w:rPr>
-        <w:t>AgeMem</w:t>
+        <w:t>Surveys organize agent memory by forms, functions, and dynamics</w:t>
       </w:r>
       <w:r>
         <w:rPr>
@@ -1945,7 +1961,87 @@
           <w:rtl w:val="0"/>
           <w:lang w:val="en-US"/>
         </w:rPr>
-        <w:t xml:space="preserve">(Yu et al. 2026) learns when to store, retrieve, update, summarize, or discard memories. Noesis uses fixed rules instead; its intended advantages (transparency, low overhead, portability) are not measured here beyond the latencies in </w:t>
+        <w:t>(Hu et al. 2025) and graph memory by extraction, storage, retrieval, and evolution</w:t>
+      </w:r>
+      <w:r>
+        <w:rPr>
+          <w:rStyle w:val="无"/>
+          <w:rtl w:val="0"/>
+          <w:lang w:val="en-US"/>
+        </w:rPr>
+        <w:t> </w:t>
+      </w:r>
+      <w:r>
+        <w:rPr>
+          <w:rStyle w:val="无"/>
+          <w:rtl w:val="0"/>
+          <w:lang w:val="en-US"/>
+        </w:rPr>
+        <w:t>(Yang et al. 2026). GraphRAG</w:t>
+      </w:r>
+      <w:r>
+        <w:rPr>
+          <w:rStyle w:val="无"/>
+          <w:rtl w:val="0"/>
+          <w:lang w:val="en-US"/>
+        </w:rPr>
+        <w:t> </w:t>
+      </w:r>
+      <w:r>
+        <w:rPr>
+          <w:rStyle w:val="无"/>
+          <w:rtl w:val="0"/>
+          <w:lang w:val="en-US"/>
+        </w:rPr>
+        <w:t>(Edge et al. 2024) summarizes entity communities across a corpus, a different task from tracking one user</w:t>
+      </w:r>
+      <w:r>
+        <w:rPr>
+          <w:rStyle w:val="无"/>
+          <w:rtl w:val="0"/>
+          <w:lang w:val="en-US"/>
+        </w:rPr>
+        <w:t>’</w:t>
+      </w:r>
+      <w:r>
+        <w:rPr>
+          <w:rStyle w:val="无"/>
+          <w:rtl w:val="0"/>
+          <w:lang w:val="en-US"/>
+        </w:rPr>
+        <w:t>s preferences. AgeMem</w:t>
+      </w:r>
+      <w:r>
+        <w:rPr>
+          <w:rStyle w:val="无"/>
+          <w:rtl w:val="0"/>
+          <w:lang w:val="en-US"/>
+        </w:rPr>
+        <w:t> </w:t>
+      </w:r>
+      <w:r>
+        <w:rPr>
+          <w:rStyle w:val="无"/>
+          <w:rtl w:val="0"/>
+          <w:lang w:val="en-US"/>
+        </w:rPr>
+        <w:t>(Yu et al. 2026) learns when to store, retrieve, update, summarize, or discard memories, and MRAgent</w:t>
+      </w:r>
+      <w:r>
+        <w:rPr>
+          <w:rStyle w:val="无"/>
+          <w:rtl w:val="0"/>
+          <w:lang w:val="en-US"/>
+        </w:rPr>
+        <w:t> </w:t>
+      </w:r>
+      <w:r>
+        <w:rPr>
+          <w:rStyle w:val="无"/>
+          <w:rtl w:val="0"/>
+          <w:lang w:val="en-US"/>
+        </w:rPr>
+        <w:t xml:space="preserve">(Ji et al. 2026) explores an associative memory graph guided by reasoning. Noesis uses fixed rules instead; its intended advantages (transparency, low overhead, portability) are not measured here beyond the latencies in </w:t>
       </w:r>
       <w:r>
         <w:rPr>
@@ -8441,13 +8537,13 @@
           <wp:inline distT="0" distB="0" distL="0" distR="0">
             <wp:extent cx="4800600" cy="3574299"/>
             <wp:effectExtent l="0" t="0" r="0" b="0"/>
-            <wp:docPr id="1073741827" name="officeArt object" descr="fig3_ab_comparison.pdf"/>
+            <wp:docPr id="1073741827" name="officeArt object" descr="fig3_ab_comparison.png"/>
             <wp:cNvGraphicFramePr/>
             <a:graphic xmlns:a="http://schemas.openxmlformats.org/drawingml/2006/main">
               <a:graphicData uri="http://schemas.openxmlformats.org/drawingml/2006/picture">
                 <pic:pic xmlns:pic="http://schemas.openxmlformats.org/drawingml/2006/picture">
                   <pic:nvPicPr>
-                    <pic:cNvPr id="1073741827" name="fig3_ab_comparison.pdf" descr="fig3_ab_comparison.pdf"/>
+                    <pic:cNvPr id="1073741827" name="fig3_ab_comparison.png" descr="fig3_ab_comparison.png"/>
                     <pic:cNvPicPr>
                       <a:picLocks noChangeAspect="1"/>
                     </pic:cNvPicPr>
@@ -8456,6 +8552,7 @@
                     <a:blip r:embed="rId6">
                       <a:extLst/>
                     </a:blip>
+                    <a:srcRect l="28" t="0" r="28" b="0"/>
                     <a:stretch>
                       <a:fillRect/>
                     </a:stretch>
@@ -14159,7 +14256,23 @@
           <w:rtl w:val="0"/>
           <w:lang w:val="en-US"/>
         </w:rPr>
-        <w:t>(Anthropic 2025); Noesis would serve inside one as memory, not orchestration, though this is neither implemented nor evaluated here. The harness would insert approved memories for the current user, project, and scope as a bounded, sourced block and send back candidate memories with their sources; Noesis could fill LangGraph</w:t>
+        <w:t>(Anthropic 2025), and useful scaffolding changes as models improve</w:t>
+      </w:r>
+      <w:r>
+        <w:rPr>
+          <w:rStyle w:val="无"/>
+          <w:rtl w:val="0"/>
+          <w:lang w:val="en-US"/>
+        </w:rPr>
+        <w:t> </w:t>
+      </w:r>
+      <w:r>
+        <w:rPr>
+          <w:rStyle w:val="无"/>
+          <w:rtl w:val="0"/>
+          <w:lang w:val="en-US"/>
+        </w:rPr>
+        <w:t>(Anthropic 2026); Noesis would serve inside one as memory, not orchestration, though this is neither implemented nor evaluated here. The harness would insert approved memories for the current user, project, and scope as a bounded, sourced block and send back candidate memories with their sources; Noesis could fill LangGraph</w:t>
       </w:r>
       <w:r>
         <w:rPr>
@@ -14768,7 +14881,25 @@
           <w:rtl w:val="0"/>
           <w:lang w:val="en-US"/>
         </w:rPr>
-        <w:t>(Rasmussen et al. 2025); derived claims are not independent evidence, so graph centrality should not raise confidence, and the deciding test crosses flat and graph-backed stores with and without the same gate.</w:t>
+        <w:t>(Rasmussen et al. 2025); derived claims are not independent evidence, so graph centrality should not raise confidence, and the deciding test crosses flat and graph-backed stores with and without the same gate. A graph neural network</w:t>
+      </w:r>
+      <w:r>
+        <w:rPr>
+          <w:rStyle w:val="无"/>
+          <w:rFonts w:ascii="Times New Roman" w:hAnsi="Times New Roman" w:hint="default"/>
+          <w:rtl w:val="0"/>
+          <w:lang w:val="en-US"/>
+        </w:rPr>
+        <w:t> </w:t>
+      </w:r>
+      <w:r>
+        <w:rPr>
+          <w:rStyle w:val="无"/>
+          <w:rFonts w:ascii="Times New Roman" w:hAnsi="Times New Roman"/>
+          <w:rtl w:val="0"/>
+          <w:lang w:val="en-US"/>
+        </w:rPr>
+        <w:t>(Battaglia et al. 2018) would also need held-out users, domains, and time periods.</w:t>
       </w:r>
       <w:bookmarkEnd w:id="38"/>
     </w:p>
@@ -15629,23 +15760,19 @@
         <w:pStyle w:val="Bibliography"/>
         <w:rPr>
           <w:rStyle w:val="无"/>
-          <w:rFonts w:ascii="Times New Roman" w:cs="Times New Roman" w:hAnsi="Times New Roman" w:eastAsia="Times New Roman"/>
         </w:rPr>
       </w:pPr>
-      <w:bookmarkStart w:name="refmem0" w:id="43"/>
-      <w:r>
-        <w:rPr>
-          <w:rStyle w:val="无"/>
-          <w:rFonts w:ascii="Times New Roman" w:hAnsi="Times New Roman"/>
-          <w:rtl w:val="0"/>
-          <w:lang w:val="en-US"/>
-        </w:rPr>
-        <w:t xml:space="preserve">Chhikara, Prateek, Dev Khant, Sparsh Aryan, et al. 2025. </w:t>
-      </w:r>
-      <w:r>
-        <w:rPr>
-          <w:rStyle w:val="无"/>
-          <w:rFonts w:ascii="Times New Roman" w:hAnsi="Times New Roman" w:hint="default"/>
+      <w:r>
+        <w:rPr>
+          <w:rStyle w:val="无"/>
+          <w:rtl w:val="0"/>
+          <w:lang w:val="en-US"/>
+        </w:rPr>
+        <w:t xml:space="preserve">Anthropic. 2026. </w:t>
+      </w:r>
+      <w:r>
+        <w:rPr>
+          <w:rStyle w:val="无"/>
           <w:rtl w:val="0"/>
           <w:lang w:val="en-US"/>
         </w:rPr>
@@ -15654,16 +15781,14 @@
       <w:r>
         <w:rPr>
           <w:rStyle w:val="无"/>
-          <w:rFonts w:ascii="Times New Roman" w:hAnsi="Times New Roman"/>
-          <w:rtl w:val="0"/>
-          <w:lang w:val="en-US"/>
-        </w:rPr>
-        <w:t>Mem0: Building Production-Ready AI Agents with Scalable Long-Term Memory.</w:t>
-      </w:r>
-      <w:r>
-        <w:rPr>
-          <w:rStyle w:val="无"/>
-          <w:rFonts w:ascii="Times New Roman" w:hAnsi="Times New Roman" w:hint="default"/>
+          <w:rtl w:val="0"/>
+          <w:lang w:val="en-US"/>
+        </w:rPr>
+        <w:t>Harness Design for Long-Running Application Development.</w:t>
+      </w:r>
+      <w:r>
+        <w:rPr>
+          <w:rStyle w:val="无"/>
           <w:rtl w:val="0"/>
           <w:lang w:val="en-US"/>
         </w:rPr>
@@ -15672,18 +15797,131 @@
       <w:r>
         <w:rPr>
           <w:rStyle w:val="无"/>
-          <w:rFonts w:ascii="Times New Roman" w:hAnsi="Times New Roman"/>
+          <w:rtl w:val="0"/>
+          <w:lang w:val="en-US"/>
+        </w:rPr>
+        <w:t>Engineering blog, March 24, 2026. https://www.anthropic.com/engineering/harness-design-long-running-apps.</w:t>
+      </w:r>
+    </w:p>
+    <w:p>
+      <w:pPr>
+        <w:pStyle w:val="Bibliography"/>
+        <w:rPr>
+          <w:rStyle w:val="无"/>
+        </w:rPr>
+      </w:pPr>
+      <w:r>
+        <w:rPr>
+          <w:rStyle w:val="无"/>
+          <w:rtl w:val="0"/>
+          <w:lang w:val="en-US"/>
+        </w:rPr>
+        <w:t xml:space="preserve">Battaglia, Peter W., Jessica B. Hamrick, Victor Bapst, et al. 2018. </w:t>
+      </w:r>
+      <w:r>
+        <w:rPr>
+          <w:rStyle w:val="无"/>
+          <w:rtl w:val="0"/>
+          <w:lang w:val="en-US"/>
+        </w:rPr>
+        <w:t>“</w:t>
+      </w:r>
+      <w:r>
+        <w:rPr>
+          <w:rStyle w:val="无"/>
+          <w:rtl w:val="0"/>
+          <w:lang w:val="en-US"/>
+        </w:rPr>
+        <w:t>Relational Inductive Biases, Deep Learning, and Graph Networks.</w:t>
+      </w:r>
+      <w:r>
+        <w:rPr>
+          <w:rStyle w:val="无"/>
+          <w:rtl w:val="0"/>
+          <w:lang w:val="en-US"/>
+        </w:rPr>
+        <w:t xml:space="preserve">” </w:t>
+      </w:r>
+      <w:r>
+        <w:rPr>
+          <w:rStyle w:val="无"/>
           <w:i w:val="1"/>
           <w:iCs w:val="1"/>
           <w:rtl w:val="0"/>
           <w:lang w:val="en-US"/>
         </w:rPr>
+        <w:t>arXiv Preprint arXiv:1806.01261</w:t>
+      </w:r>
+      <w:r>
+        <w:rPr>
+          <w:rStyle w:val="无"/>
+          <w:rtl w:val="0"/>
+          <w:lang w:val="en-US"/>
+        </w:rPr>
+        <w:t>.</w:t>
+      </w:r>
+    </w:p>
+    <w:p>
+      <w:pPr>
+        <w:pStyle w:val="Bibliography"/>
+        <w:rPr>
+          <w:rStyle w:val="无"/>
+        </w:rPr>
+      </w:pPr>
+      <w:r>
+        <w:rPr>
+          <w:rStyle w:val="无"/>
+          <w:rtl w:val="0"/>
+          <w:lang w:val="en-US"/>
+        </w:rPr>
+        <w:t>Chhikara, Prateek</w:t>
+      </w:r>
+      <w:bookmarkStart w:name="refmem0" w:id="43"/>
+      <w:r>
+        <w:rPr>
+          <w:rStyle w:val="无"/>
+          <w:rtl w:val="0"/>
+          <w:lang w:val="en-US"/>
+        </w:rPr>
+        <w:t xml:space="preserve">, Dev Khant, Sparsh Aryan, et al. 2025. </w:t>
+      </w:r>
+      <w:r>
+        <w:rPr>
+          <w:rStyle w:val="无"/>
+          <w:rtl w:val="0"/>
+          <w:lang w:val="en-US"/>
+        </w:rPr>
+        <w:t>“</w:t>
+      </w:r>
+      <w:r>
+        <w:rPr>
+          <w:rStyle w:val="无"/>
+          <w:rtl w:val="0"/>
+          <w:lang w:val="en-US"/>
+        </w:rPr>
+        <w:t>Mem0: Building Production-Ready AI Agents with Scalable Long-Term Memory.</w:t>
+      </w:r>
+      <w:r>
+        <w:rPr>
+          <w:rStyle w:val="无"/>
+          <w:rtl w:val="0"/>
+          <w:lang w:val="en-US"/>
+        </w:rPr>
+        <w:t xml:space="preserve">” </w:t>
+      </w:r>
+      <w:r>
+        <w:rPr>
+          <w:rStyle w:val="无"/>
+          <w:i w:val="1"/>
+          <w:iCs w:val="1"/>
+          <w:rtl w:val="0"/>
+          <w:lang w:val="en-US"/>
+        </w:rPr>
         <w:t>arXiv Preprint arXiv:2504.19413</w:t>
       </w:r>
       <w:r>
         <w:rPr>
           <w:rStyle w:val="无"/>
-          <w:rFonts w:ascii="Times New Roman" w:hAnsi="Times New Roman"/>
           <w:rtl w:val="0"/>
           <w:lang w:val="en-US"/>
         </w:rPr>
@@ -15754,23 +15992,19 @@
         <w:pStyle w:val="Bibliography"/>
         <w:rPr>
           <w:rStyle w:val="无"/>
-          <w:rFonts w:ascii="Times New Roman" w:cs="Times New Roman" w:hAnsi="Times New Roman" w:eastAsia="Times New Roman"/>
         </w:rPr>
       </w:pPr>
-      <w:bookmarkStart w:name="refforcedirected" w:id="44"/>
-      <w:r>
-        <w:rPr>
-          <w:rStyle w:val="无"/>
-          <w:rFonts w:ascii="Times New Roman" w:hAnsi="Times New Roman"/>
-          <w:rtl w:val="0"/>
-          <w:lang w:val="en-US"/>
-        </w:rPr>
-        <w:t xml:space="preserve">Fruchterman, Thomas M. J., and Edward M. Reingold. 1991. </w:t>
-      </w:r>
-      <w:r>
-        <w:rPr>
-          <w:rStyle w:val="无"/>
-          <w:rFonts w:ascii="Times New Roman" w:hAnsi="Times New Roman" w:hint="default"/>
+      <w:r>
+        <w:rPr>
+          <w:rStyle w:val="无"/>
+          <w:rtl w:val="0"/>
+          <w:lang w:val="en-US"/>
+        </w:rPr>
+        <w:t xml:space="preserve">Edge, Darren, Ha Trinh, Newman Cheng, et al. 2024. </w:t>
+      </w:r>
+      <w:r>
+        <w:rPr>
+          <w:rStyle w:val="无"/>
           <w:rtl w:val="0"/>
           <w:lang w:val="en-US"/>
         </w:rPr>
@@ -15779,16 +16013,14 @@
       <w:r>
         <w:rPr>
           <w:rStyle w:val="无"/>
-          <w:rFonts w:ascii="Times New Roman" w:hAnsi="Times New Roman"/>
-          <w:rtl w:val="0"/>
-          <w:lang w:val="en-US"/>
-        </w:rPr>
-        <w:t>Graph Drawing by Force-Directed Placement.</w:t>
-      </w:r>
-      <w:r>
-        <w:rPr>
-          <w:rStyle w:val="无"/>
-          <w:rFonts w:ascii="Times New Roman" w:hAnsi="Times New Roman" w:hint="default"/>
+          <w:rtl w:val="0"/>
+          <w:lang w:val="en-US"/>
+        </w:rPr>
+        <w:t>From Local to Global: A Graph RAG Approach to Query-Focused Summarization.</w:t>
+      </w:r>
+      <w:r>
+        <w:rPr>
+          <w:rStyle w:val="无"/>
           <w:rtl w:val="0"/>
           <w:lang w:val="en-US"/>
         </w:rPr>
@@ -15797,18 +16029,83 @@
       <w:r>
         <w:rPr>
           <w:rStyle w:val="无"/>
-          <w:rFonts w:ascii="Times New Roman" w:hAnsi="Times New Roman"/>
           <w:i w:val="1"/>
           <w:iCs w:val="1"/>
           <w:rtl w:val="0"/>
           <w:lang w:val="en-US"/>
         </w:rPr>
+        <w:t>arXiv Preprint arXiv:2404.16130</w:t>
+      </w:r>
+      <w:r>
+        <w:rPr>
+          <w:rStyle w:val="无"/>
+          <w:rtl w:val="0"/>
+          <w:lang w:val="en-US"/>
+        </w:rPr>
+        <w:t>.</w:t>
+      </w:r>
+    </w:p>
+    <w:p>
+      <w:pPr>
+        <w:pStyle w:val="Bibliography"/>
+        <w:rPr>
+          <w:rStyle w:val="无"/>
+        </w:rPr>
+      </w:pPr>
+      <w:r>
+        <w:rPr>
+          <w:rStyle w:val="无"/>
+          <w:rtl w:val="0"/>
+          <w:lang w:val="en-US"/>
+        </w:rPr>
+        <w:t>Fruchterman, Thomas</w:t>
+      </w:r>
+      <w:bookmarkStart w:name="refforcedirected" w:id="44"/>
+      <w:r>
+        <w:rPr>
+          <w:rStyle w:val="无"/>
+          <w:rtl w:val="0"/>
+          <w:lang w:val="en-US"/>
+        </w:rPr>
+        <w:t xml:space="preserve"> M. J., and Edward M. Reingold. 1991. </w:t>
+      </w:r>
+      <w:r>
+        <w:rPr>
+          <w:rStyle w:val="无"/>
+          <w:rtl w:val="0"/>
+          <w:lang w:val="en-US"/>
+        </w:rPr>
+        <w:t>“</w:t>
+      </w:r>
+      <w:r>
+        <w:rPr>
+          <w:rStyle w:val="无"/>
+          <w:rtl w:val="0"/>
+          <w:lang w:val="en-US"/>
+        </w:rPr>
+        <w:t>Graph Drawing by Force-Directed Placement.</w:t>
+      </w:r>
+      <w:r>
+        <w:rPr>
+          <w:rStyle w:val="无"/>
+          <w:rtl w:val="0"/>
+          <w:lang w:val="en-US"/>
+        </w:rPr>
+        <w:t xml:space="preserve">” </w:t>
+      </w:r>
+      <w:r>
+        <w:rPr>
+          <w:rStyle w:val="无"/>
+          <w:i w:val="1"/>
+          <w:iCs w:val="1"/>
+          <w:rtl w:val="0"/>
+          <w:lang w:val="en-US"/>
+        </w:rPr>
         <w:t>Software: Practice and Experience</w:t>
       </w:r>
       <w:r>
         <w:rPr>
           <w:rStyle w:val="无"/>
-          <w:rFonts w:ascii="Times New Roman" w:hAnsi="Times New Roman"/>
           <w:rtl w:val="0"/>
           <w:lang w:val="en-US"/>
         </w:rPr>
@@ -15817,7 +16114,6 @@
       <w:r>
         <w:rPr>
           <w:rStyle w:val="无"/>
-          <w:rFonts w:ascii="Times New Roman" w:hAnsi="Times New Roman" w:hint="default"/>
           <w:rtl w:val="0"/>
           <w:lang w:val="en-US"/>
         </w:rPr>
@@ -15826,7 +16122,6 @@
       <w:r>
         <w:rPr>
           <w:rStyle w:val="无"/>
-          <w:rFonts w:ascii="Times New Roman" w:hAnsi="Times New Roman"/>
           <w:rtl w:val="0"/>
           <w:lang w:val="en-US"/>
         </w:rPr>
@@ -15980,7 +16275,7 @@
           <w:rtl w:val="0"/>
           <w:lang w:val="en-US"/>
         </w:rPr>
-        <w:t xml:space="preserve">LangChain. 2026. </w:t>
+        <w:t xml:space="preserve">Hu, Yuyang, Shichun Liu, Yanwei Yue, et al. 2025. </w:t>
       </w:r>
       <w:r>
         <w:rPr>
@@ -15989,6 +16284,122 @@
           <w:lang w:val="en-US"/>
         </w:rPr>
         <w:t>“</w:t>
+      </w:r>
+      <w:r>
+        <w:rPr>
+          <w:rStyle w:val="无"/>
+          <w:rtl w:val="0"/>
+          <w:lang w:val="en-US"/>
+        </w:rPr>
+        <w:t>Memory in the Age of AI Agents.</w:t>
+      </w:r>
+      <w:r>
+        <w:rPr>
+          <w:rStyle w:val="无"/>
+          <w:rtl w:val="0"/>
+          <w:lang w:val="en-US"/>
+        </w:rPr>
+        <w:t xml:space="preserve">” </w:t>
+      </w:r>
+      <w:r>
+        <w:rPr>
+          <w:rStyle w:val="无"/>
+          <w:i w:val="1"/>
+          <w:iCs w:val="1"/>
+          <w:rtl w:val="0"/>
+          <w:lang w:val="en-US"/>
+        </w:rPr>
+        <w:t>arXiv Preprint arXiv:2512.13564</w:t>
+      </w:r>
+      <w:r>
+        <w:rPr>
+          <w:rStyle w:val="无"/>
+          <w:rtl w:val="0"/>
+          <w:lang w:val="en-US"/>
+        </w:rPr>
+        <w:t>.</w:t>
+      </w:r>
+    </w:p>
+    <w:p>
+      <w:pPr>
+        <w:pStyle w:val="Bibliography"/>
+        <w:rPr>
+          <w:rStyle w:val="无"/>
+        </w:rPr>
+      </w:pPr>
+      <w:r>
+        <w:rPr>
+          <w:rStyle w:val="无"/>
+          <w:rtl w:val="0"/>
+          <w:lang w:val="en-US"/>
+        </w:rPr>
+        <w:t xml:space="preserve">Ji, Shuo, Yibo Li, and Bryan Hooi. 2026. </w:t>
+      </w:r>
+      <w:r>
+        <w:rPr>
+          <w:rStyle w:val="无"/>
+          <w:rtl w:val="0"/>
+          <w:lang w:val="en-US"/>
+        </w:rPr>
+        <w:t>“</w:t>
+      </w:r>
+      <w:r>
+        <w:rPr>
+          <w:rStyle w:val="无"/>
+          <w:rtl w:val="0"/>
+          <w:lang w:val="en-US"/>
+        </w:rPr>
+        <w:t>Memory Is Reconstructed, Not Retrieved: Graph Memory for LLM Agents.</w:t>
+      </w:r>
+      <w:r>
+        <w:rPr>
+          <w:rStyle w:val="无"/>
+          <w:rtl w:val="0"/>
+          <w:lang w:val="en-US"/>
+        </w:rPr>
+        <w:t xml:space="preserve">” </w:t>
+      </w:r>
+      <w:r>
+        <w:rPr>
+          <w:rStyle w:val="无"/>
+          <w:i w:val="1"/>
+          <w:iCs w:val="1"/>
+          <w:rtl w:val="0"/>
+          <w:lang w:val="en-US"/>
+        </w:rPr>
+        <w:t>arXiv Preprint arXiv:2606.06036</w:t>
+      </w:r>
+      <w:r>
+        <w:rPr>
+          <w:rStyle w:val="无"/>
+          <w:rtl w:val="0"/>
+          <w:lang w:val="en-US"/>
+        </w:rPr>
+        <w:t>. ICML 2026.</w:t>
+      </w:r>
+    </w:p>
+    <w:p>
+      <w:pPr>
+        <w:pStyle w:val="Bibliography"/>
+        <w:rPr>
+          <w:rStyle w:val="无"/>
+        </w:rPr>
+      </w:pPr>
+      <w:r>
+        <w:rPr>
+          <w:rStyle w:val="无"/>
+          <w:rtl w:val="0"/>
+          <w:lang w:val="en-US"/>
+        </w:rPr>
+        <w:t>LangChain. 2026.</w:t>
+      </w:r>
+      <w:r>
+        <w:rPr>
+          <w:rStyle w:val="无"/>
+          <w:rtl w:val="0"/>
+          <w:lang w:val="en-US"/>
+        </w:rPr>
+        <w:t xml:space="preserve"> “</w:t>
       </w:r>
       <w:r>
         <w:rPr>
@@ -16797,6 +17208,71 @@
           <w:rtl w:val="0"/>
           <w:lang w:val="en-US"/>
         </w:rPr>
+        <w:t xml:space="preserve">Wu, Di, Zixiang Ji, Asmi Kawatkar, et al. 2026. </w:t>
+      </w:r>
+      <w:r>
+        <w:rPr>
+          <w:rStyle w:val="无"/>
+          <w:rFonts w:ascii="Times New Roman" w:hAnsi="Times New Roman" w:hint="default"/>
+          <w:rtl w:val="0"/>
+          <w:lang w:val="en-US"/>
+        </w:rPr>
+        <w:t>“</w:t>
+      </w:r>
+      <w:r>
+        <w:rPr>
+          <w:rStyle w:val="无"/>
+          <w:rFonts w:ascii="Times New Roman" w:hAnsi="Times New Roman"/>
+          <w:rtl w:val="0"/>
+          <w:lang w:val="en-US"/>
+        </w:rPr>
+        <w:t>LongMemEval-V2: Evaluating Long-Term Agent Memory Toward Experienced Colleagues.</w:t>
+      </w:r>
+      <w:r>
+        <w:rPr>
+          <w:rStyle w:val="无"/>
+          <w:rFonts w:ascii="Times New Roman" w:hAnsi="Times New Roman" w:hint="default"/>
+          <w:rtl w:val="0"/>
+          <w:lang w:val="en-US"/>
+        </w:rPr>
+        <w:t xml:space="preserve">” </w:t>
+      </w:r>
+      <w:r>
+        <w:rPr>
+          <w:rStyle w:val="无"/>
+          <w:rFonts w:ascii="Times New Roman" w:hAnsi="Times New Roman"/>
+          <w:i w:val="1"/>
+          <w:iCs w:val="1"/>
+          <w:rtl w:val="0"/>
+          <w:lang w:val="en-US"/>
+        </w:rPr>
+        <w:t>arXiv Preprint arXiv:2605.12493</w:t>
+      </w:r>
+      <w:r>
+        <w:rPr>
+          <w:rStyle w:val="无"/>
+          <w:rFonts w:ascii="Times New Roman" w:hAnsi="Times New Roman"/>
+          <w:rtl w:val="0"/>
+          <w:lang w:val="en-US"/>
+        </w:rPr>
+        <w:t>. Work in progress.</w:t>
+      </w:r>
+    </w:p>
+    <w:p>
+      <w:pPr>
+        <w:pStyle w:val="Bibliography"/>
+        <w:rPr>
+          <w:rStyle w:val="无"/>
+          <w:rFonts w:ascii="Times New Roman" w:cs="Times New Roman" w:hAnsi="Times New Roman" w:eastAsia="Times New Roman"/>
+        </w:rPr>
+      </w:pPr>
+      <w:r>
+        <w:rPr>
+          <w:rStyle w:val="无"/>
+          <w:rFonts w:ascii="Times New Roman" w:hAnsi="Times New Roman"/>
+          <w:rtl w:val="0"/>
+          <w:lang w:val="en-US"/>
+        </w:rPr>
         <w:t xml:space="preserve">Xu, Wujiang, Zujie Liang, Kai Mei, Hang Gao, Juntao Tan, and Yongfeng Zhang. 2025. </w:t>
       </w:r>
       <w:r>
@@ -16854,15 +17330,90 @@
         <w:pStyle w:val="Bibliography"/>
         <w:rPr>
           <w:rStyle w:val="无"/>
+          <w:rFonts w:ascii="Times New Roman" w:cs="Times New Roman" w:hAnsi="Times New Roman" w:eastAsia="Times New Roman"/>
         </w:rPr>
       </w:pPr>
       <w:r>
         <w:rPr>
           <w:rStyle w:val="无"/>
-          <w:rtl w:val="0"/>
-          <w:lang w:val="en-US"/>
-        </w:rPr>
-        <w:t xml:space="preserve">Yu, Yi, Liuyi Yao, Yuexiang Xie, et al. 2026. </w:t>
+          <w:rFonts w:ascii="Times New Roman" w:hAnsi="Times New Roman"/>
+          <w:rtl w:val="0"/>
+          <w:lang w:val="en-US"/>
+        </w:rPr>
+        <w:t xml:space="preserve">Yang, Chang, Chuang Zhou, Yilin Xiao, et al. 2026. </w:t>
+      </w:r>
+      <w:r>
+        <w:rPr>
+          <w:rStyle w:val="无"/>
+          <w:rFonts w:ascii="Times New Roman" w:hAnsi="Times New Roman" w:hint="default"/>
+          <w:rtl w:val="0"/>
+          <w:lang w:val="en-US"/>
+        </w:rPr>
+        <w:t>“</w:t>
+      </w:r>
+      <w:r>
+        <w:rPr>
+          <w:rStyle w:val="无"/>
+          <w:rFonts w:ascii="Times New Roman" w:hAnsi="Times New Roman"/>
+          <w:rtl w:val="0"/>
+          <w:lang w:val="en-US"/>
+        </w:rPr>
+        <w:t>Graph-Based Agent Memory: Taxonomy, Techniques, and Applications.</w:t>
+      </w:r>
+      <w:r>
+        <w:rPr>
+          <w:rStyle w:val="无"/>
+          <w:rFonts w:ascii="Times New Roman" w:hAnsi="Times New Roman" w:hint="default"/>
+          <w:rtl w:val="0"/>
+          <w:lang w:val="en-US"/>
+        </w:rPr>
+        <w:t xml:space="preserve">” </w:t>
+      </w:r>
+      <w:r>
+        <w:rPr>
+          <w:rStyle w:val="无"/>
+          <w:rFonts w:ascii="Times New Roman" w:hAnsi="Times New Roman"/>
+          <w:i w:val="1"/>
+          <w:iCs w:val="1"/>
+          <w:rtl w:val="0"/>
+          <w:lang w:val="en-US"/>
+        </w:rPr>
+        <w:t>arXiv Preprint arXiv:2602.05665</w:t>
+      </w:r>
+      <w:r>
+        <w:rPr>
+          <w:rStyle w:val="无"/>
+          <w:rFonts w:ascii="Times New Roman" w:hAnsi="Times New Roman"/>
+          <w:rtl w:val="0"/>
+          <w:lang w:val="en-US"/>
+        </w:rPr>
+        <w:t>.</w:t>
+      </w:r>
+    </w:p>
+    <w:p>
+      <w:pPr>
+        <w:pStyle w:val="Bibliography"/>
+        <w:rPr>
+          <w:rStyle w:val="无"/>
+          <w:rFonts w:ascii="Times New Roman" w:cs="Times New Roman" w:hAnsi="Times New Roman" w:eastAsia="Times New Roman"/>
+        </w:rPr>
+      </w:pPr>
+      <w:r>
+        <w:rPr>
+          <w:rStyle w:val="无"/>
+          <w:rFonts w:ascii="Times New Roman" w:hAnsi="Times New Roman"/>
+          <w:rtl w:val="0"/>
+          <w:lang w:val="en-US"/>
+        </w:rPr>
+        <w:t>Yu, Yi, Liuyi</w:t>
+      </w:r>
+      <w:r>
+        <w:rPr>
+          <w:rStyle w:val="无"/>
+          <w:rtl w:val="0"/>
+          <w:lang w:val="en-US"/>
+        </w:rPr>
+        <w:t xml:space="preserve"> Yao, Yuexiang Xie, et al. 2026. </w:t>
       </w:r>
       <w:r>
         <w:rPr>

</xml_diff>